<commit_message>
Update KCG proposal & agreement; add PDF version
Co-Authored-By: Claude Opus 5.5 <noreply@anthropic.com>
</commit_message>
<xml_diff>
--- a/docs/Datix-AI-KCG-Website-Proposal-Agreement.docx
+++ b/docs/Datix-AI-KCG-Website-Proposal-Agreement.docx
@@ -1,10 +1,10 @@
 
 <file path=word/document.xml><?xml version="1.0" encoding="utf-8"?>
-<w:document xmlns:wpc="http://schemas.microsoft.com/office/word/2010/wordprocessingCanvas" xmlns:cx="http://schemas.microsoft.com/office/drawing/2014/chartex" xmlns:cx1="http://schemas.microsoft.com/office/drawing/2015/9/8/chartex" xmlns:cx2="http://schemas.microsoft.com/office/drawing/2015/10/21/chartex" xmlns:cx3="http://schemas.microsoft.com/office/drawing/2016/5/9/chartex" xmlns:cx4="http://schemas.microsoft.com/office/drawing/2016/5/10/chartex" xmlns:cx5="http://schemas.microsoft.com/office/drawing/2016/5/11/chartex" xmlns:cx6="http://schemas.microsoft.com/office/drawing/2016/5/12/chartex" xmlns:cx7="http://schemas.microsoft.com/office/drawing/2016/5/13/chartex" xmlns:cx8="http://schemas.microsoft.com/office/drawing/2016/5/14/chartex" xmlns:mc="http://schemas.openxmlformats.org/markup-compatibility/2006" xmlns:aink="http://schemas.microsoft.com/office/drawing/2016/ink" xmlns:am3d="http://schemas.microsoft.com/office/drawing/2017/model3d" xmlns:o="urn:schemas-microsoft-com:office:office" xmlns:oel="http://schemas.microsoft.com/office/2019/extlst" xmlns:r="http://schemas.openxmlformats.org/officeDocument/2006/relationships" xmlns:m="http://schemas.openxmlformats.org/officeDocument/2006/math" xmlns:v="urn:schemas-microsoft-com:vml" xmlns:wp14="http://schemas.microsoft.com/office/word/2010/wordprocessingDrawing" xmlns:wp="http://schemas.openxmlformats.org/drawingml/2006/wordprocessingDrawing" xmlns:w10="urn:schemas-microsoft-com:office:word" xmlns:w="http://schemas.openxmlformats.org/wordprocessingml/2006/main" xmlns:w14="http://schemas.microsoft.com/office/word/2010/wordml" xmlns:w15="http://schemas.microsoft.com/office/word/2012/wordml" xmlns:w16cei="http://schemas.microsoft.com/office/word/2026/wordml/cei" xmlns:w16cex="http://schemas.microsoft.com/office/word/2018/wordml/cex" xmlns:w16cid="http://schemas.microsoft.com/office/word/2016/wordml/cid" xmlns:w16="http://schemas.microsoft.com/office/word/2018/wordml" xmlns:w16du="http://schemas.microsoft.com/office/word/2023/wordml/word16du" xmlns:w16sdtdh="http://schemas.microsoft.com/office/word/2020/wordml/sdtdatahash" xmlns:w16sdtfl="http://schemas.microsoft.com/office/word/2024/wordml/sdtformatlock" xmlns:w16se="http://schemas.microsoft.com/office/word/2015/wordml/symex" xmlns:wpg="http://schemas.microsoft.com/office/word/2010/wordprocessingGroup" xmlns:wpi="http://schemas.microsoft.com/office/word/2010/wordprocessingInk" xmlns:wne="http://schemas.microsoft.com/office/word/2006/wordml" xmlns:wps="http://schemas.microsoft.com/office/word/2010/wordprocessingShape" mc:Ignorable="w14 w15 w16se w16cid w16 w16cex w16sdtdh w16sdtfl w16du wp14">
+<w:document xmlns:wpc="http://schemas.microsoft.com/office/word/2010/wordprocessingCanvas" xmlns:cx="http://schemas.microsoft.com/office/drawing/2014/chartex" xmlns:cx1="http://schemas.microsoft.com/office/drawing/2015/9/8/chartex" xmlns:cx2="http://schemas.microsoft.com/office/drawing/2015/10/21/chartex" xmlns:cx3="http://schemas.microsoft.com/office/drawing/2016/5/9/chartex" xmlns:cx4="http://schemas.microsoft.com/office/drawing/2016/5/10/chartex" xmlns:cx5="http://schemas.microsoft.com/office/drawing/2016/5/11/chartex" xmlns:cx6="http://schemas.microsoft.com/office/drawing/2016/5/12/chartex" xmlns:cx7="http://schemas.microsoft.com/office/drawing/2016/5/13/chartex" xmlns:cx8="http://schemas.microsoft.com/office/drawing/2016/5/14/chartex" xmlns:mc="http://schemas.openxmlformats.org/markup-compatibility/2006" xmlns:aink="http://schemas.microsoft.com/office/drawing/2016/ink" xmlns:am3d="http://schemas.microsoft.com/office/drawing/2017/model3d" xmlns:o="urn:schemas-microsoft-com:office:office" xmlns:oel="http://schemas.microsoft.com/office/2019/extlst" xmlns:r="http://schemas.openxmlformats.org/officeDocument/2006/relationships" xmlns:m="http://schemas.openxmlformats.org/officeDocument/2006/math" xmlns:v="urn:schemas-microsoft-com:vml" xmlns:wp14="http://schemas.microsoft.com/office/word/2010/wordprocessingDrawing" xmlns:wp="http://schemas.openxmlformats.org/drawingml/2006/wordprocessingDrawing" xmlns:w10="urn:schemas-microsoft-com:office:word" xmlns:w="http://schemas.openxmlformats.org/wordprocessingml/2006/main" xmlns:w14="http://schemas.microsoft.com/office/word/2010/wordml" xmlns:w15="http://schemas.microsoft.com/office/word/2012/wordml" xmlns:w16cex="http://schemas.microsoft.com/office/word/2018/wordml/cex" xmlns:w16cid="http://schemas.microsoft.com/office/word/2016/wordml/cid" xmlns:w16="http://schemas.microsoft.com/office/word/2018/wordml" xmlns:w16du="http://schemas.microsoft.com/office/word/2023/wordml/word16du" xmlns:w16sdtdh="http://schemas.microsoft.com/office/word/2020/wordml/sdtdatahash" xmlns:w16sdtfl="http://schemas.microsoft.com/office/word/2024/wordml/sdtformatlock" xmlns:w16se="http://schemas.microsoft.com/office/word/2015/wordml/symex" xmlns:wpg="http://schemas.microsoft.com/office/word/2010/wordprocessingGroup" xmlns:wpi="http://schemas.microsoft.com/office/word/2010/wordprocessingInk" xmlns:wne="http://schemas.microsoft.com/office/word/2006/wordml" xmlns:wps="http://schemas.microsoft.com/office/word/2010/wordprocessingShape" mc:Ignorable="w14 w15 w16se w16cid w16 w16cex w16sdtdh w16sdtfl w16du wp14">
   <w:body>
     <w:p>
       <w:pPr>
-        <w:spacing w:before="0" w:after="40" w:line="259" w:lineRule="auto"/>
+        <w:spacing w:after="40" w:line="259" w:lineRule="auto"/>
       </w:pPr>
       <w:r>
         <w:rPr>
@@ -14,12 +14,12 @@
           <w:sz w:val="32"/>
           <w:szCs w:val="32"/>
         </w:rPr>
-        <w:t xml:space="preserve">WEBSITE DEVELOPMENT PROPOSAL &amp; SERVICE AGREEMENT</w:t>
+        <w:t>WEBSITE DEVELOPMENT PROPOSAL &amp; SERVICE AGREEMENT</w:t>
       </w:r>
     </w:p>
     <w:p>
       <w:pPr>
-        <w:spacing w:before="0" w:after="140" w:line="259" w:lineRule="auto"/>
+        <w:spacing w:after="140" w:line="259" w:lineRule="auto"/>
       </w:pPr>
       <w:r>
         <w:rPr>
@@ -29,8 +29,20 @@
           <w:sz w:val="21"/>
           <w:szCs w:val="21"/>
         </w:rPr>
-        <w:t xml:space="preserve">Kashmir Construction Group (KCG)  —  kashmirconstructiongroup.com</w:t>
-      </w:r>
+        <w:t>Kashmir Construction Group (</w:t>
+      </w:r>
+      <w:proofErr w:type="gramStart"/>
+      <w:r>
+        <w:rPr>
+          <w:rFonts w:ascii="Arial" w:hAnsi="Arial" w:cs="Arial"/>
+          <w:b/>
+          <w:color w:val="1D3BFF"/>
+          <w:sz w:val="21"/>
+          <w:szCs w:val="21"/>
+        </w:rPr>
+        <w:t>KCG)  kashmirconstructiongroup.com</w:t>
+      </w:r>
+      <w:proofErr w:type="gramEnd"/>
     </w:p>
     <w:tbl>
       <w:tblPr>
@@ -45,6 +57,7 @@
           <w:insideV w:val="single" w:sz="4" w:space="0" w:color="D1D5DB"/>
         </w:tblBorders>
         <w:tblLayout w:type="fixed"/>
+        <w:tblLook w:val="04A0" w:firstRow="1" w:lastRow="0" w:firstColumn="1" w:lastColumn="0" w:noHBand="0" w:noVBand="1"/>
       </w:tblPr>
       <w:tblGrid>
         <w:gridCol w:w="2200"/>
@@ -55,164 +68,183 @@
       <w:tr>
         <w:trPr>
           <w:cantSplit/>
+          <w:jc w:val="center"/>
         </w:trPr>
         <w:tc>
           <w:tcPr>
             <w:tcW w:w="2200" w:type="dxa"/>
-            <w:vAlign w:val="center"/>
-            <w:tcMar>
-              <w:top w:w="45" w:type="dxa"/>
-              <w:bottom w:w="45" w:type="dxa"/>
-              <w:left w:w="110" w:type="dxa"/>
-              <w:right w:w="110" w:type="dxa"/>
-            </w:tcMar>
-          </w:tcPr>
-          <w:p>
-            <w:pPr>
-              <w:spacing w:before="0" w:after="0" w:line="252" w:lineRule="auto"/>
-            </w:pPr>
-            <w:r>
-              <w:rPr>
-                <w:rFonts w:ascii="Arial" w:hAnsi="Arial" w:cs="Arial"/>
-                <w:color w:val="4B5563"/>
-                <w:sz w:val="17"/>
-                <w:szCs w:val="17"/>
-              </w:rPr>
-              <w:t xml:space="preserve">Prepared for</w:t>
+            <w:tcMar>
+              <w:top w:w="45" w:type="dxa"/>
+              <w:left w:w="110" w:type="dxa"/>
+              <w:bottom w:w="45" w:type="dxa"/>
+              <w:right w:w="110" w:type="dxa"/>
+            </w:tcMar>
+            <w:vAlign w:val="center"/>
+          </w:tcPr>
+          <w:p>
+            <w:pPr>
+              <w:spacing w:line="252" w:lineRule="auto"/>
+            </w:pPr>
+            <w:r>
+              <w:rPr>
+                <w:rFonts w:ascii="Arial" w:hAnsi="Arial" w:cs="Arial"/>
+                <w:color w:val="4B5563"/>
+                <w:sz w:val="17"/>
+                <w:szCs w:val="17"/>
+              </w:rPr>
+              <w:t>Prepared for</w:t>
             </w:r>
           </w:p>
         </w:tc>
         <w:tc>
           <w:tcPr>
             <w:tcW w:w="2840" w:type="dxa"/>
-            <w:vAlign w:val="center"/>
-            <w:tcMar>
-              <w:top w:w="45" w:type="dxa"/>
-              <w:bottom w:w="45" w:type="dxa"/>
-              <w:left w:w="110" w:type="dxa"/>
-              <w:right w:w="110" w:type="dxa"/>
-            </w:tcMar>
-          </w:tcPr>
-          <w:p>
-            <w:pPr>
-              <w:spacing w:before="0" w:after="0" w:line="252" w:lineRule="auto"/>
-            </w:pPr>
-            <w:r>
-              <w:rPr>
-                <w:rFonts w:ascii="Arial" w:hAnsi="Arial" w:cs="Arial"/>
-                <w:color w:val="4B5563"/>
-                <w:sz w:val="17"/>
-                <w:szCs w:val="17"/>
-              </w:rPr>
-              <w:t xml:space="preserve">Akeeb Yakoob, Proprietor</w:t>
-            </w:r>
-          </w:p>
-          <w:p>
-            <w:pPr>
-              <w:spacing w:before="0" w:after="0" w:line="252" w:lineRule="auto"/>
-            </w:pPr>
-            <w:r>
-              <w:rPr>
-                <w:rFonts w:ascii="Arial" w:hAnsi="Arial" w:cs="Arial"/>
-                <w:color w:val="4B5563"/>
-                <w:sz w:val="17"/>
-                <w:szCs w:val="17"/>
-              </w:rPr>
-              <w:t xml:space="preserve">Kashmir Construction Group</w:t>
-            </w:r>
-          </w:p>
-          <w:p>
-            <w:pPr>
-              <w:spacing w:before="0" w:after="0" w:line="252" w:lineRule="auto"/>
-            </w:pPr>
-            <w:r>
-              <w:rPr>
-                <w:rFonts w:ascii="Arial" w:hAnsi="Arial" w:cs="Arial"/>
-                <w:color w:val="4B5563"/>
-                <w:sz w:val="17"/>
-                <w:szCs w:val="17"/>
-              </w:rPr>
-              <w:t xml:space="preserve">Dadyal, Azad Jammu &amp; Kashmir</w:t>
+            <w:tcMar>
+              <w:top w:w="45" w:type="dxa"/>
+              <w:left w:w="110" w:type="dxa"/>
+              <w:bottom w:w="45" w:type="dxa"/>
+              <w:right w:w="110" w:type="dxa"/>
+            </w:tcMar>
+            <w:vAlign w:val="center"/>
+          </w:tcPr>
+          <w:p>
+            <w:pPr>
+              <w:spacing w:line="252" w:lineRule="auto"/>
+            </w:pPr>
+            <w:r>
+              <w:rPr>
+                <w:rFonts w:ascii="Arial" w:hAnsi="Arial" w:cs="Arial"/>
+                <w:color w:val="4B5563"/>
+                <w:sz w:val="17"/>
+                <w:szCs w:val="17"/>
+              </w:rPr>
+              <w:t>Akeeb Yakoob, Proprietor</w:t>
+            </w:r>
+          </w:p>
+          <w:p>
+            <w:pPr>
+              <w:spacing w:line="252" w:lineRule="auto"/>
+            </w:pPr>
+            <w:r>
+              <w:rPr>
+                <w:rFonts w:ascii="Arial" w:hAnsi="Arial" w:cs="Arial"/>
+                <w:color w:val="4B5563"/>
+                <w:sz w:val="17"/>
+                <w:szCs w:val="17"/>
+              </w:rPr>
+              <w:t>Kashmir Construction Group</w:t>
+            </w:r>
+          </w:p>
+          <w:p>
+            <w:pPr>
+              <w:spacing w:line="252" w:lineRule="auto"/>
+            </w:pPr>
+            <w:r>
+              <w:rPr>
+                <w:rFonts w:ascii="Arial" w:hAnsi="Arial" w:cs="Arial"/>
+                <w:color w:val="4B5563"/>
+                <w:sz w:val="17"/>
+                <w:szCs w:val="17"/>
+              </w:rPr>
+              <w:t>Dadyal, Azad Jammu &amp; Kashmir</w:t>
             </w:r>
           </w:p>
         </w:tc>
         <w:tc>
           <w:tcPr>
             <w:tcW w:w="2200" w:type="dxa"/>
-            <w:vAlign w:val="center"/>
-            <w:tcMar>
-              <w:top w:w="45" w:type="dxa"/>
-              <w:bottom w:w="45" w:type="dxa"/>
-              <w:left w:w="110" w:type="dxa"/>
-              <w:right w:w="110" w:type="dxa"/>
-            </w:tcMar>
-          </w:tcPr>
-          <w:p>
-            <w:pPr>
-              <w:spacing w:before="0" w:after="0" w:line="252" w:lineRule="auto"/>
-            </w:pPr>
-            <w:r>
-              <w:rPr>
-                <w:rFonts w:ascii="Arial" w:hAnsi="Arial" w:cs="Arial"/>
-                <w:color w:val="4B5563"/>
-                <w:sz w:val="17"/>
-                <w:szCs w:val="17"/>
-              </w:rPr>
-              <w:t xml:space="preserve">Prepared by</w:t>
+            <w:tcMar>
+              <w:top w:w="45" w:type="dxa"/>
+              <w:left w:w="110" w:type="dxa"/>
+              <w:bottom w:w="45" w:type="dxa"/>
+              <w:right w:w="110" w:type="dxa"/>
+            </w:tcMar>
+            <w:vAlign w:val="center"/>
+          </w:tcPr>
+          <w:p>
+            <w:pPr>
+              <w:spacing w:line="252" w:lineRule="auto"/>
+            </w:pPr>
+            <w:r>
+              <w:rPr>
+                <w:rFonts w:ascii="Arial" w:hAnsi="Arial" w:cs="Arial"/>
+                <w:color w:val="4B5563"/>
+                <w:sz w:val="17"/>
+                <w:szCs w:val="17"/>
+              </w:rPr>
+              <w:t>Prepared by</w:t>
             </w:r>
           </w:p>
         </w:tc>
         <w:tc>
           <w:tcPr>
             <w:tcW w:w="2840" w:type="dxa"/>
-            <w:vAlign w:val="center"/>
-            <w:tcMar>
-              <w:top w:w="45" w:type="dxa"/>
-              <w:bottom w:w="45" w:type="dxa"/>
-              <w:left w:w="110" w:type="dxa"/>
-              <w:right w:w="110" w:type="dxa"/>
-            </w:tcMar>
-          </w:tcPr>
-          <w:p>
-            <w:pPr>
-              <w:spacing w:before="0" w:after="0" w:line="252" w:lineRule="auto"/>
-            </w:pPr>
-            <w:r>
-              <w:rPr>
-                <w:rFonts w:ascii="Arial" w:hAnsi="Arial" w:cs="Arial"/>
-                <w:color w:val="4B5563"/>
-                <w:sz w:val="17"/>
-                <w:szCs w:val="17"/>
-              </w:rPr>
-              <w:t xml:space="preserve">Datix AI</w:t>
-            </w:r>
-          </w:p>
-          <w:p>
-            <w:pPr>
-              <w:spacing w:before="0" w:after="0" w:line="252" w:lineRule="auto"/>
-            </w:pPr>
-            <w:r>
-              <w:rPr>
-                <w:rFonts w:ascii="Arial" w:hAnsi="Arial" w:cs="Arial"/>
-                <w:color w:val="4B5563"/>
-                <w:sz w:val="17"/>
-                <w:szCs w:val="17"/>
-              </w:rPr>
-              <w:t xml:space="preserve">6th Road, Rawalpindi, Pakistan</w:t>
-            </w:r>
-          </w:p>
-          <w:p>
-            <w:pPr>
-              <w:spacing w:before="0" w:after="0" w:line="252" w:lineRule="auto"/>
-            </w:pPr>
-            <w:r>
-              <w:rPr>
-                <w:rFonts w:ascii="Arial" w:hAnsi="Arial" w:cs="Arial"/>
-                <w:color w:val="4B5563"/>
-                <w:sz w:val="17"/>
-                <w:szCs w:val="17"/>
-              </w:rPr>
-              <w:t xml:space="preserve">contact@datixai.com</w:t>
+            <w:tcMar>
+              <w:top w:w="45" w:type="dxa"/>
+              <w:left w:w="110" w:type="dxa"/>
+              <w:bottom w:w="45" w:type="dxa"/>
+              <w:right w:w="110" w:type="dxa"/>
+            </w:tcMar>
+            <w:vAlign w:val="center"/>
+          </w:tcPr>
+          <w:p>
+            <w:pPr>
+              <w:spacing w:line="252" w:lineRule="auto"/>
+            </w:pPr>
+            <w:r>
+              <w:rPr>
+                <w:rFonts w:ascii="Arial" w:hAnsi="Arial" w:cs="Arial"/>
+                <w:color w:val="4B5563"/>
+                <w:sz w:val="17"/>
+                <w:szCs w:val="17"/>
+              </w:rPr>
+              <w:t>Datix AI</w:t>
+            </w:r>
+          </w:p>
+          <w:p>
+            <w:pPr>
+              <w:spacing w:line="252" w:lineRule="auto"/>
+            </w:pPr>
+            <w:r>
+              <w:rPr>
+                <w:rFonts w:ascii="Arial" w:hAnsi="Arial" w:cs="Arial"/>
+                <w:color w:val="4B5563"/>
+                <w:sz w:val="17"/>
+                <w:szCs w:val="17"/>
+              </w:rPr>
+              <w:t>Office #05, STP, University of Kotli</w:t>
+            </w:r>
+            <w:r>
+              <w:rPr>
+                <w:rFonts w:ascii="Arial" w:hAnsi="Arial" w:cs="Arial"/>
+                <w:color w:val="4B5563"/>
+                <w:sz w:val="17"/>
+                <w:szCs w:val="17"/>
+              </w:rPr>
+              <w:t xml:space="preserve">, </w:t>
+            </w:r>
+            <w:r>
+              <w:rPr>
+                <w:rFonts w:ascii="Arial" w:hAnsi="Arial" w:cs="Arial"/>
+                <w:color w:val="4B5563"/>
+                <w:sz w:val="17"/>
+                <w:szCs w:val="17"/>
+              </w:rPr>
+              <w:t>AJK</w:t>
+            </w:r>
+          </w:p>
+          <w:p>
+            <w:pPr>
+              <w:spacing w:line="252" w:lineRule="auto"/>
+            </w:pPr>
+            <w:r>
+              <w:rPr>
+                <w:rFonts w:ascii="Arial" w:hAnsi="Arial" w:cs="Arial"/>
+                <w:color w:val="4B5563"/>
+                <w:sz w:val="17"/>
+                <w:szCs w:val="17"/>
+              </w:rPr>
+              <w:t>contact@datixai.com</w:t>
             </w:r>
           </w:p>
         </w:tc>
@@ -220,108 +252,118 @@
       <w:tr>
         <w:trPr>
           <w:cantSplit/>
+          <w:jc w:val="center"/>
         </w:trPr>
         <w:tc>
           <w:tcPr>
             <w:tcW w:w="2200" w:type="dxa"/>
-            <w:vAlign w:val="center"/>
-            <w:tcMar>
-              <w:top w:w="45" w:type="dxa"/>
-              <w:bottom w:w="45" w:type="dxa"/>
-              <w:left w:w="110" w:type="dxa"/>
-              <w:right w:w="110" w:type="dxa"/>
-            </w:tcMar>
-          </w:tcPr>
-          <w:p>
-            <w:pPr>
-              <w:spacing w:before="0" w:after="0" w:line="252" w:lineRule="auto"/>
-            </w:pPr>
-            <w:r>
-              <w:rPr>
-                <w:rFonts w:ascii="Arial" w:hAnsi="Arial" w:cs="Arial"/>
-                <w:color w:val="4B5563"/>
-                <w:sz w:val="17"/>
-                <w:szCs w:val="17"/>
-              </w:rPr>
-              <w:t xml:space="preserve">Reference</w:t>
+            <w:tcMar>
+              <w:top w:w="45" w:type="dxa"/>
+              <w:left w:w="110" w:type="dxa"/>
+              <w:bottom w:w="45" w:type="dxa"/>
+              <w:right w:w="110" w:type="dxa"/>
+            </w:tcMar>
+            <w:vAlign w:val="center"/>
+          </w:tcPr>
+          <w:p>
+            <w:pPr>
+              <w:spacing w:line="252" w:lineRule="auto"/>
+            </w:pPr>
+            <w:r>
+              <w:rPr>
+                <w:rFonts w:ascii="Arial" w:hAnsi="Arial" w:cs="Arial"/>
+                <w:color w:val="4B5563"/>
+                <w:sz w:val="17"/>
+                <w:szCs w:val="17"/>
+              </w:rPr>
+              <w:t>Reference</w:t>
             </w:r>
           </w:p>
         </w:tc>
         <w:tc>
           <w:tcPr>
             <w:tcW w:w="2840" w:type="dxa"/>
-            <w:vAlign w:val="center"/>
-            <w:tcMar>
-              <w:top w:w="45" w:type="dxa"/>
-              <w:bottom w:w="45" w:type="dxa"/>
-              <w:left w:w="110" w:type="dxa"/>
-              <w:right w:w="110" w:type="dxa"/>
-            </w:tcMar>
-          </w:tcPr>
-          <w:p>
-            <w:pPr>
-              <w:spacing w:before="0" w:after="0" w:line="252" w:lineRule="auto"/>
-            </w:pPr>
-            <w:r>
-              <w:rPr>
-                <w:rFonts w:ascii="Arial" w:hAnsi="Arial" w:cs="Arial"/>
-                <w:color w:val="4B5563"/>
-                <w:sz w:val="17"/>
-                <w:szCs w:val="17"/>
-              </w:rPr>
-              <w:t xml:space="preserve">DAI-KCG-2026-01</w:t>
+            <w:tcMar>
+              <w:top w:w="45" w:type="dxa"/>
+              <w:left w:w="110" w:type="dxa"/>
+              <w:bottom w:w="45" w:type="dxa"/>
+              <w:right w:w="110" w:type="dxa"/>
+            </w:tcMar>
+            <w:vAlign w:val="center"/>
+          </w:tcPr>
+          <w:p>
+            <w:pPr>
+              <w:spacing w:line="252" w:lineRule="auto"/>
+            </w:pPr>
+            <w:r>
+              <w:rPr>
+                <w:rFonts w:ascii="Arial" w:hAnsi="Arial" w:cs="Arial"/>
+                <w:color w:val="4B5563"/>
+                <w:sz w:val="17"/>
+                <w:szCs w:val="17"/>
+              </w:rPr>
+              <w:t>DAI-KCG-2026-</w:t>
+            </w:r>
+            <w:r>
+              <w:rPr>
+                <w:rFonts w:ascii="Arial" w:hAnsi="Arial" w:cs="Arial"/>
+                <w:color w:val="4B5563"/>
+                <w:sz w:val="17"/>
+                <w:szCs w:val="17"/>
+              </w:rPr>
+              <w:t>0910</w:t>
             </w:r>
           </w:p>
         </w:tc>
         <w:tc>
           <w:tcPr>
             <w:tcW w:w="2200" w:type="dxa"/>
-            <w:vAlign w:val="center"/>
-            <w:tcMar>
-              <w:top w:w="45" w:type="dxa"/>
-              <w:bottom w:w="45" w:type="dxa"/>
-              <w:left w:w="110" w:type="dxa"/>
-              <w:right w:w="110" w:type="dxa"/>
-            </w:tcMar>
-          </w:tcPr>
-          <w:p>
-            <w:pPr>
-              <w:spacing w:before="0" w:after="0" w:line="252" w:lineRule="auto"/>
-            </w:pPr>
-            <w:r>
-              <w:rPr>
-                <w:rFonts w:ascii="Arial" w:hAnsi="Arial" w:cs="Arial"/>
-                <w:color w:val="4B5563"/>
-                <w:sz w:val="17"/>
-                <w:szCs w:val="17"/>
-              </w:rPr>
-              <w:t xml:space="preserve">Date</w:t>
+            <w:tcMar>
+              <w:top w:w="45" w:type="dxa"/>
+              <w:left w:w="110" w:type="dxa"/>
+              <w:bottom w:w="45" w:type="dxa"/>
+              <w:right w:w="110" w:type="dxa"/>
+            </w:tcMar>
+            <w:vAlign w:val="center"/>
+          </w:tcPr>
+          <w:p>
+            <w:pPr>
+              <w:spacing w:line="252" w:lineRule="auto"/>
+            </w:pPr>
+            <w:r>
+              <w:rPr>
+                <w:rFonts w:ascii="Arial" w:hAnsi="Arial" w:cs="Arial"/>
+                <w:color w:val="4B5563"/>
+                <w:sz w:val="17"/>
+                <w:szCs w:val="17"/>
+              </w:rPr>
+              <w:t>Date</w:t>
             </w:r>
           </w:p>
         </w:tc>
         <w:tc>
           <w:tcPr>
             <w:tcW w:w="2840" w:type="dxa"/>
-            <w:vAlign w:val="center"/>
-            <w:tcMar>
-              <w:top w:w="45" w:type="dxa"/>
-              <w:bottom w:w="45" w:type="dxa"/>
-              <w:left w:w="110" w:type="dxa"/>
-              <w:right w:w="110" w:type="dxa"/>
-            </w:tcMar>
-          </w:tcPr>
-          <w:p>
-            <w:pPr>
-              <w:spacing w:before="0" w:after="0" w:line="252" w:lineRule="auto"/>
-            </w:pPr>
-            <w:r>
-              <w:rPr>
-                <w:rFonts w:ascii="Arial" w:hAnsi="Arial" w:cs="Arial"/>
-                <w:color w:val="4B5563"/>
-                <w:sz w:val="17"/>
-                <w:szCs w:val="17"/>
-              </w:rPr>
-              <w:t xml:space="preserve">9 October 2026</w:t>
+            <w:tcMar>
+              <w:top w:w="45" w:type="dxa"/>
+              <w:left w:w="110" w:type="dxa"/>
+              <w:bottom w:w="45" w:type="dxa"/>
+              <w:right w:w="110" w:type="dxa"/>
+            </w:tcMar>
+            <w:vAlign w:val="center"/>
+          </w:tcPr>
+          <w:p>
+            <w:pPr>
+              <w:spacing w:line="252" w:lineRule="auto"/>
+            </w:pPr>
+            <w:r>
+              <w:rPr>
+                <w:rFonts w:ascii="Arial" w:hAnsi="Arial" w:cs="Arial"/>
+                <w:color w:val="4B5563"/>
+                <w:sz w:val="17"/>
+                <w:szCs w:val="17"/>
+              </w:rPr>
+              <w:t>9 October 2026</w:t>
             </w:r>
           </w:p>
         </w:tc>
@@ -329,7 +371,22 @@
     </w:tbl>
     <w:p>
       <w:pPr>
-        <w:spacing w:before="0" w:after="0" w:line="200" w:lineRule="auto"/>
+        <w:spacing w:line="200" w:lineRule="auto"/>
+      </w:pPr>
+    </w:p>
+    <w:p>
+      <w:pPr>
+        <w:spacing w:line="200" w:lineRule="auto"/>
+      </w:pPr>
+    </w:p>
+    <w:p>
+      <w:pPr>
+        <w:spacing w:line="200" w:lineRule="auto"/>
+      </w:pPr>
+    </w:p>
+    <w:p>
+      <w:pPr>
+        <w:spacing w:line="200" w:lineRule="auto"/>
       </w:pPr>
     </w:p>
     <w:p>
@@ -348,12 +405,18 @@
           <w:sz w:val="22"/>
           <w:szCs w:val="22"/>
         </w:rPr>
-        <w:t xml:space="preserve">1. ABOUT DATIX AI</w:t>
+        <w:t>1. ABOUT DATIX AI</w:t>
       </w:r>
     </w:p>
     <w:p>
       <w:pPr>
-        <w:spacing w:before="0" w:after="90" w:line="259" w:lineRule="auto"/>
+        <w:spacing w:after="90" w:line="259" w:lineRule="auto"/>
+        <w:rPr>
+          <w:rFonts w:ascii="Arial" w:hAnsi="Arial" w:cs="Arial"/>
+          <w:color w:val="4B5563"/>
+          <w:sz w:val="19"/>
+          <w:szCs w:val="19"/>
+        </w:rPr>
       </w:pPr>
       <w:r>
         <w:rPr>
@@ -363,7 +426,7 @@
           <w:sz w:val="19"/>
           <w:szCs w:val="19"/>
         </w:rPr>
-        <w:t xml:space="preserve">Datix AI</w:t>
+        <w:t>Datix AI</w:t>
       </w:r>
       <w:r>
         <w:rPr>
@@ -372,8 +435,93 @@
           <w:sz w:val="19"/>
           <w:szCs w:val="19"/>
         </w:rPr>
-        <w:t xml:space="preserve"> is a Pakistan-based technology company specialising in artificial intelligence, data science and modern web development. We build fast, secure, professionally designed websites and digital systems for businesses in Pakistan and the United Kingdom — combining strong visual design with the engineering quality expected of international products.</w:t>
-      </w:r>
+        <w:t xml:space="preserve"> is </w:t>
+      </w:r>
+      <w:proofErr w:type="gramStart"/>
+      <w:r>
+        <w:rPr>
+          <w:rFonts w:ascii="Arial" w:hAnsi="Arial" w:cs="Arial"/>
+          <w:color w:val="4B5563"/>
+          <w:sz w:val="19"/>
+          <w:szCs w:val="19"/>
+        </w:rPr>
+        <w:t>a</w:t>
+      </w:r>
+      <w:proofErr w:type="gramEnd"/>
+      <w:r>
+        <w:rPr>
+          <w:rFonts w:ascii="Arial" w:hAnsi="Arial" w:cs="Arial"/>
+          <w:color w:val="4B5563"/>
+          <w:sz w:val="19"/>
+          <w:szCs w:val="19"/>
+        </w:rPr>
+        <w:t xml:space="preserve"> </w:t>
+      </w:r>
+      <w:r>
+        <w:rPr>
+          <w:rFonts w:ascii="Arial" w:hAnsi="Arial" w:cs="Arial"/>
+          <w:color w:val="4B5563"/>
+          <w:sz w:val="19"/>
+          <w:szCs w:val="19"/>
+        </w:rPr>
+        <w:t>AJK</w:t>
+      </w:r>
+      <w:r>
+        <w:rPr>
+          <w:rFonts w:ascii="Arial" w:hAnsi="Arial" w:cs="Arial"/>
+          <w:color w:val="4B5563"/>
+          <w:sz w:val="19"/>
+          <w:szCs w:val="19"/>
+        </w:rPr>
+        <w:t xml:space="preserve">-based technology company </w:t>
+      </w:r>
+      <w:proofErr w:type="spellStart"/>
+      <w:r>
+        <w:rPr>
+          <w:rFonts w:ascii="Arial" w:hAnsi="Arial" w:cs="Arial"/>
+          <w:color w:val="4B5563"/>
+          <w:sz w:val="19"/>
+          <w:szCs w:val="19"/>
+        </w:rPr>
+        <w:t>specialising</w:t>
+      </w:r>
+      <w:proofErr w:type="spellEnd"/>
+      <w:r>
+        <w:rPr>
+          <w:rFonts w:ascii="Arial" w:hAnsi="Arial" w:cs="Arial"/>
+          <w:color w:val="4B5563"/>
+          <w:sz w:val="19"/>
+          <w:szCs w:val="19"/>
+        </w:rPr>
+        <w:t xml:space="preserve"> in artificial intelligence, data science and modern web development. We build fast, secure, professionally designed websites and digital systems for businesses in Pakistan and the United Kingdom combining strong visual design with the engineering quality expected of international products.</w:t>
+      </w:r>
+    </w:p>
+    <w:p>
+      <w:pPr>
+        <w:spacing w:after="90" w:line="259" w:lineRule="auto"/>
+        <w:rPr>
+          <w:rFonts w:ascii="Arial" w:hAnsi="Arial" w:cs="Arial"/>
+          <w:color w:val="4B5563"/>
+          <w:sz w:val="19"/>
+          <w:szCs w:val="19"/>
+        </w:rPr>
+      </w:pPr>
+    </w:p>
+    <w:p>
+      <w:pPr>
+        <w:spacing w:after="90" w:line="259" w:lineRule="auto"/>
+        <w:rPr>
+          <w:rFonts w:ascii="Arial" w:hAnsi="Arial" w:cs="Arial"/>
+          <w:color w:val="4B5563"/>
+          <w:sz w:val="19"/>
+          <w:szCs w:val="19"/>
+        </w:rPr>
+      </w:pPr>
+    </w:p>
+    <w:p>
+      <w:pPr>
+        <w:spacing w:after="90" w:line="259" w:lineRule="auto"/>
+      </w:pPr>
     </w:p>
     <w:p>
       <w:pPr>
@@ -391,12 +539,12 @@
           <w:sz w:val="22"/>
           <w:szCs w:val="22"/>
         </w:rPr>
-        <w:t xml:space="preserve">2. THE KCG WEBSITE PROJECT</w:t>
+        <w:t>2. THE KCG WEBSITE PROJECT</w:t>
       </w:r>
     </w:p>
     <w:p>
       <w:pPr>
-        <w:spacing w:before="0" w:after="90" w:line="259" w:lineRule="auto"/>
+        <w:spacing w:after="90" w:line="259" w:lineRule="auto"/>
       </w:pPr>
       <w:r>
         <w:rPr>
@@ -415,7 +563,7 @@
           <w:sz w:val="19"/>
           <w:szCs w:val="19"/>
         </w:rPr>
-        <w:t xml:space="preserve">https://kashmirconstructiongroup.com</w:t>
+        <w:t>https://kashmirconstructiongroup.com</w:t>
       </w:r>
       <w:r>
         <w:rPr>
@@ -424,7 +572,7 @@
           <w:sz w:val="19"/>
           <w:szCs w:val="19"/>
         </w:rPr>
-        <w:t xml:space="preserve">, including:</w:t>
+        <w:t>, including:</w:t>
       </w:r>
     </w:p>
     <w:p>
@@ -433,7 +581,7 @@
           <w:ilvl w:val="0"/>
           <w:numId w:val="1"/>
         </w:numPr>
-        <w:spacing w:before="0" w:after="40" w:line="259" w:lineRule="auto"/>
+        <w:spacing w:after="40" w:line="259" w:lineRule="auto"/>
         <w:ind w:left="360" w:hanging="260"/>
       </w:pPr>
       <w:r>
@@ -444,7 +592,7 @@
           <w:sz w:val="19"/>
           <w:szCs w:val="19"/>
         </w:rPr>
-        <w:t xml:space="preserve">Custom premium design</w:t>
+        <w:t>Custom premium design</w:t>
       </w:r>
       <w:r>
         <w:rPr>
@@ -453,7 +601,25 @@
           <w:sz w:val="19"/>
           <w:szCs w:val="19"/>
         </w:rPr>
-        <w:t xml:space="preserve"> in KCG’s own forest-green and gold brand, with cinematic scroll animations and </w:t>
+        <w:t xml:space="preserve"> in KCG’s own forest-green and gold brand</w:t>
+      </w:r>
+      <w:r>
+        <w:rPr>
+          <w:rFonts w:ascii="Arial" w:hAnsi="Arial" w:cs="Arial"/>
+          <w:color w:val="4B5563"/>
+          <w:sz w:val="19"/>
+          <w:szCs w:val="19"/>
+        </w:rPr>
+        <w:t xml:space="preserve"> mixing with AJK flag</w:t>
+      </w:r>
+      <w:r>
+        <w:rPr>
+          <w:rFonts w:ascii="Arial" w:hAnsi="Arial" w:cs="Arial"/>
+          <w:color w:val="4B5563"/>
+          <w:sz w:val="19"/>
+          <w:szCs w:val="19"/>
+        </w:rPr>
+        <w:t xml:space="preserve">, with cinematic scroll animations and </w:t>
       </w:r>
       <w:r>
         <w:rPr>
@@ -463,7 +629,7 @@
           <w:sz w:val="19"/>
           <w:szCs w:val="19"/>
         </w:rPr>
-        <w:t xml:space="preserve">drone video footage of KCG’s own site</w:t>
+        <w:t>drone video footage of KCG’s own site</w:t>
       </w:r>
       <w:r>
         <w:rPr>
@@ -472,7 +638,7 @@
           <w:sz w:val="19"/>
           <w:szCs w:val="19"/>
         </w:rPr>
-        <w:t xml:space="preserve">.</w:t>
+        <w:t>.</w:t>
       </w:r>
     </w:p>
     <w:p>
@@ -481,7 +647,7 @@
           <w:ilvl w:val="0"/>
           <w:numId w:val="1"/>
         </w:numPr>
-        <w:spacing w:before="0" w:after="40" w:line="259" w:lineRule="auto"/>
+        <w:spacing w:after="40" w:line="259" w:lineRule="auto"/>
         <w:ind w:left="360" w:hanging="260"/>
       </w:pPr>
       <w:r>
@@ -492,7 +658,7 @@
           <w:sz w:val="19"/>
           <w:szCs w:val="19"/>
         </w:rPr>
-        <w:t xml:space="preserve">Private Admin Panel</w:t>
+        <w:t>Private Admin Panel</w:t>
       </w:r>
       <w:r>
         <w:rPr>
@@ -501,7 +667,16 @@
           <w:sz w:val="19"/>
           <w:szCs w:val="19"/>
         </w:rPr>
-        <w:t xml:space="preserve"> — KCG can add, edit or delete projects, services, photos and all home-page text and contact details at any time, with no coding.</w:t>
+        <w:t>:</w:t>
+      </w:r>
+      <w:r>
+        <w:rPr>
+          <w:rFonts w:ascii="Arial" w:hAnsi="Arial" w:cs="Arial"/>
+          <w:color w:val="4B5563"/>
+          <w:sz w:val="19"/>
+          <w:szCs w:val="19"/>
+        </w:rPr>
+        <w:t xml:space="preserve"> KCG can add, edit or delete projects, services, photos and all home-page text and contact details at any time, with no coding.</w:t>
       </w:r>
     </w:p>
     <w:p>
@@ -510,7 +685,7 @@
           <w:ilvl w:val="0"/>
           <w:numId w:val="1"/>
         </w:numPr>
-        <w:spacing w:before="0" w:after="40" w:line="259" w:lineRule="auto"/>
+        <w:spacing w:after="40" w:line="259" w:lineRule="auto"/>
         <w:ind w:left="360" w:hanging="260"/>
       </w:pPr>
       <w:r>
@@ -521,7 +696,7 @@
           <w:sz w:val="19"/>
           <w:szCs w:val="19"/>
         </w:rPr>
-        <w:t xml:space="preserve">Contact form with message inbox</w:t>
+        <w:t>Contact form with message inbox</w:t>
       </w:r>
       <w:r>
         <w:rPr>
@@ -530,7 +705,7 @@
           <w:sz w:val="19"/>
           <w:szCs w:val="19"/>
         </w:rPr>
-        <w:t xml:space="preserve">, WhatsApp button, Google-ready structure, mobile-first responsive layout and a branded share image for WhatsApp/Facebook.</w:t>
+        <w:t>, WhatsApp button, Google-ready structure, mobile-first responsive layout and a branded share image for WhatsApp/Facebook.</w:t>
       </w:r>
     </w:p>
     <w:p>
@@ -539,7 +714,7 @@
           <w:ilvl w:val="0"/>
           <w:numId w:val="1"/>
         </w:numPr>
-        <w:spacing w:before="0" w:after="40" w:line="259" w:lineRule="auto"/>
+        <w:spacing w:after="40" w:line="259" w:lineRule="auto"/>
         <w:ind w:left="360" w:hanging="260"/>
       </w:pPr>
       <w:r>
@@ -550,7 +725,7 @@
           <w:sz w:val="19"/>
           <w:szCs w:val="19"/>
         </w:rPr>
-        <w:t xml:space="preserve">Performance &amp; security</w:t>
+        <w:t>Performance &amp; security</w:t>
       </w:r>
       <w:r>
         <w:rPr>
@@ -559,7 +734,16 @@
           <w:sz w:val="19"/>
           <w:szCs w:val="19"/>
         </w:rPr>
-        <w:t xml:space="preserve"> — Google Lighthouse score of 100 on desktop, security headers, protected database rules and spam filtering.</w:t>
+        <w:t>:</w:t>
+      </w:r>
+      <w:r>
+        <w:rPr>
+          <w:rFonts w:ascii="Arial" w:hAnsi="Arial" w:cs="Arial"/>
+          <w:color w:val="4B5563"/>
+          <w:sz w:val="19"/>
+          <w:szCs w:val="19"/>
+        </w:rPr>
+        <w:t xml:space="preserve"> Google Lighthouse score of 100 on desktop, security headers, protected database rules and spam filtering.</w:t>
       </w:r>
     </w:p>
     <w:p>
@@ -568,8 +752,14 @@
           <w:ilvl w:val="0"/>
           <w:numId w:val="1"/>
         </w:numPr>
-        <w:spacing w:before="0" w:after="40" w:line="259" w:lineRule="auto"/>
+        <w:spacing w:after="40" w:line="259" w:lineRule="auto"/>
         <w:ind w:left="360" w:hanging="260"/>
+        <w:rPr>
+          <w:rFonts w:ascii="Arial" w:hAnsi="Arial" w:cs="Arial"/>
+          <w:color w:val="4B5563"/>
+          <w:sz w:val="19"/>
+          <w:szCs w:val="19"/>
+        </w:rPr>
       </w:pPr>
       <w:r>
         <w:rPr>
@@ -579,7 +769,7 @@
           <w:sz w:val="19"/>
           <w:szCs w:val="19"/>
         </w:rPr>
-        <w:t xml:space="preserve">Domain and business email</w:t>
+        <w:t>Domain and business email</w:t>
       </w:r>
       <w:r>
         <w:rPr>
@@ -588,7 +778,55 @@
           <w:sz w:val="19"/>
           <w:szCs w:val="19"/>
         </w:rPr>
-        <w:t xml:space="preserve"> — kashmirconstructiongroup.com and info@kashmirconstructiongroup.com, registered for 3 years.</w:t>
+        <w:t xml:space="preserve">: </w:t>
+      </w:r>
+      <w:r>
+        <w:rPr>
+          <w:rFonts w:ascii="Arial" w:hAnsi="Arial" w:cs="Arial"/>
+          <w:color w:val="4B5563"/>
+          <w:sz w:val="19"/>
+          <w:szCs w:val="19"/>
+        </w:rPr>
+        <w:t xml:space="preserve"> kashmirconstructiongroup.com and info@kashmirconstructiongroup.com, registered for 3 years.</w:t>
+      </w:r>
+    </w:p>
+    <w:p>
+      <w:pPr>
+        <w:rPr>
+          <w:rFonts w:ascii="Arial" w:hAnsi="Arial" w:cs="Arial"/>
+          <w:color w:val="4B5563"/>
+          <w:sz w:val="19"/>
+          <w:szCs w:val="19"/>
+        </w:rPr>
+      </w:pPr>
+    </w:p>
+    <w:p>
+      <w:pPr>
+        <w:rPr>
+          <w:rFonts w:ascii="Arial" w:hAnsi="Arial" w:cs="Arial"/>
+          <w:color w:val="4B5563"/>
+          <w:sz w:val="19"/>
+          <w:szCs w:val="19"/>
+        </w:rPr>
+      </w:pPr>
+    </w:p>
+    <w:p>
+      <w:pPr>
+        <w:rPr>
+          <w:rFonts w:ascii="Arial" w:hAnsi="Arial" w:cs="Arial"/>
+          <w:color w:val="4B5563"/>
+          <w:sz w:val="19"/>
+          <w:szCs w:val="19"/>
+        </w:rPr>
+      </w:pPr>
+      <w:r>
+        <w:rPr>
+          <w:rFonts w:ascii="Arial" w:hAnsi="Arial" w:cs="Arial"/>
+          <w:color w:val="4B5563"/>
+          <w:sz w:val="19"/>
+          <w:szCs w:val="19"/>
+        </w:rPr>
+        <w:br w:type="page"/>
       </w:r>
     </w:p>
     <w:p>
@@ -607,7 +845,8 @@
           <w:sz w:val="22"/>
           <w:szCs w:val="22"/>
         </w:rPr>
-        <w:t xml:space="preserve">3. PACKAGE OPTIONS</w:t>
+        <w:lastRenderedPageBreak/>
+        <w:t>3. PACKAGE OPTIONS</w:t>
       </w:r>
     </w:p>
     <w:tbl>
@@ -623,6 +862,7 @@
           <w:insideV w:val="single" w:sz="4" w:space="0" w:color="D1D5DB"/>
         </w:tblBorders>
         <w:tblLayout w:type="fixed"/>
+        <w:tblLook w:val="04A0" w:firstRow="1" w:lastRow="0" w:firstColumn="1" w:lastColumn="0" w:noHBand="0" w:noVBand="1"/>
       </w:tblPr>
       <w:tblGrid>
         <w:gridCol w:w="2360"/>
@@ -634,22 +874,42 @@
         <w:trPr>
           <w:cantSplit/>
           <w:tblHeader/>
+          <w:jc w:val="center"/>
         </w:trPr>
         <w:tc>
           <w:tcPr>
             <w:tcW w:w="2360" w:type="dxa"/>
             <w:shd w:val="clear" w:color="auto" w:fill="0A1F44"/>
-            <w:vAlign w:val="center"/>
-            <w:tcMar>
-              <w:top w:w="45" w:type="dxa"/>
-              <w:bottom w:w="45" w:type="dxa"/>
-              <w:left w:w="110" w:type="dxa"/>
-              <w:right w:w="110" w:type="dxa"/>
-            </w:tcMar>
-          </w:tcPr>
-          <w:p>
-            <w:pPr>
-              <w:spacing w:before="0" w:after="0" w:line="252" w:lineRule="auto"/>
+            <w:tcMar>
+              <w:top w:w="45" w:type="dxa"/>
+              <w:left w:w="110" w:type="dxa"/>
+              <w:bottom w:w="45" w:type="dxa"/>
+              <w:right w:w="110" w:type="dxa"/>
+            </w:tcMar>
+            <w:vAlign w:val="center"/>
+          </w:tcPr>
+          <w:p>
+            <w:pPr>
+              <w:spacing w:line="252" w:lineRule="auto"/>
+            </w:pPr>
+          </w:p>
+        </w:tc>
+        <w:tc>
+          <w:tcPr>
+            <w:tcW w:w="2573" w:type="dxa"/>
+            <w:shd w:val="clear" w:color="auto" w:fill="0A1F44"/>
+            <w:tcMar>
+              <w:top w:w="45" w:type="dxa"/>
+              <w:left w:w="110" w:type="dxa"/>
+              <w:bottom w:w="45" w:type="dxa"/>
+              <w:right w:w="110" w:type="dxa"/>
+            </w:tcMar>
+            <w:vAlign w:val="center"/>
+          </w:tcPr>
+          <w:p>
+            <w:pPr>
+              <w:spacing w:line="252" w:lineRule="auto"/>
+              <w:jc w:val="center"/>
             </w:pPr>
             <w:r>
               <w:rPr>
@@ -659,7 +919,23 @@
                 <w:sz w:val="17"/>
                 <w:szCs w:val="17"/>
               </w:rPr>
-              <w:t xml:space="preserve"/>
+              <w:t>Package 1</w:t>
+            </w:r>
+          </w:p>
+          <w:p>
+            <w:pPr>
+              <w:spacing w:line="252" w:lineRule="auto"/>
+              <w:jc w:val="center"/>
+            </w:pPr>
+            <w:r>
+              <w:rPr>
+                <w:rFonts w:ascii="Arial" w:hAnsi="Arial" w:cs="Arial"/>
+                <w:b/>
+                <w:color w:val="FFFFFF"/>
+                <w:sz w:val="17"/>
+                <w:szCs w:val="17"/>
+              </w:rPr>
+              <w:t>Website</w:t>
             </w:r>
           </w:p>
         </w:tc>
@@ -667,17 +943,17 @@
           <w:tcPr>
             <w:tcW w:w="2573" w:type="dxa"/>
             <w:shd w:val="clear" w:color="auto" w:fill="0A1F44"/>
-            <w:vAlign w:val="center"/>
-            <w:tcMar>
-              <w:top w:w="45" w:type="dxa"/>
-              <w:bottom w:w="45" w:type="dxa"/>
-              <w:left w:w="110" w:type="dxa"/>
-              <w:right w:w="110" w:type="dxa"/>
-            </w:tcMar>
-          </w:tcPr>
-          <w:p>
-            <w:pPr>
-              <w:spacing w:before="0" w:after="0" w:line="252" w:lineRule="auto"/>
+            <w:tcMar>
+              <w:top w:w="45" w:type="dxa"/>
+              <w:left w:w="110" w:type="dxa"/>
+              <w:bottom w:w="45" w:type="dxa"/>
+              <w:right w:w="110" w:type="dxa"/>
+            </w:tcMar>
+            <w:vAlign w:val="center"/>
+          </w:tcPr>
+          <w:p>
+            <w:pPr>
+              <w:spacing w:line="252" w:lineRule="auto"/>
               <w:jc w:val="center"/>
             </w:pPr>
             <w:r>
@@ -688,12 +964,12 @@
                 <w:sz w:val="17"/>
                 <w:szCs w:val="17"/>
               </w:rPr>
-              <w:t xml:space="preserve">Package 1</w:t>
-            </w:r>
-          </w:p>
-          <w:p>
-            <w:pPr>
-              <w:spacing w:before="0" w:after="0" w:line="252" w:lineRule="auto"/>
+              <w:t>Package 2</w:t>
+            </w:r>
+          </w:p>
+          <w:p>
+            <w:pPr>
+              <w:spacing w:line="252" w:lineRule="auto"/>
               <w:jc w:val="center"/>
             </w:pPr>
             <w:r>
@@ -704,25 +980,25 @@
                 <w:sz w:val="17"/>
                 <w:szCs w:val="17"/>
               </w:rPr>
-              <w:t xml:space="preserve">Website</w:t>
-            </w:r>
-          </w:p>
-        </w:tc>
-        <w:tc>
-          <w:tcPr>
-            <w:tcW w:w="2573" w:type="dxa"/>
+              <w:t>Website + SEO</w:t>
+            </w:r>
+          </w:p>
+        </w:tc>
+        <w:tc>
+          <w:tcPr>
+            <w:tcW w:w="2574" w:type="dxa"/>
             <w:shd w:val="clear" w:color="auto" w:fill="0A1F44"/>
-            <w:vAlign w:val="center"/>
-            <w:tcMar>
-              <w:top w:w="45" w:type="dxa"/>
-              <w:bottom w:w="45" w:type="dxa"/>
-              <w:left w:w="110" w:type="dxa"/>
-              <w:right w:w="110" w:type="dxa"/>
-            </w:tcMar>
-          </w:tcPr>
-          <w:p>
-            <w:pPr>
-              <w:spacing w:before="0" w:after="0" w:line="252" w:lineRule="auto"/>
+            <w:tcMar>
+              <w:top w:w="45" w:type="dxa"/>
+              <w:left w:w="110" w:type="dxa"/>
+              <w:bottom w:w="45" w:type="dxa"/>
+              <w:right w:w="110" w:type="dxa"/>
+            </w:tcMar>
+            <w:vAlign w:val="center"/>
+          </w:tcPr>
+          <w:p>
+            <w:pPr>
+              <w:spacing w:line="252" w:lineRule="auto"/>
               <w:jc w:val="center"/>
             </w:pPr>
             <w:r>
@@ -733,12 +1009,12 @@
                 <w:sz w:val="17"/>
                 <w:szCs w:val="17"/>
               </w:rPr>
-              <w:t xml:space="preserve">Package 2</w:t>
-            </w:r>
-          </w:p>
-          <w:p>
-            <w:pPr>
-              <w:spacing w:before="0" w:after="0" w:line="252" w:lineRule="auto"/>
+              <w:t>Package 3</w:t>
+            </w:r>
+          </w:p>
+          <w:p>
+            <w:pPr>
+              <w:spacing w:line="252" w:lineRule="auto"/>
               <w:jc w:val="center"/>
             </w:pPr>
             <w:r>
@@ -749,52 +1025,7 @@
                 <w:sz w:val="17"/>
                 <w:szCs w:val="17"/>
               </w:rPr>
-              <w:t xml:space="preserve">Website + SEO</w:t>
-            </w:r>
-          </w:p>
-        </w:tc>
-        <w:tc>
-          <w:tcPr>
-            <w:tcW w:w="2574" w:type="dxa"/>
-            <w:shd w:val="clear" w:color="auto" w:fill="0A1F44"/>
-            <w:vAlign w:val="center"/>
-            <w:tcMar>
-              <w:top w:w="45" w:type="dxa"/>
-              <w:bottom w:w="45" w:type="dxa"/>
-              <w:left w:w="110" w:type="dxa"/>
-              <w:right w:w="110" w:type="dxa"/>
-            </w:tcMar>
-          </w:tcPr>
-          <w:p>
-            <w:pPr>
-              <w:spacing w:before="0" w:after="0" w:line="252" w:lineRule="auto"/>
-              <w:jc w:val="center"/>
-            </w:pPr>
-            <w:r>
-              <w:rPr>
-                <w:rFonts w:ascii="Arial" w:hAnsi="Arial" w:cs="Arial"/>
-                <w:b/>
-                <w:color w:val="FFFFFF"/>
-                <w:sz w:val="17"/>
-                <w:szCs w:val="17"/>
-              </w:rPr>
-              <w:t xml:space="preserve">Package 3</w:t>
-            </w:r>
-          </w:p>
-          <w:p>
-            <w:pPr>
-              <w:spacing w:before="0" w:after="0" w:line="252" w:lineRule="auto"/>
-              <w:jc w:val="center"/>
-            </w:pPr>
-            <w:r>
-              <w:rPr>
-                <w:rFonts w:ascii="Arial" w:hAnsi="Arial" w:cs="Arial"/>
-                <w:b/>
-                <w:color w:val="FFFFFF"/>
-                <w:sz w:val="17"/>
-                <w:szCs w:val="17"/>
-              </w:rPr>
-              <w:t xml:space="preserve">Complete Care</w:t>
+              <w:t>Complete Care</w:t>
             </w:r>
           </w:p>
         </w:tc>
@@ -802,47 +1033,48 @@
       <w:tr>
         <w:trPr>
           <w:cantSplit/>
+          <w:jc w:val="center"/>
         </w:trPr>
         <w:tc>
           <w:tcPr>
             <w:tcW w:w="2360" w:type="dxa"/>
-            <w:vAlign w:val="center"/>
-            <w:tcMar>
-              <w:top w:w="45" w:type="dxa"/>
-              <w:bottom w:w="45" w:type="dxa"/>
-              <w:left w:w="110" w:type="dxa"/>
-              <w:right w:w="110" w:type="dxa"/>
-            </w:tcMar>
-          </w:tcPr>
-          <w:p>
-            <w:pPr>
-              <w:spacing w:before="0" w:after="0" w:line="252" w:lineRule="auto"/>
-            </w:pPr>
-            <w:r>
-              <w:rPr>
-                <w:rFonts w:ascii="Arial" w:hAnsi="Arial" w:cs="Arial"/>
-                <w:color w:val="4B5563"/>
-                <w:sz w:val="17"/>
-                <w:szCs w:val="17"/>
-              </w:rPr>
-              <w:t xml:space="preserve">Custom website, animations &amp; drone videos</w:t>
+            <w:tcMar>
+              <w:top w:w="45" w:type="dxa"/>
+              <w:left w:w="110" w:type="dxa"/>
+              <w:bottom w:w="45" w:type="dxa"/>
+              <w:right w:w="110" w:type="dxa"/>
+            </w:tcMar>
+            <w:vAlign w:val="center"/>
+          </w:tcPr>
+          <w:p>
+            <w:pPr>
+              <w:spacing w:line="252" w:lineRule="auto"/>
+            </w:pPr>
+            <w:r>
+              <w:rPr>
+                <w:rFonts w:ascii="Arial" w:hAnsi="Arial" w:cs="Arial"/>
+                <w:color w:val="4B5563"/>
+                <w:sz w:val="17"/>
+                <w:szCs w:val="17"/>
+              </w:rPr>
+              <w:t>Custom website, animations &amp; drone videos</w:t>
             </w:r>
           </w:p>
         </w:tc>
         <w:tc>
           <w:tcPr>
             <w:tcW w:w="2573" w:type="dxa"/>
-            <w:vAlign w:val="center"/>
-            <w:tcMar>
-              <w:top w:w="45" w:type="dxa"/>
-              <w:bottom w:w="45" w:type="dxa"/>
-              <w:left w:w="110" w:type="dxa"/>
-              <w:right w:w="110" w:type="dxa"/>
-            </w:tcMar>
-          </w:tcPr>
-          <w:p>
-            <w:pPr>
-              <w:spacing w:before="0" w:after="0" w:line="252" w:lineRule="auto"/>
+            <w:tcMar>
+              <w:top w:w="45" w:type="dxa"/>
+              <w:left w:w="110" w:type="dxa"/>
+              <w:bottom w:w="45" w:type="dxa"/>
+              <w:right w:w="110" w:type="dxa"/>
+            </w:tcMar>
+            <w:vAlign w:val="center"/>
+          </w:tcPr>
+          <w:p>
+            <w:pPr>
+              <w:spacing w:line="252" w:lineRule="auto"/>
               <w:jc w:val="center"/>
             </w:pPr>
             <w:r>
@@ -852,24 +1084,24 @@
                 <w:sz w:val="17"/>
                 <w:szCs w:val="17"/>
               </w:rPr>
-              <w:t xml:space="preserve">✔</w:t>
+              <w:t>✔</w:t>
             </w:r>
           </w:p>
         </w:tc>
         <w:tc>
           <w:tcPr>
             <w:tcW w:w="2573" w:type="dxa"/>
-            <w:vAlign w:val="center"/>
-            <w:tcMar>
-              <w:top w:w="45" w:type="dxa"/>
-              <w:bottom w:w="45" w:type="dxa"/>
-              <w:left w:w="110" w:type="dxa"/>
-              <w:right w:w="110" w:type="dxa"/>
-            </w:tcMar>
-          </w:tcPr>
-          <w:p>
-            <w:pPr>
-              <w:spacing w:before="0" w:after="0" w:line="252" w:lineRule="auto"/>
+            <w:tcMar>
+              <w:top w:w="45" w:type="dxa"/>
+              <w:left w:w="110" w:type="dxa"/>
+              <w:bottom w:w="45" w:type="dxa"/>
+              <w:right w:w="110" w:type="dxa"/>
+            </w:tcMar>
+            <w:vAlign w:val="center"/>
+          </w:tcPr>
+          <w:p>
+            <w:pPr>
+              <w:spacing w:line="252" w:lineRule="auto"/>
               <w:jc w:val="center"/>
             </w:pPr>
             <w:r>
@@ -879,24 +1111,24 @@
                 <w:sz w:val="17"/>
                 <w:szCs w:val="17"/>
               </w:rPr>
-              <w:t xml:space="preserve">✔</w:t>
+              <w:t>✔</w:t>
             </w:r>
           </w:p>
         </w:tc>
         <w:tc>
           <w:tcPr>
             <w:tcW w:w="2574" w:type="dxa"/>
-            <w:vAlign w:val="center"/>
-            <w:tcMar>
-              <w:top w:w="45" w:type="dxa"/>
-              <w:bottom w:w="45" w:type="dxa"/>
-              <w:left w:w="110" w:type="dxa"/>
-              <w:right w:w="110" w:type="dxa"/>
-            </w:tcMar>
-          </w:tcPr>
-          <w:p>
-            <w:pPr>
-              <w:spacing w:before="0" w:after="0" w:line="252" w:lineRule="auto"/>
+            <w:tcMar>
+              <w:top w:w="45" w:type="dxa"/>
+              <w:left w:w="110" w:type="dxa"/>
+              <w:bottom w:w="45" w:type="dxa"/>
+              <w:right w:w="110" w:type="dxa"/>
+            </w:tcMar>
+            <w:vAlign w:val="center"/>
+          </w:tcPr>
+          <w:p>
+            <w:pPr>
+              <w:spacing w:line="252" w:lineRule="auto"/>
               <w:jc w:val="center"/>
             </w:pPr>
             <w:r>
@@ -906,7 +1138,7 @@
                 <w:sz w:val="17"/>
                 <w:szCs w:val="17"/>
               </w:rPr>
-              <w:t xml:space="preserve">✔</w:t>
+              <w:t>✔</w:t>
             </w:r>
           </w:p>
         </w:tc>
@@ -914,31 +1146,32 @@
       <w:tr>
         <w:trPr>
           <w:cantSplit/>
+          <w:jc w:val="center"/>
         </w:trPr>
         <w:tc>
           <w:tcPr>
             <w:tcW w:w="2360" w:type="dxa"/>
             <w:shd w:val="clear" w:color="auto" w:fill="EEF2FF"/>
-            <w:vAlign w:val="center"/>
-            <w:tcMar>
-              <w:top w:w="45" w:type="dxa"/>
-              <w:bottom w:w="45" w:type="dxa"/>
-              <w:left w:w="110" w:type="dxa"/>
-              <w:right w:w="110" w:type="dxa"/>
-            </w:tcMar>
-          </w:tcPr>
-          <w:p>
-            <w:pPr>
-              <w:spacing w:before="0" w:after="0" w:line="252" w:lineRule="auto"/>
-            </w:pPr>
-            <w:r>
-              <w:rPr>
-                <w:rFonts w:ascii="Arial" w:hAnsi="Arial" w:cs="Arial"/>
-                <w:color w:val="4B5563"/>
-                <w:sz w:val="17"/>
-                <w:szCs w:val="17"/>
-              </w:rPr>
-              <w:t xml:space="preserve">Admin Panel (projects, services, text, photos)</w:t>
+            <w:tcMar>
+              <w:top w:w="45" w:type="dxa"/>
+              <w:left w:w="110" w:type="dxa"/>
+              <w:bottom w:w="45" w:type="dxa"/>
+              <w:right w:w="110" w:type="dxa"/>
+            </w:tcMar>
+            <w:vAlign w:val="center"/>
+          </w:tcPr>
+          <w:p>
+            <w:pPr>
+              <w:spacing w:line="252" w:lineRule="auto"/>
+            </w:pPr>
+            <w:r>
+              <w:rPr>
+                <w:rFonts w:ascii="Arial" w:hAnsi="Arial" w:cs="Arial"/>
+                <w:color w:val="4B5563"/>
+                <w:sz w:val="17"/>
+                <w:szCs w:val="17"/>
+              </w:rPr>
+              <w:t>Admin Panel (projects, services, text, photos)</w:t>
             </w:r>
           </w:p>
         </w:tc>
@@ -946,17 +1179,17 @@
           <w:tcPr>
             <w:tcW w:w="2573" w:type="dxa"/>
             <w:shd w:val="clear" w:color="auto" w:fill="EEF2FF"/>
-            <w:vAlign w:val="center"/>
-            <w:tcMar>
-              <w:top w:w="45" w:type="dxa"/>
-              <w:bottom w:w="45" w:type="dxa"/>
-              <w:left w:w="110" w:type="dxa"/>
-              <w:right w:w="110" w:type="dxa"/>
-            </w:tcMar>
-          </w:tcPr>
-          <w:p>
-            <w:pPr>
-              <w:spacing w:before="0" w:after="0" w:line="252" w:lineRule="auto"/>
+            <w:tcMar>
+              <w:top w:w="45" w:type="dxa"/>
+              <w:left w:w="110" w:type="dxa"/>
+              <w:bottom w:w="45" w:type="dxa"/>
+              <w:right w:w="110" w:type="dxa"/>
+            </w:tcMar>
+            <w:vAlign w:val="center"/>
+          </w:tcPr>
+          <w:p>
+            <w:pPr>
+              <w:spacing w:line="252" w:lineRule="auto"/>
               <w:jc w:val="center"/>
             </w:pPr>
             <w:r>
@@ -966,7 +1199,7 @@
                 <w:sz w:val="17"/>
                 <w:szCs w:val="17"/>
               </w:rPr>
-              <w:t xml:space="preserve">✔</w:t>
+              <w:t>✔</w:t>
             </w:r>
           </w:p>
         </w:tc>
@@ -974,17 +1207,17 @@
           <w:tcPr>
             <w:tcW w:w="2573" w:type="dxa"/>
             <w:shd w:val="clear" w:color="auto" w:fill="EEF2FF"/>
-            <w:vAlign w:val="center"/>
-            <w:tcMar>
-              <w:top w:w="45" w:type="dxa"/>
-              <w:bottom w:w="45" w:type="dxa"/>
-              <w:left w:w="110" w:type="dxa"/>
-              <w:right w:w="110" w:type="dxa"/>
-            </w:tcMar>
-          </w:tcPr>
-          <w:p>
-            <w:pPr>
-              <w:spacing w:before="0" w:after="0" w:line="252" w:lineRule="auto"/>
+            <w:tcMar>
+              <w:top w:w="45" w:type="dxa"/>
+              <w:left w:w="110" w:type="dxa"/>
+              <w:bottom w:w="45" w:type="dxa"/>
+              <w:right w:w="110" w:type="dxa"/>
+            </w:tcMar>
+            <w:vAlign w:val="center"/>
+          </w:tcPr>
+          <w:p>
+            <w:pPr>
+              <w:spacing w:line="252" w:lineRule="auto"/>
               <w:jc w:val="center"/>
             </w:pPr>
             <w:r>
@@ -994,7 +1227,7 @@
                 <w:sz w:val="17"/>
                 <w:szCs w:val="17"/>
               </w:rPr>
-              <w:t xml:space="preserve">✔</w:t>
+              <w:t>✔</w:t>
             </w:r>
           </w:p>
         </w:tc>
@@ -1002,17 +1235,17 @@
           <w:tcPr>
             <w:tcW w:w="2574" w:type="dxa"/>
             <w:shd w:val="clear" w:color="auto" w:fill="EEF2FF"/>
-            <w:vAlign w:val="center"/>
-            <w:tcMar>
-              <w:top w:w="45" w:type="dxa"/>
-              <w:bottom w:w="45" w:type="dxa"/>
-              <w:left w:w="110" w:type="dxa"/>
-              <w:right w:w="110" w:type="dxa"/>
-            </w:tcMar>
-          </w:tcPr>
-          <w:p>
-            <w:pPr>
-              <w:spacing w:before="0" w:after="0" w:line="252" w:lineRule="auto"/>
+            <w:tcMar>
+              <w:top w:w="45" w:type="dxa"/>
+              <w:left w:w="110" w:type="dxa"/>
+              <w:bottom w:w="45" w:type="dxa"/>
+              <w:right w:w="110" w:type="dxa"/>
+            </w:tcMar>
+            <w:vAlign w:val="center"/>
+          </w:tcPr>
+          <w:p>
+            <w:pPr>
+              <w:spacing w:line="252" w:lineRule="auto"/>
               <w:jc w:val="center"/>
             </w:pPr>
             <w:r>
@@ -1022,7 +1255,7 @@
                 <w:sz w:val="17"/>
                 <w:szCs w:val="17"/>
               </w:rPr>
-              <w:t xml:space="preserve">✔</w:t>
+              <w:t>✔</w:t>
             </w:r>
           </w:p>
         </w:tc>
@@ -1030,47 +1263,48 @@
       <w:tr>
         <w:trPr>
           <w:cantSplit/>
+          <w:jc w:val="center"/>
         </w:trPr>
         <w:tc>
           <w:tcPr>
             <w:tcW w:w="2360" w:type="dxa"/>
-            <w:vAlign w:val="center"/>
-            <w:tcMar>
-              <w:top w:w="45" w:type="dxa"/>
-              <w:bottom w:w="45" w:type="dxa"/>
-              <w:left w:w="110" w:type="dxa"/>
-              <w:right w:w="110" w:type="dxa"/>
-            </w:tcMar>
-          </w:tcPr>
-          <w:p>
-            <w:pPr>
-              <w:spacing w:before="0" w:after="0" w:line="252" w:lineRule="auto"/>
-            </w:pPr>
-            <w:r>
-              <w:rPr>
-                <w:rFonts w:ascii="Arial" w:hAnsi="Arial" w:cs="Arial"/>
-                <w:color w:val="4B5563"/>
-                <w:sz w:val="17"/>
-                <w:szCs w:val="17"/>
-              </w:rPr>
-              <w:t xml:space="preserve">Contact form, message inbox &amp; WhatsApp</w:t>
+            <w:tcMar>
+              <w:top w:w="45" w:type="dxa"/>
+              <w:left w:w="110" w:type="dxa"/>
+              <w:bottom w:w="45" w:type="dxa"/>
+              <w:right w:w="110" w:type="dxa"/>
+            </w:tcMar>
+            <w:vAlign w:val="center"/>
+          </w:tcPr>
+          <w:p>
+            <w:pPr>
+              <w:spacing w:line="252" w:lineRule="auto"/>
+            </w:pPr>
+            <w:r>
+              <w:rPr>
+                <w:rFonts w:ascii="Arial" w:hAnsi="Arial" w:cs="Arial"/>
+                <w:color w:val="4B5563"/>
+                <w:sz w:val="17"/>
+                <w:szCs w:val="17"/>
+              </w:rPr>
+              <w:t>Contact form, message inbox &amp; WhatsApp</w:t>
             </w:r>
           </w:p>
         </w:tc>
         <w:tc>
           <w:tcPr>
             <w:tcW w:w="2573" w:type="dxa"/>
-            <w:vAlign w:val="center"/>
-            <w:tcMar>
-              <w:top w:w="45" w:type="dxa"/>
-              <w:bottom w:w="45" w:type="dxa"/>
-              <w:left w:w="110" w:type="dxa"/>
-              <w:right w:w="110" w:type="dxa"/>
-            </w:tcMar>
-          </w:tcPr>
-          <w:p>
-            <w:pPr>
-              <w:spacing w:before="0" w:after="0" w:line="252" w:lineRule="auto"/>
+            <w:tcMar>
+              <w:top w:w="45" w:type="dxa"/>
+              <w:left w:w="110" w:type="dxa"/>
+              <w:bottom w:w="45" w:type="dxa"/>
+              <w:right w:w="110" w:type="dxa"/>
+            </w:tcMar>
+            <w:vAlign w:val="center"/>
+          </w:tcPr>
+          <w:p>
+            <w:pPr>
+              <w:spacing w:line="252" w:lineRule="auto"/>
               <w:jc w:val="center"/>
             </w:pPr>
             <w:r>
@@ -1080,24 +1314,24 @@
                 <w:sz w:val="17"/>
                 <w:szCs w:val="17"/>
               </w:rPr>
-              <w:t xml:space="preserve">✔</w:t>
+              <w:t>✔</w:t>
             </w:r>
           </w:p>
         </w:tc>
         <w:tc>
           <w:tcPr>
             <w:tcW w:w="2573" w:type="dxa"/>
-            <w:vAlign w:val="center"/>
-            <w:tcMar>
-              <w:top w:w="45" w:type="dxa"/>
-              <w:bottom w:w="45" w:type="dxa"/>
-              <w:left w:w="110" w:type="dxa"/>
-              <w:right w:w="110" w:type="dxa"/>
-            </w:tcMar>
-          </w:tcPr>
-          <w:p>
-            <w:pPr>
-              <w:spacing w:before="0" w:after="0" w:line="252" w:lineRule="auto"/>
+            <w:tcMar>
+              <w:top w:w="45" w:type="dxa"/>
+              <w:left w:w="110" w:type="dxa"/>
+              <w:bottom w:w="45" w:type="dxa"/>
+              <w:right w:w="110" w:type="dxa"/>
+            </w:tcMar>
+            <w:vAlign w:val="center"/>
+          </w:tcPr>
+          <w:p>
+            <w:pPr>
+              <w:spacing w:line="252" w:lineRule="auto"/>
               <w:jc w:val="center"/>
             </w:pPr>
             <w:r>
@@ -1107,24 +1341,24 @@
                 <w:sz w:val="17"/>
                 <w:szCs w:val="17"/>
               </w:rPr>
-              <w:t xml:space="preserve">✔</w:t>
+              <w:t>✔</w:t>
             </w:r>
           </w:p>
         </w:tc>
         <w:tc>
           <w:tcPr>
             <w:tcW w:w="2574" w:type="dxa"/>
-            <w:vAlign w:val="center"/>
-            <w:tcMar>
-              <w:top w:w="45" w:type="dxa"/>
-              <w:bottom w:w="45" w:type="dxa"/>
-              <w:left w:w="110" w:type="dxa"/>
-              <w:right w:w="110" w:type="dxa"/>
-            </w:tcMar>
-          </w:tcPr>
-          <w:p>
-            <w:pPr>
-              <w:spacing w:before="0" w:after="0" w:line="252" w:lineRule="auto"/>
+            <w:tcMar>
+              <w:top w:w="45" w:type="dxa"/>
+              <w:left w:w="110" w:type="dxa"/>
+              <w:bottom w:w="45" w:type="dxa"/>
+              <w:right w:w="110" w:type="dxa"/>
+            </w:tcMar>
+            <w:vAlign w:val="center"/>
+          </w:tcPr>
+          <w:p>
+            <w:pPr>
+              <w:spacing w:line="252" w:lineRule="auto"/>
               <w:jc w:val="center"/>
             </w:pPr>
             <w:r>
@@ -1134,7 +1368,7 @@
                 <w:sz w:val="17"/>
                 <w:szCs w:val="17"/>
               </w:rPr>
-              <w:t xml:space="preserve">✔</w:t>
+              <w:t>✔</w:t>
             </w:r>
           </w:p>
         </w:tc>
@@ -1142,31 +1376,32 @@
       <w:tr>
         <w:trPr>
           <w:cantSplit/>
+          <w:jc w:val="center"/>
         </w:trPr>
         <w:tc>
           <w:tcPr>
             <w:tcW w:w="2360" w:type="dxa"/>
             <w:shd w:val="clear" w:color="auto" w:fill="EEF2FF"/>
-            <w:vAlign w:val="center"/>
-            <w:tcMar>
-              <w:top w:w="45" w:type="dxa"/>
-              <w:bottom w:w="45" w:type="dxa"/>
-              <w:left w:w="110" w:type="dxa"/>
-              <w:right w:w="110" w:type="dxa"/>
-            </w:tcMar>
-          </w:tcPr>
-          <w:p>
-            <w:pPr>
-              <w:spacing w:before="0" w:after="0" w:line="252" w:lineRule="auto"/>
-            </w:pPr>
-            <w:r>
-              <w:rPr>
-                <w:rFonts w:ascii="Arial" w:hAnsi="Arial" w:cs="Arial"/>
-                <w:color w:val="4B5563"/>
-                <w:sz w:val="17"/>
-                <w:szCs w:val="17"/>
-              </w:rPr>
-              <w:t xml:space="preserve">Domain + business email (3 years)</w:t>
+            <w:tcMar>
+              <w:top w:w="45" w:type="dxa"/>
+              <w:left w:w="110" w:type="dxa"/>
+              <w:bottom w:w="45" w:type="dxa"/>
+              <w:right w:w="110" w:type="dxa"/>
+            </w:tcMar>
+            <w:vAlign w:val="center"/>
+          </w:tcPr>
+          <w:p>
+            <w:pPr>
+              <w:spacing w:line="252" w:lineRule="auto"/>
+            </w:pPr>
+            <w:r>
+              <w:rPr>
+                <w:rFonts w:ascii="Arial" w:hAnsi="Arial" w:cs="Arial"/>
+                <w:color w:val="4B5563"/>
+                <w:sz w:val="17"/>
+                <w:szCs w:val="17"/>
+              </w:rPr>
+              <w:t>Domain + business email (3 years)</w:t>
             </w:r>
           </w:p>
         </w:tc>
@@ -1174,17 +1409,17 @@
           <w:tcPr>
             <w:tcW w:w="2573" w:type="dxa"/>
             <w:shd w:val="clear" w:color="auto" w:fill="EEF2FF"/>
-            <w:vAlign w:val="center"/>
-            <w:tcMar>
-              <w:top w:w="45" w:type="dxa"/>
-              <w:bottom w:w="45" w:type="dxa"/>
-              <w:left w:w="110" w:type="dxa"/>
-              <w:right w:w="110" w:type="dxa"/>
-            </w:tcMar>
-          </w:tcPr>
-          <w:p>
-            <w:pPr>
-              <w:spacing w:before="0" w:after="0" w:line="252" w:lineRule="auto"/>
+            <w:tcMar>
+              <w:top w:w="45" w:type="dxa"/>
+              <w:left w:w="110" w:type="dxa"/>
+              <w:bottom w:w="45" w:type="dxa"/>
+              <w:right w:w="110" w:type="dxa"/>
+            </w:tcMar>
+            <w:vAlign w:val="center"/>
+          </w:tcPr>
+          <w:p>
+            <w:pPr>
+              <w:spacing w:line="252" w:lineRule="auto"/>
               <w:jc w:val="center"/>
             </w:pPr>
             <w:r>
@@ -1194,7 +1429,7 @@
                 <w:sz w:val="17"/>
                 <w:szCs w:val="17"/>
               </w:rPr>
-              <w:t xml:space="preserve">✔</w:t>
+              <w:t>✔</w:t>
             </w:r>
           </w:p>
         </w:tc>
@@ -1202,17 +1437,17 @@
           <w:tcPr>
             <w:tcW w:w="2573" w:type="dxa"/>
             <w:shd w:val="clear" w:color="auto" w:fill="EEF2FF"/>
-            <w:vAlign w:val="center"/>
-            <w:tcMar>
-              <w:top w:w="45" w:type="dxa"/>
-              <w:bottom w:w="45" w:type="dxa"/>
-              <w:left w:w="110" w:type="dxa"/>
-              <w:right w:w="110" w:type="dxa"/>
-            </w:tcMar>
-          </w:tcPr>
-          <w:p>
-            <w:pPr>
-              <w:spacing w:before="0" w:after="0" w:line="252" w:lineRule="auto"/>
+            <w:tcMar>
+              <w:top w:w="45" w:type="dxa"/>
+              <w:left w:w="110" w:type="dxa"/>
+              <w:bottom w:w="45" w:type="dxa"/>
+              <w:right w:w="110" w:type="dxa"/>
+            </w:tcMar>
+            <w:vAlign w:val="center"/>
+          </w:tcPr>
+          <w:p>
+            <w:pPr>
+              <w:spacing w:line="252" w:lineRule="auto"/>
               <w:jc w:val="center"/>
             </w:pPr>
             <w:r>
@@ -1222,7 +1457,7 @@
                 <w:sz w:val="17"/>
                 <w:szCs w:val="17"/>
               </w:rPr>
-              <w:t xml:space="preserve">✔</w:t>
+              <w:t>✔</w:t>
             </w:r>
           </w:p>
         </w:tc>
@@ -1230,17 +1465,17 @@
           <w:tcPr>
             <w:tcW w:w="2574" w:type="dxa"/>
             <w:shd w:val="clear" w:color="auto" w:fill="EEF2FF"/>
-            <w:vAlign w:val="center"/>
-            <w:tcMar>
-              <w:top w:w="45" w:type="dxa"/>
-              <w:bottom w:w="45" w:type="dxa"/>
-              <w:left w:w="110" w:type="dxa"/>
-              <w:right w:w="110" w:type="dxa"/>
-            </w:tcMar>
-          </w:tcPr>
-          <w:p>
-            <w:pPr>
-              <w:spacing w:before="0" w:after="0" w:line="252" w:lineRule="auto"/>
+            <w:tcMar>
+              <w:top w:w="45" w:type="dxa"/>
+              <w:left w:w="110" w:type="dxa"/>
+              <w:bottom w:w="45" w:type="dxa"/>
+              <w:right w:w="110" w:type="dxa"/>
+            </w:tcMar>
+            <w:vAlign w:val="center"/>
+          </w:tcPr>
+          <w:p>
+            <w:pPr>
+              <w:spacing w:line="252" w:lineRule="auto"/>
               <w:jc w:val="center"/>
             </w:pPr>
             <w:r>
@@ -1250,7 +1485,7 @@
                 <w:sz w:val="17"/>
                 <w:szCs w:val="17"/>
               </w:rPr>
-              <w:t xml:space="preserve">✔</w:t>
+              <w:t>✔</w:t>
             </w:r>
           </w:p>
         </w:tc>
@@ -1258,47 +1493,48 @@
       <w:tr>
         <w:trPr>
           <w:cantSplit/>
+          <w:jc w:val="center"/>
         </w:trPr>
         <w:tc>
           <w:tcPr>
             <w:tcW w:w="2360" w:type="dxa"/>
-            <w:vAlign w:val="center"/>
-            <w:tcMar>
-              <w:top w:w="45" w:type="dxa"/>
-              <w:bottom w:w="45" w:type="dxa"/>
-              <w:left w:w="110" w:type="dxa"/>
-              <w:right w:w="110" w:type="dxa"/>
-            </w:tcMar>
-          </w:tcPr>
-          <w:p>
-            <w:pPr>
-              <w:spacing w:before="0" w:after="0" w:line="252" w:lineRule="auto"/>
-            </w:pPr>
-            <w:r>
-              <w:rPr>
-                <w:rFonts w:ascii="Arial" w:hAnsi="Arial" w:cs="Arial"/>
-                <w:color w:val="4B5563"/>
-                <w:sz w:val="17"/>
-                <w:szCs w:val="17"/>
-              </w:rPr>
-              <w:t xml:space="preserve">SEO setup &amp; Google Business Profile</w:t>
+            <w:tcMar>
+              <w:top w:w="45" w:type="dxa"/>
+              <w:left w:w="110" w:type="dxa"/>
+              <w:bottom w:w="45" w:type="dxa"/>
+              <w:right w:w="110" w:type="dxa"/>
+            </w:tcMar>
+            <w:vAlign w:val="center"/>
+          </w:tcPr>
+          <w:p>
+            <w:pPr>
+              <w:spacing w:line="252" w:lineRule="auto"/>
+            </w:pPr>
+            <w:r>
+              <w:rPr>
+                <w:rFonts w:ascii="Arial" w:hAnsi="Arial" w:cs="Arial"/>
+                <w:color w:val="4B5563"/>
+                <w:sz w:val="17"/>
+                <w:szCs w:val="17"/>
+              </w:rPr>
+              <w:t>SEO setup &amp; Google Business Profile</w:t>
             </w:r>
           </w:p>
         </w:tc>
         <w:tc>
           <w:tcPr>
             <w:tcW w:w="2573" w:type="dxa"/>
-            <w:vAlign w:val="center"/>
-            <w:tcMar>
-              <w:top w:w="45" w:type="dxa"/>
-              <w:bottom w:w="45" w:type="dxa"/>
-              <w:left w:w="110" w:type="dxa"/>
-              <w:right w:w="110" w:type="dxa"/>
-            </w:tcMar>
-          </w:tcPr>
-          <w:p>
-            <w:pPr>
-              <w:spacing w:before="0" w:after="0" w:line="252" w:lineRule="auto"/>
+            <w:tcMar>
+              <w:top w:w="45" w:type="dxa"/>
+              <w:left w:w="110" w:type="dxa"/>
+              <w:bottom w:w="45" w:type="dxa"/>
+              <w:right w:w="110" w:type="dxa"/>
+            </w:tcMar>
+            <w:vAlign w:val="center"/>
+          </w:tcPr>
+          <w:p>
+            <w:pPr>
+              <w:spacing w:line="252" w:lineRule="auto"/>
               <w:jc w:val="center"/>
             </w:pPr>
             <w:r>
@@ -1308,24 +1544,24 @@
                 <w:sz w:val="17"/>
                 <w:szCs w:val="17"/>
               </w:rPr>
-              <w:t xml:space="preserve">—</w:t>
+              <w:t>—</w:t>
             </w:r>
           </w:p>
         </w:tc>
         <w:tc>
           <w:tcPr>
             <w:tcW w:w="2573" w:type="dxa"/>
-            <w:vAlign w:val="center"/>
-            <w:tcMar>
-              <w:top w:w="45" w:type="dxa"/>
-              <w:bottom w:w="45" w:type="dxa"/>
-              <w:left w:w="110" w:type="dxa"/>
-              <w:right w:w="110" w:type="dxa"/>
-            </w:tcMar>
-          </w:tcPr>
-          <w:p>
-            <w:pPr>
-              <w:spacing w:before="0" w:after="0" w:line="252" w:lineRule="auto"/>
+            <w:tcMar>
+              <w:top w:w="45" w:type="dxa"/>
+              <w:left w:w="110" w:type="dxa"/>
+              <w:bottom w:w="45" w:type="dxa"/>
+              <w:right w:w="110" w:type="dxa"/>
+            </w:tcMar>
+            <w:vAlign w:val="center"/>
+          </w:tcPr>
+          <w:p>
+            <w:pPr>
+              <w:spacing w:line="252" w:lineRule="auto"/>
               <w:jc w:val="center"/>
             </w:pPr>
             <w:r>
@@ -1335,24 +1571,24 @@
                 <w:sz w:val="17"/>
                 <w:szCs w:val="17"/>
               </w:rPr>
-              <w:t xml:space="preserve">✔</w:t>
+              <w:t>✔</w:t>
             </w:r>
           </w:p>
         </w:tc>
         <w:tc>
           <w:tcPr>
             <w:tcW w:w="2574" w:type="dxa"/>
-            <w:vAlign w:val="center"/>
-            <w:tcMar>
-              <w:top w:w="45" w:type="dxa"/>
-              <w:bottom w:w="45" w:type="dxa"/>
-              <w:left w:w="110" w:type="dxa"/>
-              <w:right w:w="110" w:type="dxa"/>
-            </w:tcMar>
-          </w:tcPr>
-          <w:p>
-            <w:pPr>
-              <w:spacing w:before="0" w:after="0" w:line="252" w:lineRule="auto"/>
+            <w:tcMar>
+              <w:top w:w="45" w:type="dxa"/>
+              <w:left w:w="110" w:type="dxa"/>
+              <w:bottom w:w="45" w:type="dxa"/>
+              <w:right w:w="110" w:type="dxa"/>
+            </w:tcMar>
+            <w:vAlign w:val="center"/>
+          </w:tcPr>
+          <w:p>
+            <w:pPr>
+              <w:spacing w:line="252" w:lineRule="auto"/>
               <w:jc w:val="center"/>
             </w:pPr>
             <w:r>
@@ -1362,7 +1598,7 @@
                 <w:sz w:val="17"/>
                 <w:szCs w:val="17"/>
               </w:rPr>
-              <w:t xml:space="preserve">✔</w:t>
+              <w:t>✔</w:t>
             </w:r>
           </w:p>
         </w:tc>
@@ -1370,31 +1606,32 @@
       <w:tr>
         <w:trPr>
           <w:cantSplit/>
+          <w:jc w:val="center"/>
         </w:trPr>
         <w:tc>
           <w:tcPr>
             <w:tcW w:w="2360" w:type="dxa"/>
             <w:shd w:val="clear" w:color="auto" w:fill="EEF2FF"/>
-            <w:vAlign w:val="center"/>
-            <w:tcMar>
-              <w:top w:w="45" w:type="dxa"/>
-              <w:bottom w:w="45" w:type="dxa"/>
-              <w:left w:w="110" w:type="dxa"/>
-              <w:right w:w="110" w:type="dxa"/>
-            </w:tcMar>
-          </w:tcPr>
-          <w:p>
-            <w:pPr>
-              <w:spacing w:before="0" w:after="0" w:line="252" w:lineRule="auto"/>
-            </w:pPr>
-            <w:r>
-              <w:rPr>
-                <w:rFonts w:ascii="Arial" w:hAnsi="Arial" w:cs="Arial"/>
-                <w:color w:val="4B5563"/>
-                <w:sz w:val="17"/>
-                <w:szCs w:val="17"/>
-              </w:rPr>
-              <w:t xml:space="preserve">1 year free maintenance &amp; support</w:t>
+            <w:tcMar>
+              <w:top w:w="45" w:type="dxa"/>
+              <w:left w:w="110" w:type="dxa"/>
+              <w:bottom w:w="45" w:type="dxa"/>
+              <w:right w:w="110" w:type="dxa"/>
+            </w:tcMar>
+            <w:vAlign w:val="center"/>
+          </w:tcPr>
+          <w:p>
+            <w:pPr>
+              <w:spacing w:line="252" w:lineRule="auto"/>
+            </w:pPr>
+            <w:r>
+              <w:rPr>
+                <w:rFonts w:ascii="Arial" w:hAnsi="Arial" w:cs="Arial"/>
+                <w:color w:val="4B5563"/>
+                <w:sz w:val="17"/>
+                <w:szCs w:val="17"/>
+              </w:rPr>
+              <w:t>1 year free maintenance &amp; support</w:t>
             </w:r>
           </w:p>
         </w:tc>
@@ -1402,17 +1639,17 @@
           <w:tcPr>
             <w:tcW w:w="2573" w:type="dxa"/>
             <w:shd w:val="clear" w:color="auto" w:fill="EEF2FF"/>
-            <w:vAlign w:val="center"/>
-            <w:tcMar>
-              <w:top w:w="45" w:type="dxa"/>
-              <w:bottom w:w="45" w:type="dxa"/>
-              <w:left w:w="110" w:type="dxa"/>
-              <w:right w:w="110" w:type="dxa"/>
-            </w:tcMar>
-          </w:tcPr>
-          <w:p>
-            <w:pPr>
-              <w:spacing w:before="0" w:after="0" w:line="252" w:lineRule="auto"/>
+            <w:tcMar>
+              <w:top w:w="45" w:type="dxa"/>
+              <w:left w:w="110" w:type="dxa"/>
+              <w:bottom w:w="45" w:type="dxa"/>
+              <w:right w:w="110" w:type="dxa"/>
+            </w:tcMar>
+            <w:vAlign w:val="center"/>
+          </w:tcPr>
+          <w:p>
+            <w:pPr>
+              <w:spacing w:line="252" w:lineRule="auto"/>
               <w:jc w:val="center"/>
             </w:pPr>
             <w:r>
@@ -1422,7 +1659,7 @@
                 <w:sz w:val="17"/>
                 <w:szCs w:val="17"/>
               </w:rPr>
-              <w:t xml:space="preserve">—</w:t>
+              <w:t>—</w:t>
             </w:r>
           </w:p>
         </w:tc>
@@ -1430,17 +1667,17 @@
           <w:tcPr>
             <w:tcW w:w="2573" w:type="dxa"/>
             <w:shd w:val="clear" w:color="auto" w:fill="EEF2FF"/>
-            <w:vAlign w:val="center"/>
-            <w:tcMar>
-              <w:top w:w="45" w:type="dxa"/>
-              <w:bottom w:w="45" w:type="dxa"/>
-              <w:left w:w="110" w:type="dxa"/>
-              <w:right w:w="110" w:type="dxa"/>
-            </w:tcMar>
-          </w:tcPr>
-          <w:p>
-            <w:pPr>
-              <w:spacing w:before="0" w:after="0" w:line="252" w:lineRule="auto"/>
+            <w:tcMar>
+              <w:top w:w="45" w:type="dxa"/>
+              <w:left w:w="110" w:type="dxa"/>
+              <w:bottom w:w="45" w:type="dxa"/>
+              <w:right w:w="110" w:type="dxa"/>
+            </w:tcMar>
+            <w:vAlign w:val="center"/>
+          </w:tcPr>
+          <w:p>
+            <w:pPr>
+              <w:spacing w:line="252" w:lineRule="auto"/>
               <w:jc w:val="center"/>
             </w:pPr>
             <w:r>
@@ -1450,7 +1687,7 @@
                 <w:sz w:val="17"/>
                 <w:szCs w:val="17"/>
               </w:rPr>
-              <w:t xml:space="preserve">—</w:t>
+              <w:t>—</w:t>
             </w:r>
           </w:p>
         </w:tc>
@@ -1458,17 +1695,17 @@
           <w:tcPr>
             <w:tcW w:w="2574" w:type="dxa"/>
             <w:shd w:val="clear" w:color="auto" w:fill="EEF2FF"/>
-            <w:vAlign w:val="center"/>
-            <w:tcMar>
-              <w:top w:w="45" w:type="dxa"/>
-              <w:bottom w:w="45" w:type="dxa"/>
-              <w:left w:w="110" w:type="dxa"/>
-              <w:right w:w="110" w:type="dxa"/>
-            </w:tcMar>
-          </w:tcPr>
-          <w:p>
-            <w:pPr>
-              <w:spacing w:before="0" w:after="0" w:line="252" w:lineRule="auto"/>
+            <w:tcMar>
+              <w:top w:w="45" w:type="dxa"/>
+              <w:left w:w="110" w:type="dxa"/>
+              <w:bottom w:w="45" w:type="dxa"/>
+              <w:right w:w="110" w:type="dxa"/>
+            </w:tcMar>
+            <w:vAlign w:val="center"/>
+          </w:tcPr>
+          <w:p>
+            <w:pPr>
+              <w:spacing w:line="252" w:lineRule="auto"/>
               <w:jc w:val="center"/>
             </w:pPr>
             <w:r>
@@ -1478,7 +1715,7 @@
                 <w:sz w:val="17"/>
                 <w:szCs w:val="17"/>
               </w:rPr>
-              <w:t xml:space="preserve">✔</w:t>
+              <w:t>✔</w:t>
             </w:r>
           </w:p>
         </w:tc>
@@ -1486,47 +1723,48 @@
       <w:tr>
         <w:trPr>
           <w:cantSplit/>
+          <w:jc w:val="center"/>
         </w:trPr>
         <w:tc>
           <w:tcPr>
             <w:tcW w:w="2360" w:type="dxa"/>
-            <w:vAlign w:val="center"/>
-            <w:tcMar>
-              <w:top w:w="45" w:type="dxa"/>
-              <w:bottom w:w="45" w:type="dxa"/>
-              <w:left w:w="110" w:type="dxa"/>
-              <w:right w:w="110" w:type="dxa"/>
-            </w:tcMar>
-          </w:tcPr>
-          <w:p>
-            <w:pPr>
-              <w:spacing w:before="0" w:after="0" w:line="252" w:lineRule="auto"/>
-            </w:pPr>
-            <w:r>
-              <w:rPr>
-                <w:rFonts w:ascii="Arial" w:hAnsi="Arial" w:cs="Arial"/>
-                <w:color w:val="4B5563"/>
-                <w:sz w:val="17"/>
-                <w:szCs w:val="17"/>
-              </w:rPr>
-              <w:t xml:space="preserve">Website development</w:t>
+            <w:tcMar>
+              <w:top w:w="45" w:type="dxa"/>
+              <w:left w:w="110" w:type="dxa"/>
+              <w:bottom w:w="45" w:type="dxa"/>
+              <w:right w:w="110" w:type="dxa"/>
+            </w:tcMar>
+            <w:vAlign w:val="center"/>
+          </w:tcPr>
+          <w:p>
+            <w:pPr>
+              <w:spacing w:line="252" w:lineRule="auto"/>
+            </w:pPr>
+            <w:r>
+              <w:rPr>
+                <w:rFonts w:ascii="Arial" w:hAnsi="Arial" w:cs="Arial"/>
+                <w:color w:val="4B5563"/>
+                <w:sz w:val="17"/>
+                <w:szCs w:val="17"/>
+              </w:rPr>
+              <w:t>Website development</w:t>
             </w:r>
           </w:p>
         </w:tc>
         <w:tc>
           <w:tcPr>
             <w:tcW w:w="2573" w:type="dxa"/>
-            <w:vAlign w:val="center"/>
-            <w:tcMar>
-              <w:top w:w="45" w:type="dxa"/>
-              <w:bottom w:w="45" w:type="dxa"/>
-              <w:left w:w="110" w:type="dxa"/>
-              <w:right w:w="110" w:type="dxa"/>
-            </w:tcMar>
-          </w:tcPr>
-          <w:p>
-            <w:pPr>
-              <w:spacing w:before="0" w:after="0" w:line="252" w:lineRule="auto"/>
+            <w:tcMar>
+              <w:top w:w="45" w:type="dxa"/>
+              <w:left w:w="110" w:type="dxa"/>
+              <w:bottom w:w="45" w:type="dxa"/>
+              <w:right w:w="110" w:type="dxa"/>
+            </w:tcMar>
+            <w:vAlign w:val="center"/>
+          </w:tcPr>
+          <w:p>
+            <w:pPr>
+              <w:spacing w:line="252" w:lineRule="auto"/>
               <w:jc w:val="center"/>
             </w:pPr>
             <w:r>
@@ -1536,24 +1774,24 @@
                 <w:sz w:val="17"/>
                 <w:szCs w:val="17"/>
               </w:rPr>
-              <w:t xml:space="preserve">Rs 115,000</w:t>
+              <w:t>Rs 115,000</w:t>
             </w:r>
           </w:p>
         </w:tc>
         <w:tc>
           <w:tcPr>
             <w:tcW w:w="2573" w:type="dxa"/>
-            <w:vAlign w:val="center"/>
-            <w:tcMar>
-              <w:top w:w="45" w:type="dxa"/>
-              <w:bottom w:w="45" w:type="dxa"/>
-              <w:left w:w="110" w:type="dxa"/>
-              <w:right w:w="110" w:type="dxa"/>
-            </w:tcMar>
-          </w:tcPr>
-          <w:p>
-            <w:pPr>
-              <w:spacing w:before="0" w:after="0" w:line="252" w:lineRule="auto"/>
+            <w:tcMar>
+              <w:top w:w="45" w:type="dxa"/>
+              <w:left w:w="110" w:type="dxa"/>
+              <w:bottom w:w="45" w:type="dxa"/>
+              <w:right w:w="110" w:type="dxa"/>
+            </w:tcMar>
+            <w:vAlign w:val="center"/>
+          </w:tcPr>
+          <w:p>
+            <w:pPr>
+              <w:spacing w:line="252" w:lineRule="auto"/>
               <w:jc w:val="center"/>
             </w:pPr>
             <w:r>
@@ -1563,24 +1801,24 @@
                 <w:sz w:val="17"/>
                 <w:szCs w:val="17"/>
               </w:rPr>
-              <w:t xml:space="preserve">Rs 130,000</w:t>
+              <w:t>Rs 130,000</w:t>
             </w:r>
           </w:p>
         </w:tc>
         <w:tc>
           <w:tcPr>
             <w:tcW w:w="2574" w:type="dxa"/>
-            <w:vAlign w:val="center"/>
-            <w:tcMar>
-              <w:top w:w="45" w:type="dxa"/>
-              <w:bottom w:w="45" w:type="dxa"/>
-              <w:left w:w="110" w:type="dxa"/>
-              <w:right w:w="110" w:type="dxa"/>
-            </w:tcMar>
-          </w:tcPr>
-          <w:p>
-            <w:pPr>
-              <w:spacing w:before="0" w:after="0" w:line="252" w:lineRule="auto"/>
+            <w:tcMar>
+              <w:top w:w="45" w:type="dxa"/>
+              <w:left w:w="110" w:type="dxa"/>
+              <w:bottom w:w="45" w:type="dxa"/>
+              <w:right w:w="110" w:type="dxa"/>
+            </w:tcMar>
+            <w:vAlign w:val="center"/>
+          </w:tcPr>
+          <w:p>
+            <w:pPr>
+              <w:spacing w:line="252" w:lineRule="auto"/>
               <w:jc w:val="center"/>
             </w:pPr>
             <w:r>
@@ -1590,7 +1828,7 @@
                 <w:sz w:val="17"/>
                 <w:szCs w:val="17"/>
               </w:rPr>
-              <w:t xml:space="preserve">Rs 150,000</w:t>
+              <w:t>Rs 150,000</w:t>
             </w:r>
           </w:p>
         </w:tc>
@@ -1598,31 +1836,32 @@
       <w:tr>
         <w:trPr>
           <w:cantSplit/>
+          <w:jc w:val="center"/>
         </w:trPr>
         <w:tc>
           <w:tcPr>
             <w:tcW w:w="2360" w:type="dxa"/>
             <w:shd w:val="clear" w:color="auto" w:fill="EEF2FF"/>
-            <w:vAlign w:val="center"/>
-            <w:tcMar>
-              <w:top w:w="45" w:type="dxa"/>
-              <w:bottom w:w="45" w:type="dxa"/>
-              <w:left w:w="110" w:type="dxa"/>
-              <w:right w:w="110" w:type="dxa"/>
-            </w:tcMar>
-          </w:tcPr>
-          <w:p>
-            <w:pPr>
-              <w:spacing w:before="0" w:after="0" w:line="252" w:lineRule="auto"/>
-            </w:pPr>
-            <w:r>
-              <w:rPr>
-                <w:rFonts w:ascii="Arial" w:hAnsi="Arial" w:cs="Arial"/>
-                <w:color w:val="4B5563"/>
-                <w:sz w:val="17"/>
-                <w:szCs w:val="17"/>
-              </w:rPr>
-              <w:t xml:space="preserve">Domain + email (already purchased)</w:t>
+            <w:tcMar>
+              <w:top w:w="45" w:type="dxa"/>
+              <w:left w:w="110" w:type="dxa"/>
+              <w:bottom w:w="45" w:type="dxa"/>
+              <w:right w:w="110" w:type="dxa"/>
+            </w:tcMar>
+            <w:vAlign w:val="center"/>
+          </w:tcPr>
+          <w:p>
+            <w:pPr>
+              <w:spacing w:line="252" w:lineRule="auto"/>
+            </w:pPr>
+            <w:r>
+              <w:rPr>
+                <w:rFonts w:ascii="Arial" w:hAnsi="Arial" w:cs="Arial"/>
+                <w:color w:val="4B5563"/>
+                <w:sz w:val="17"/>
+                <w:szCs w:val="17"/>
+              </w:rPr>
+              <w:t>Domain + email (already purchased)</w:t>
             </w:r>
           </w:p>
         </w:tc>
@@ -1630,17 +1869,17 @@
           <w:tcPr>
             <w:tcW w:w="2573" w:type="dxa"/>
             <w:shd w:val="clear" w:color="auto" w:fill="EEF2FF"/>
-            <w:vAlign w:val="center"/>
-            <w:tcMar>
-              <w:top w:w="45" w:type="dxa"/>
-              <w:bottom w:w="45" w:type="dxa"/>
-              <w:left w:w="110" w:type="dxa"/>
-              <w:right w:w="110" w:type="dxa"/>
-            </w:tcMar>
-          </w:tcPr>
-          <w:p>
-            <w:pPr>
-              <w:spacing w:before="0" w:after="0" w:line="252" w:lineRule="auto"/>
+            <w:tcMar>
+              <w:top w:w="45" w:type="dxa"/>
+              <w:left w:w="110" w:type="dxa"/>
+              <w:bottom w:w="45" w:type="dxa"/>
+              <w:right w:w="110" w:type="dxa"/>
+            </w:tcMar>
+            <w:vAlign w:val="center"/>
+          </w:tcPr>
+          <w:p>
+            <w:pPr>
+              <w:spacing w:line="252" w:lineRule="auto"/>
               <w:jc w:val="center"/>
             </w:pPr>
             <w:r>
@@ -1650,7 +1889,7 @@
                 <w:sz w:val="17"/>
                 <w:szCs w:val="17"/>
               </w:rPr>
-              <w:t xml:space="preserve">Rs 17,600</w:t>
+              <w:t>Rs 17,600</w:t>
             </w:r>
           </w:p>
         </w:tc>
@@ -1658,17 +1897,17 @@
           <w:tcPr>
             <w:tcW w:w="2573" w:type="dxa"/>
             <w:shd w:val="clear" w:color="auto" w:fill="EEF2FF"/>
-            <w:vAlign w:val="center"/>
-            <w:tcMar>
-              <w:top w:w="45" w:type="dxa"/>
-              <w:bottom w:w="45" w:type="dxa"/>
-              <w:left w:w="110" w:type="dxa"/>
-              <w:right w:w="110" w:type="dxa"/>
-            </w:tcMar>
-          </w:tcPr>
-          <w:p>
-            <w:pPr>
-              <w:spacing w:before="0" w:after="0" w:line="252" w:lineRule="auto"/>
+            <w:tcMar>
+              <w:top w:w="45" w:type="dxa"/>
+              <w:left w:w="110" w:type="dxa"/>
+              <w:bottom w:w="45" w:type="dxa"/>
+              <w:right w:w="110" w:type="dxa"/>
+            </w:tcMar>
+            <w:vAlign w:val="center"/>
+          </w:tcPr>
+          <w:p>
+            <w:pPr>
+              <w:spacing w:line="252" w:lineRule="auto"/>
               <w:jc w:val="center"/>
             </w:pPr>
             <w:r>
@@ -1678,7 +1917,7 @@
                 <w:sz w:val="17"/>
                 <w:szCs w:val="17"/>
               </w:rPr>
-              <w:t xml:space="preserve">Rs 17,600</w:t>
+              <w:t>Rs 17,600</w:t>
             </w:r>
           </w:p>
         </w:tc>
@@ -1686,17 +1925,17 @@
           <w:tcPr>
             <w:tcW w:w="2574" w:type="dxa"/>
             <w:shd w:val="clear" w:color="auto" w:fill="EEF2FF"/>
-            <w:vAlign w:val="center"/>
-            <w:tcMar>
-              <w:top w:w="45" w:type="dxa"/>
-              <w:bottom w:w="45" w:type="dxa"/>
-              <w:left w:w="110" w:type="dxa"/>
-              <w:right w:w="110" w:type="dxa"/>
-            </w:tcMar>
-          </w:tcPr>
-          <w:p>
-            <w:pPr>
-              <w:spacing w:before="0" w:after="0" w:line="252" w:lineRule="auto"/>
+            <w:tcMar>
+              <w:top w:w="45" w:type="dxa"/>
+              <w:left w:w="110" w:type="dxa"/>
+              <w:bottom w:w="45" w:type="dxa"/>
+              <w:right w:w="110" w:type="dxa"/>
+            </w:tcMar>
+            <w:vAlign w:val="center"/>
+          </w:tcPr>
+          <w:p>
+            <w:pPr>
+              <w:spacing w:line="252" w:lineRule="auto"/>
               <w:jc w:val="center"/>
             </w:pPr>
             <w:r>
@@ -1706,7 +1945,7 @@
                 <w:sz w:val="17"/>
                 <w:szCs w:val="17"/>
               </w:rPr>
-              <w:t xml:space="preserve">Rs 17,600</w:t>
+              <w:t>Rs 17,600</w:t>
             </w:r>
           </w:p>
         </w:tc>
@@ -1714,47 +1953,48 @@
       <w:tr>
         <w:trPr>
           <w:cantSplit/>
+          <w:jc w:val="center"/>
         </w:trPr>
         <w:tc>
           <w:tcPr>
             <w:tcW w:w="2360" w:type="dxa"/>
-            <w:vAlign w:val="center"/>
-            <w:tcMar>
-              <w:top w:w="45" w:type="dxa"/>
-              <w:bottom w:w="45" w:type="dxa"/>
-              <w:left w:w="110" w:type="dxa"/>
-              <w:right w:w="110" w:type="dxa"/>
-            </w:tcMar>
-          </w:tcPr>
-          <w:p>
-            <w:pPr>
-              <w:spacing w:before="0" w:after="0" w:line="252" w:lineRule="auto"/>
-            </w:pPr>
-            <w:r>
-              <w:rPr>
-                <w:rFonts w:ascii="Arial" w:hAnsi="Arial" w:cs="Arial"/>
-                <w:color w:val="4B5563"/>
-                <w:sz w:val="17"/>
-                <w:szCs w:val="17"/>
-              </w:rPr>
-              <w:t xml:space="preserve">TOTAL (PKR)</w:t>
+            <w:tcMar>
+              <w:top w:w="45" w:type="dxa"/>
+              <w:left w:w="110" w:type="dxa"/>
+              <w:bottom w:w="45" w:type="dxa"/>
+              <w:right w:w="110" w:type="dxa"/>
+            </w:tcMar>
+            <w:vAlign w:val="center"/>
+          </w:tcPr>
+          <w:p>
+            <w:pPr>
+              <w:spacing w:line="252" w:lineRule="auto"/>
+            </w:pPr>
+            <w:r>
+              <w:rPr>
+                <w:rFonts w:ascii="Arial" w:hAnsi="Arial" w:cs="Arial"/>
+                <w:color w:val="4B5563"/>
+                <w:sz w:val="17"/>
+                <w:szCs w:val="17"/>
+              </w:rPr>
+              <w:t>TOTAL (PKR)</w:t>
             </w:r>
           </w:p>
         </w:tc>
         <w:tc>
           <w:tcPr>
             <w:tcW w:w="2573" w:type="dxa"/>
-            <w:vAlign w:val="center"/>
-            <w:tcMar>
-              <w:top w:w="45" w:type="dxa"/>
-              <w:bottom w:w="45" w:type="dxa"/>
-              <w:left w:w="110" w:type="dxa"/>
-              <w:right w:w="110" w:type="dxa"/>
-            </w:tcMar>
-          </w:tcPr>
-          <w:p>
-            <w:pPr>
-              <w:spacing w:before="0" w:after="0" w:line="252" w:lineRule="auto"/>
+            <w:tcMar>
+              <w:top w:w="45" w:type="dxa"/>
+              <w:left w:w="110" w:type="dxa"/>
+              <w:bottom w:w="45" w:type="dxa"/>
+              <w:right w:w="110" w:type="dxa"/>
+            </w:tcMar>
+            <w:vAlign w:val="center"/>
+          </w:tcPr>
+          <w:p>
+            <w:pPr>
+              <w:spacing w:line="252" w:lineRule="auto"/>
               <w:jc w:val="center"/>
             </w:pPr>
             <w:r>
@@ -1764,24 +2004,24 @@
                 <w:sz w:val="17"/>
                 <w:szCs w:val="17"/>
               </w:rPr>
-              <w:t xml:space="preserve">Rs 132,600</w:t>
+              <w:t>Rs 132,600</w:t>
             </w:r>
           </w:p>
         </w:tc>
         <w:tc>
           <w:tcPr>
             <w:tcW w:w="2573" w:type="dxa"/>
-            <w:vAlign w:val="center"/>
-            <w:tcMar>
-              <w:top w:w="45" w:type="dxa"/>
-              <w:bottom w:w="45" w:type="dxa"/>
-              <w:left w:w="110" w:type="dxa"/>
-              <w:right w:w="110" w:type="dxa"/>
-            </w:tcMar>
-          </w:tcPr>
-          <w:p>
-            <w:pPr>
-              <w:spacing w:before="0" w:after="0" w:line="252" w:lineRule="auto"/>
+            <w:tcMar>
+              <w:top w:w="45" w:type="dxa"/>
+              <w:left w:w="110" w:type="dxa"/>
+              <w:bottom w:w="45" w:type="dxa"/>
+              <w:right w:w="110" w:type="dxa"/>
+            </w:tcMar>
+            <w:vAlign w:val="center"/>
+          </w:tcPr>
+          <w:p>
+            <w:pPr>
+              <w:spacing w:line="252" w:lineRule="auto"/>
               <w:jc w:val="center"/>
             </w:pPr>
             <w:r>
@@ -1791,24 +2031,24 @@
                 <w:sz w:val="17"/>
                 <w:szCs w:val="17"/>
               </w:rPr>
-              <w:t xml:space="preserve">Rs 147,600</w:t>
+              <w:t>Rs 147,600</w:t>
             </w:r>
           </w:p>
         </w:tc>
         <w:tc>
           <w:tcPr>
             <w:tcW w:w="2574" w:type="dxa"/>
-            <w:vAlign w:val="center"/>
-            <w:tcMar>
-              <w:top w:w="45" w:type="dxa"/>
-              <w:bottom w:w="45" w:type="dxa"/>
-              <w:left w:w="110" w:type="dxa"/>
-              <w:right w:w="110" w:type="dxa"/>
-            </w:tcMar>
-          </w:tcPr>
-          <w:p>
-            <w:pPr>
-              <w:spacing w:before="0" w:after="0" w:line="252" w:lineRule="auto"/>
+            <w:tcMar>
+              <w:top w:w="45" w:type="dxa"/>
+              <w:left w:w="110" w:type="dxa"/>
+              <w:bottom w:w="45" w:type="dxa"/>
+              <w:right w:w="110" w:type="dxa"/>
+            </w:tcMar>
+            <w:vAlign w:val="center"/>
+          </w:tcPr>
+          <w:p>
+            <w:pPr>
+              <w:spacing w:line="252" w:lineRule="auto"/>
               <w:jc w:val="center"/>
             </w:pPr>
             <w:r>
@@ -1818,7 +2058,7 @@
                 <w:sz w:val="17"/>
                 <w:szCs w:val="17"/>
               </w:rPr>
-              <w:t xml:space="preserve">Rs 167,600</w:t>
+              <w:t>Rs 167,600</w:t>
             </w:r>
           </w:p>
         </w:tc>
@@ -1826,31 +2066,32 @@
       <w:tr>
         <w:trPr>
           <w:cantSplit/>
+          <w:jc w:val="center"/>
         </w:trPr>
         <w:tc>
           <w:tcPr>
             <w:tcW w:w="2360" w:type="dxa"/>
             <w:shd w:val="clear" w:color="auto" w:fill="EEF2FF"/>
-            <w:vAlign w:val="center"/>
-            <w:tcMar>
-              <w:top w:w="45" w:type="dxa"/>
-              <w:bottom w:w="45" w:type="dxa"/>
-              <w:left w:w="110" w:type="dxa"/>
-              <w:right w:w="110" w:type="dxa"/>
-            </w:tcMar>
-          </w:tcPr>
-          <w:p>
-            <w:pPr>
-              <w:spacing w:before="0" w:after="0" w:line="252" w:lineRule="auto"/>
-            </w:pPr>
-            <w:r>
-              <w:rPr>
-                <w:rFonts w:ascii="Arial" w:hAnsi="Arial" w:cs="Arial"/>
-                <w:color w:val="4B5563"/>
-                <w:sz w:val="17"/>
-                <w:szCs w:val="17"/>
-              </w:rPr>
-              <w:t xml:space="preserve">Approx. total (GBP)*</w:t>
+            <w:tcMar>
+              <w:top w:w="45" w:type="dxa"/>
+              <w:left w:w="110" w:type="dxa"/>
+              <w:bottom w:w="45" w:type="dxa"/>
+              <w:right w:w="110" w:type="dxa"/>
+            </w:tcMar>
+            <w:vAlign w:val="center"/>
+          </w:tcPr>
+          <w:p>
+            <w:pPr>
+              <w:spacing w:line="252" w:lineRule="auto"/>
+            </w:pPr>
+            <w:r>
+              <w:rPr>
+                <w:rFonts w:ascii="Arial" w:hAnsi="Arial" w:cs="Arial"/>
+                <w:color w:val="4B5563"/>
+                <w:sz w:val="17"/>
+                <w:szCs w:val="17"/>
+              </w:rPr>
+              <w:t>Approx. total (GBP)*</w:t>
             </w:r>
           </w:p>
         </w:tc>
@@ -1858,17 +2099,17 @@
           <w:tcPr>
             <w:tcW w:w="2573" w:type="dxa"/>
             <w:shd w:val="clear" w:color="auto" w:fill="EEF2FF"/>
-            <w:vAlign w:val="center"/>
-            <w:tcMar>
-              <w:top w:w="45" w:type="dxa"/>
-              <w:bottom w:w="45" w:type="dxa"/>
-              <w:left w:w="110" w:type="dxa"/>
-              <w:right w:w="110" w:type="dxa"/>
-            </w:tcMar>
-          </w:tcPr>
-          <w:p>
-            <w:pPr>
-              <w:spacing w:before="0" w:after="0" w:line="252" w:lineRule="auto"/>
+            <w:tcMar>
+              <w:top w:w="45" w:type="dxa"/>
+              <w:left w:w="110" w:type="dxa"/>
+              <w:bottom w:w="45" w:type="dxa"/>
+              <w:right w:w="110" w:type="dxa"/>
+            </w:tcMar>
+            <w:vAlign w:val="center"/>
+          </w:tcPr>
+          <w:p>
+            <w:pPr>
+              <w:spacing w:line="252" w:lineRule="auto"/>
               <w:jc w:val="center"/>
             </w:pPr>
             <w:r>
@@ -1878,7 +2119,7 @@
                 <w:sz w:val="17"/>
                 <w:szCs w:val="17"/>
               </w:rPr>
-              <w:t xml:space="preserve">£354</w:t>
+              <w:t>£354</w:t>
             </w:r>
           </w:p>
         </w:tc>
@@ -1886,17 +2127,17 @@
           <w:tcPr>
             <w:tcW w:w="2573" w:type="dxa"/>
             <w:shd w:val="clear" w:color="auto" w:fill="EEF2FF"/>
-            <w:vAlign w:val="center"/>
-            <w:tcMar>
-              <w:top w:w="45" w:type="dxa"/>
-              <w:bottom w:w="45" w:type="dxa"/>
-              <w:left w:w="110" w:type="dxa"/>
-              <w:right w:w="110" w:type="dxa"/>
-            </w:tcMar>
-          </w:tcPr>
-          <w:p>
-            <w:pPr>
-              <w:spacing w:before="0" w:after="0" w:line="252" w:lineRule="auto"/>
+            <w:tcMar>
+              <w:top w:w="45" w:type="dxa"/>
+              <w:left w:w="110" w:type="dxa"/>
+              <w:bottom w:w="45" w:type="dxa"/>
+              <w:right w:w="110" w:type="dxa"/>
+            </w:tcMar>
+            <w:vAlign w:val="center"/>
+          </w:tcPr>
+          <w:p>
+            <w:pPr>
+              <w:spacing w:line="252" w:lineRule="auto"/>
               <w:jc w:val="center"/>
             </w:pPr>
             <w:r>
@@ -1906,7 +2147,7 @@
                 <w:sz w:val="17"/>
                 <w:szCs w:val="17"/>
               </w:rPr>
-              <w:t xml:space="preserve">£394</w:t>
+              <w:t>£394</w:t>
             </w:r>
           </w:p>
         </w:tc>
@@ -1914,17 +2155,17 @@
           <w:tcPr>
             <w:tcW w:w="2574" w:type="dxa"/>
             <w:shd w:val="clear" w:color="auto" w:fill="EEF2FF"/>
-            <w:vAlign w:val="center"/>
-            <w:tcMar>
-              <w:top w:w="45" w:type="dxa"/>
-              <w:bottom w:w="45" w:type="dxa"/>
-              <w:left w:w="110" w:type="dxa"/>
-              <w:right w:w="110" w:type="dxa"/>
-            </w:tcMar>
-          </w:tcPr>
-          <w:p>
-            <w:pPr>
-              <w:spacing w:before="0" w:after="0" w:line="252" w:lineRule="auto"/>
+            <w:tcMar>
+              <w:top w:w="45" w:type="dxa"/>
+              <w:left w:w="110" w:type="dxa"/>
+              <w:bottom w:w="45" w:type="dxa"/>
+              <w:right w:w="110" w:type="dxa"/>
+            </w:tcMar>
+            <w:vAlign w:val="center"/>
+          </w:tcPr>
+          <w:p>
+            <w:pPr>
+              <w:spacing w:line="252" w:lineRule="auto"/>
               <w:jc w:val="center"/>
             </w:pPr>
             <w:r>
@@ -1934,7 +2175,7 @@
                 <w:sz w:val="17"/>
                 <w:szCs w:val="17"/>
               </w:rPr>
-              <w:t xml:space="preserve">£447</w:t>
+              <w:t>£447</w:t>
             </w:r>
           </w:p>
         </w:tc>
@@ -1942,14 +2183,13 @@
     </w:tbl>
     <w:p>
       <w:pPr>
-        <w:spacing w:before="0" w:after="0" w:line="200" w:lineRule="auto"/>
+        <w:spacing w:line="200" w:lineRule="auto"/>
       </w:pPr>
     </w:p>
     <w:p>
       <w:pPr>
-        <w:spacing w:before="0" w:after="120" w:line="259" w:lineRule="auto"/>
-      </w:pPr>
-      <w:r>
+        <w:spacing w:after="120" w:line="259" w:lineRule="auto"/>
+        <w:jc w:val="center"/>
         <w:rPr>
           <w:rFonts w:ascii="Arial" w:hAnsi="Arial" w:cs="Arial"/>
           <w:i/>
@@ -1957,8 +2197,23 @@
           <w:sz w:val="16"/>
           <w:szCs w:val="16"/>
         </w:rPr>
-        <w:t xml:space="preserve">* GBP shown for convenience at approximately Rs 375 = £1. The PKR amount is the binding price.</w:t>
-      </w:r>
+      </w:pPr>
+      <w:r>
+        <w:rPr>
+          <w:rFonts w:ascii="Arial" w:hAnsi="Arial" w:cs="Arial"/>
+          <w:i/>
+          <w:color w:val="4B5563"/>
+          <w:sz w:val="16"/>
+          <w:szCs w:val="16"/>
+        </w:rPr>
+        <w:t>* GBP shown for convenience at approximately Rs 375 = £1. The PKR amount is the binding price.</w:t>
+      </w:r>
+    </w:p>
+    <w:p>
+      <w:pPr>
+        <w:spacing w:after="120" w:line="259" w:lineRule="auto"/>
+        <w:jc w:val="center"/>
+      </w:pPr>
     </w:p>
     <w:p>
       <w:pPr>
@@ -1973,7 +2228,7 @@
           <w:sz w:val="21"/>
           <w:szCs w:val="21"/>
         </w:rPr>
-        <w:t xml:space="preserve">What each package gives KCG</w:t>
+        <w:t>What each package gives KCG</w:t>
       </w:r>
     </w:p>
     <w:p>
@@ -1982,7 +2237,7 @@
           <w:ilvl w:val="0"/>
           <w:numId w:val="1"/>
         </w:numPr>
-        <w:spacing w:before="0" w:after="40" w:line="259" w:lineRule="auto"/>
+        <w:spacing w:after="40" w:line="259" w:lineRule="auto"/>
         <w:ind w:left="360" w:hanging="260"/>
       </w:pPr>
       <w:r>
@@ -1993,7 +2248,27 @@
           <w:sz w:val="19"/>
           <w:szCs w:val="19"/>
         </w:rPr>
-        <w:t xml:space="preserve">Package 1 — Website:</w:t>
+        <w:t xml:space="preserve">Package 1 </w:t>
+      </w:r>
+      <w:r>
+        <w:rPr>
+          <w:rFonts w:ascii="Arial" w:hAnsi="Arial" w:cs="Arial"/>
+          <w:b/>
+          <w:color w:val="0A1F44"/>
+          <w:sz w:val="19"/>
+          <w:szCs w:val="19"/>
+        </w:rPr>
+        <w:t xml:space="preserve">- </w:t>
+      </w:r>
+      <w:r>
+        <w:rPr>
+          <w:rFonts w:ascii="Arial" w:hAnsi="Arial" w:cs="Arial"/>
+          <w:b/>
+          <w:color w:val="0A1F44"/>
+          <w:sz w:val="19"/>
+          <w:szCs w:val="19"/>
+        </w:rPr>
+        <w:t>Website:</w:t>
       </w:r>
       <w:r>
         <w:rPr>
@@ -2011,7 +2286,7 @@
           <w:ilvl w:val="0"/>
           <w:numId w:val="1"/>
         </w:numPr>
-        <w:spacing w:before="0" w:after="40" w:line="259" w:lineRule="auto"/>
+        <w:spacing w:after="40" w:line="259" w:lineRule="auto"/>
         <w:ind w:left="360" w:hanging="260"/>
       </w:pPr>
       <w:r>
@@ -2022,16 +2297,7 @@
           <w:sz w:val="19"/>
           <w:szCs w:val="19"/>
         </w:rPr>
-        <w:t xml:space="preserve">Package 2 — Website + SEO (recommended):</w:t>
-      </w:r>
-      <w:r>
-        <w:rPr>
-          <w:rFonts w:ascii="Arial" w:hAnsi="Arial" w:cs="Arial"/>
-          <w:color w:val="4B5563"/>
-          <w:sz w:val="19"/>
-          <w:szCs w:val="19"/>
-        </w:rPr>
-        <w:t xml:space="preserve"> everything in Package 1, plus search-engine optimisation so KCG appears on </w:t>
+        <w:t xml:space="preserve">Package 2 </w:t>
       </w:r>
       <w:r>
         <w:rPr>
@@ -2041,7 +2307,36 @@
           <w:sz w:val="19"/>
           <w:szCs w:val="19"/>
         </w:rPr>
-        <w:t xml:space="preserve">Google Search and Google Maps</w:t>
+        <w:t>-</w:t>
+      </w:r>
+      <w:r>
+        <w:rPr>
+          <w:rFonts w:ascii="Arial" w:hAnsi="Arial" w:cs="Arial"/>
+          <w:b/>
+          <w:color w:val="0A1F44"/>
+          <w:sz w:val="19"/>
+          <w:szCs w:val="19"/>
+        </w:rPr>
+        <w:t xml:space="preserve"> Website + SEO (recommended):</w:t>
+      </w:r>
+      <w:r>
+        <w:rPr>
+          <w:rFonts w:ascii="Arial" w:hAnsi="Arial" w:cs="Arial"/>
+          <w:color w:val="4B5563"/>
+          <w:sz w:val="19"/>
+          <w:szCs w:val="19"/>
+        </w:rPr>
+        <w:t xml:space="preserve"> everything in Package 1, plus search-engine optimisation so KCG appears on </w:t>
+      </w:r>
+      <w:r>
+        <w:rPr>
+          <w:rFonts w:ascii="Arial" w:hAnsi="Arial" w:cs="Arial"/>
+          <w:b/>
+          <w:color w:val="0A1F44"/>
+          <w:sz w:val="19"/>
+          <w:szCs w:val="19"/>
+        </w:rPr>
+        <w:t>Google Search and Google Maps</w:t>
       </w:r>
       <w:r>
         <w:rPr>
@@ -2059,7 +2354,7 @@
           <w:ilvl w:val="0"/>
           <w:numId w:val="1"/>
         </w:numPr>
-        <w:spacing w:before="0" w:after="40" w:line="259" w:lineRule="auto"/>
+        <w:spacing w:after="40" w:line="259" w:lineRule="auto"/>
         <w:ind w:left="360" w:hanging="260"/>
       </w:pPr>
       <w:r>
@@ -2070,16 +2365,7 @@
           <w:sz w:val="19"/>
           <w:szCs w:val="19"/>
         </w:rPr>
-        <w:t xml:space="preserve">Package 3 — Complete Care:</w:t>
-      </w:r>
-      <w:r>
-        <w:rPr>
-          <w:rFonts w:ascii="Arial" w:hAnsi="Arial" w:cs="Arial"/>
-          <w:color w:val="4B5563"/>
-          <w:sz w:val="19"/>
-          <w:szCs w:val="19"/>
-        </w:rPr>
-        <w:t xml:space="preserve"> everything in Package 2, plus </w:t>
+        <w:t xml:space="preserve">Package 3 </w:t>
       </w:r>
       <w:r>
         <w:rPr>
@@ -2089,7 +2375,17 @@
           <w:sz w:val="19"/>
           <w:szCs w:val="19"/>
         </w:rPr>
-        <w:t xml:space="preserve">12 months of maintenance</w:t>
+        <w:t xml:space="preserve">- </w:t>
+      </w:r>
+      <w:r>
+        <w:rPr>
+          <w:rFonts w:ascii="Arial" w:hAnsi="Arial" w:cs="Arial"/>
+          <w:b/>
+          <w:color w:val="0A1F44"/>
+          <w:sz w:val="19"/>
+          <w:szCs w:val="19"/>
+        </w:rPr>
+        <w:t>Complete Care:</w:t>
       </w:r>
       <w:r>
         <w:rPr>
@@ -2098,8 +2394,46 @@
           <w:sz w:val="19"/>
           <w:szCs w:val="19"/>
         </w:rPr>
-        <w:t xml:space="preserve">: adding new videos, design changes, security updates, backups, fixes and admin support — worth over Rs 20,000 per year on its own.</w:t>
-      </w:r>
+        <w:t xml:space="preserve"> everything in Package 2, plus </w:t>
+      </w:r>
+      <w:r>
+        <w:rPr>
+          <w:rFonts w:ascii="Arial" w:hAnsi="Arial" w:cs="Arial"/>
+          <w:b/>
+          <w:color w:val="0A1F44"/>
+          <w:sz w:val="19"/>
+          <w:szCs w:val="19"/>
+        </w:rPr>
+        <w:t>12 months of maintenance</w:t>
+      </w:r>
+      <w:r>
+        <w:rPr>
+          <w:rFonts w:ascii="Arial" w:hAnsi="Arial" w:cs="Arial"/>
+          <w:color w:val="4B5563"/>
+          <w:sz w:val="19"/>
+          <w:szCs w:val="19"/>
+        </w:rPr>
+        <w:t>: adding new videos, design changes, security updates, backups, fixes and admin support — worth over Rs 20,000 per year on its own.</w:t>
+      </w:r>
+    </w:p>
+    <w:p>
+      <w:pPr>
+        <w:spacing w:after="40" w:line="259" w:lineRule="auto"/>
+        <w:ind w:left="360"/>
+        <w:rPr>
+          <w:rFonts w:ascii="Arial" w:hAnsi="Arial" w:cs="Arial"/>
+          <w:b/>
+          <w:color w:val="0A1F44"/>
+          <w:sz w:val="19"/>
+          <w:szCs w:val="19"/>
+        </w:rPr>
+      </w:pPr>
+    </w:p>
+    <w:p>
+      <w:pPr>
+        <w:spacing w:after="40" w:line="259" w:lineRule="auto"/>
+        <w:ind w:left="360"/>
+      </w:pPr>
     </w:p>
     <w:p>
       <w:pPr>
@@ -2117,7 +2451,27 @@
           <w:sz w:val="22"/>
           <w:szCs w:val="22"/>
         </w:rPr>
-        <w:t xml:space="preserve">4. WHY DATIX AI — COMPARED TO TYPICAL WEBSITES</w:t>
+        <w:t xml:space="preserve">4. WHY DATIX AI </w:t>
+      </w:r>
+      <w:r>
+        <w:rPr>
+          <w:rFonts w:ascii="Arial" w:hAnsi="Arial" w:cs="Arial"/>
+          <w:b/>
+          <w:color w:val="0A1F44"/>
+          <w:sz w:val="22"/>
+          <w:szCs w:val="22"/>
+        </w:rPr>
+        <w:t>-</w:t>
+      </w:r>
+      <w:r>
+        <w:rPr>
+          <w:rFonts w:ascii="Arial" w:hAnsi="Arial" w:cs="Arial"/>
+          <w:b/>
+          <w:color w:val="0A1F44"/>
+          <w:sz w:val="22"/>
+          <w:szCs w:val="22"/>
+        </w:rPr>
+        <w:t xml:space="preserve"> COMPARED TO TYPICAL WEBSITES</w:t>
       </w:r>
     </w:p>
     <w:tbl>
@@ -2133,6 +2487,7 @@
           <w:insideV w:val="single" w:sz="4" w:space="0" w:color="D1D5DB"/>
         </w:tblBorders>
         <w:tblLayout w:type="fixed"/>
+        <w:tblLook w:val="04A0" w:firstRow="1" w:lastRow="0" w:firstColumn="1" w:lastColumn="0" w:noHBand="0" w:noVBand="1"/>
       </w:tblPr>
       <w:tblGrid>
         <w:gridCol w:w="3360"/>
@@ -2143,22 +2498,41 @@
         <w:trPr>
           <w:cantSplit/>
           <w:tblHeader/>
+          <w:jc w:val="center"/>
         </w:trPr>
         <w:tc>
           <w:tcPr>
             <w:tcW w:w="3360" w:type="dxa"/>
             <w:shd w:val="clear" w:color="auto" w:fill="0A1F44"/>
-            <w:vAlign w:val="center"/>
-            <w:tcMar>
-              <w:top w:w="45" w:type="dxa"/>
-              <w:bottom w:w="45" w:type="dxa"/>
-              <w:left w:w="110" w:type="dxa"/>
-              <w:right w:w="110" w:type="dxa"/>
-            </w:tcMar>
-          </w:tcPr>
-          <w:p>
-            <w:pPr>
-              <w:spacing w:before="0" w:after="0" w:line="252" w:lineRule="auto"/>
+            <w:tcMar>
+              <w:top w:w="45" w:type="dxa"/>
+              <w:left w:w="110" w:type="dxa"/>
+              <w:bottom w:w="45" w:type="dxa"/>
+              <w:right w:w="110" w:type="dxa"/>
+            </w:tcMar>
+            <w:vAlign w:val="center"/>
+          </w:tcPr>
+          <w:p>
+            <w:pPr>
+              <w:spacing w:line="252" w:lineRule="auto"/>
+            </w:pPr>
+          </w:p>
+        </w:tc>
+        <w:tc>
+          <w:tcPr>
+            <w:tcW w:w="3360" w:type="dxa"/>
+            <w:shd w:val="clear" w:color="auto" w:fill="0A1F44"/>
+            <w:tcMar>
+              <w:top w:w="45" w:type="dxa"/>
+              <w:left w:w="110" w:type="dxa"/>
+              <w:bottom w:w="45" w:type="dxa"/>
+              <w:right w:w="110" w:type="dxa"/>
+            </w:tcMar>
+            <w:vAlign w:val="center"/>
+          </w:tcPr>
+          <w:p>
+            <w:pPr>
+              <w:spacing w:line="252" w:lineRule="auto"/>
             </w:pPr>
             <w:r>
               <w:rPr>
@@ -2168,7 +2542,7 @@
                 <w:sz w:val="17"/>
                 <w:szCs w:val="17"/>
               </w:rPr>
-              <w:t xml:space="preserve"/>
+              <w:t>Typical template website</w:t>
             </w:r>
           </w:p>
         </w:tc>
@@ -2176,17 +2550,17 @@
           <w:tcPr>
             <w:tcW w:w="3360" w:type="dxa"/>
             <w:shd w:val="clear" w:color="auto" w:fill="0A1F44"/>
-            <w:vAlign w:val="center"/>
-            <w:tcMar>
-              <w:top w:w="45" w:type="dxa"/>
-              <w:bottom w:w="45" w:type="dxa"/>
-              <w:left w:w="110" w:type="dxa"/>
-              <w:right w:w="110" w:type="dxa"/>
-            </w:tcMar>
-          </w:tcPr>
-          <w:p>
-            <w:pPr>
-              <w:spacing w:before="0" w:after="0" w:line="252" w:lineRule="auto"/>
+            <w:tcMar>
+              <w:top w:w="45" w:type="dxa"/>
+              <w:left w:w="110" w:type="dxa"/>
+              <w:bottom w:w="45" w:type="dxa"/>
+              <w:right w:w="110" w:type="dxa"/>
+            </w:tcMar>
+            <w:vAlign w:val="center"/>
+          </w:tcPr>
+          <w:p>
+            <w:pPr>
+              <w:spacing w:line="252" w:lineRule="auto"/>
             </w:pPr>
             <w:r>
               <w:rPr>
@@ -2196,35 +2570,7 @@
                 <w:sz w:val="17"/>
                 <w:szCs w:val="17"/>
               </w:rPr>
-              <w:t xml:space="preserve">Typical template website</w:t>
-            </w:r>
-          </w:p>
-        </w:tc>
-        <w:tc>
-          <w:tcPr>
-            <w:tcW w:w="3360" w:type="dxa"/>
-            <w:shd w:val="clear" w:color="auto" w:fill="0A1F44"/>
-            <w:vAlign w:val="center"/>
-            <w:tcMar>
-              <w:top w:w="45" w:type="dxa"/>
-              <w:bottom w:w="45" w:type="dxa"/>
-              <w:left w:w="110" w:type="dxa"/>
-              <w:right w:w="110" w:type="dxa"/>
-            </w:tcMar>
-          </w:tcPr>
-          <w:p>
-            <w:pPr>
-              <w:spacing w:before="0" w:after="0" w:line="252" w:lineRule="auto"/>
-            </w:pPr>
-            <w:r>
-              <w:rPr>
-                <w:rFonts w:ascii="Arial" w:hAnsi="Arial" w:cs="Arial"/>
-                <w:b/>
-                <w:color w:val="FFFFFF"/>
-                <w:sz w:val="17"/>
-                <w:szCs w:val="17"/>
-              </w:rPr>
-              <w:t xml:space="preserve">Datix AI — KCG website</w:t>
+              <w:t>Datix AI — KCG website</w:t>
             </w:r>
           </w:p>
         </w:tc>
@@ -2232,82 +2578,83 @@
       <w:tr>
         <w:trPr>
           <w:cantSplit/>
+          <w:jc w:val="center"/>
         </w:trPr>
         <w:tc>
           <w:tcPr>
             <w:tcW w:w="3360" w:type="dxa"/>
-            <w:vAlign w:val="center"/>
-            <w:tcMar>
-              <w:top w:w="45" w:type="dxa"/>
-              <w:bottom w:w="45" w:type="dxa"/>
-              <w:left w:w="110" w:type="dxa"/>
-              <w:right w:w="110" w:type="dxa"/>
-            </w:tcMar>
-          </w:tcPr>
-          <w:p>
-            <w:pPr>
-              <w:spacing w:before="0" w:after="0" w:line="252" w:lineRule="auto"/>
-            </w:pPr>
-            <w:r>
-              <w:rPr>
-                <w:rFonts w:ascii="Arial" w:hAnsi="Arial" w:cs="Arial"/>
-                <w:color w:val="4B5563"/>
-                <w:sz w:val="17"/>
-                <w:szCs w:val="17"/>
-              </w:rPr>
-              <w:t xml:space="preserve">Updating content</w:t>
+            <w:tcMar>
+              <w:top w:w="45" w:type="dxa"/>
+              <w:left w:w="110" w:type="dxa"/>
+              <w:bottom w:w="45" w:type="dxa"/>
+              <w:right w:w="110" w:type="dxa"/>
+            </w:tcMar>
+            <w:vAlign w:val="center"/>
+          </w:tcPr>
+          <w:p>
+            <w:pPr>
+              <w:spacing w:line="252" w:lineRule="auto"/>
+            </w:pPr>
+            <w:r>
+              <w:rPr>
+                <w:rFonts w:ascii="Arial" w:hAnsi="Arial" w:cs="Arial"/>
+                <w:color w:val="4B5563"/>
+                <w:sz w:val="17"/>
+                <w:szCs w:val="17"/>
+              </w:rPr>
+              <w:t>Updating content</w:t>
             </w:r>
           </w:p>
         </w:tc>
         <w:tc>
           <w:tcPr>
             <w:tcW w:w="3360" w:type="dxa"/>
-            <w:vAlign w:val="center"/>
-            <w:tcMar>
-              <w:top w:w="45" w:type="dxa"/>
-              <w:bottom w:w="45" w:type="dxa"/>
-              <w:left w:w="110" w:type="dxa"/>
-              <w:right w:w="110" w:type="dxa"/>
-            </w:tcMar>
-          </w:tcPr>
-          <w:p>
-            <w:pPr>
-              <w:spacing w:before="0" w:after="0" w:line="252" w:lineRule="auto"/>
-            </w:pPr>
-            <w:r>
-              <w:rPr>
-                <w:rFonts w:ascii="Arial" w:hAnsi="Arial" w:cs="Arial"/>
-                <w:color w:val="4B5563"/>
-                <w:sz w:val="17"/>
-                <w:szCs w:val="17"/>
-              </w:rPr>
-              <w:t xml:space="preserve">Static — every change needs the developer</w:t>
+            <w:tcMar>
+              <w:top w:w="45" w:type="dxa"/>
+              <w:left w:w="110" w:type="dxa"/>
+              <w:bottom w:w="45" w:type="dxa"/>
+              <w:right w:w="110" w:type="dxa"/>
+            </w:tcMar>
+            <w:vAlign w:val="center"/>
+          </w:tcPr>
+          <w:p>
+            <w:pPr>
+              <w:spacing w:line="252" w:lineRule="auto"/>
+            </w:pPr>
+            <w:r>
+              <w:rPr>
+                <w:rFonts w:ascii="Arial" w:hAnsi="Arial" w:cs="Arial"/>
+                <w:color w:val="4B5563"/>
+                <w:sz w:val="17"/>
+                <w:szCs w:val="17"/>
+              </w:rPr>
+              <w:t>Static every change needs the developer</w:t>
             </w:r>
           </w:p>
         </w:tc>
         <w:tc>
           <w:tcPr>
             <w:tcW w:w="3360" w:type="dxa"/>
-            <w:vAlign w:val="center"/>
-            <w:tcMar>
-              <w:top w:w="45" w:type="dxa"/>
-              <w:bottom w:w="45" w:type="dxa"/>
-              <w:left w:w="110" w:type="dxa"/>
-              <w:right w:w="110" w:type="dxa"/>
-            </w:tcMar>
-          </w:tcPr>
-          <w:p>
-            <w:pPr>
-              <w:spacing w:before="0" w:after="0" w:line="252" w:lineRule="auto"/>
-            </w:pPr>
-            <w:r>
-              <w:rPr>
-                <w:rFonts w:ascii="Arial" w:hAnsi="Arial" w:cs="Arial"/>
-                <w:color w:val="4B5563"/>
-                <w:sz w:val="17"/>
-                <w:szCs w:val="17"/>
-              </w:rPr>
-              <w:t xml:space="preserve">Admin Panel — KCG edits anything, anytime</w:t>
+            <w:tcMar>
+              <w:top w:w="45" w:type="dxa"/>
+              <w:left w:w="110" w:type="dxa"/>
+              <w:bottom w:w="45" w:type="dxa"/>
+              <w:right w:w="110" w:type="dxa"/>
+            </w:tcMar>
+            <w:vAlign w:val="center"/>
+          </w:tcPr>
+          <w:p>
+            <w:pPr>
+              <w:spacing w:line="252" w:lineRule="auto"/>
+            </w:pPr>
+            <w:r>
+              <w:rPr>
+                <w:rFonts w:ascii="Arial" w:hAnsi="Arial" w:cs="Arial"/>
+                <w:color w:val="4B5563"/>
+                <w:sz w:val="17"/>
+                <w:szCs w:val="17"/>
+              </w:rPr>
+              <w:t>Admin Panel KCG edits anything, anytime</w:t>
             </w:r>
           </w:p>
         </w:tc>
@@ -2315,31 +2662,32 @@
       <w:tr>
         <w:trPr>
           <w:cantSplit/>
+          <w:jc w:val="center"/>
         </w:trPr>
         <w:tc>
           <w:tcPr>
             <w:tcW w:w="3360" w:type="dxa"/>
             <w:shd w:val="clear" w:color="auto" w:fill="EEF2FF"/>
-            <w:vAlign w:val="center"/>
-            <w:tcMar>
-              <w:top w:w="45" w:type="dxa"/>
-              <w:bottom w:w="45" w:type="dxa"/>
-              <w:left w:w="110" w:type="dxa"/>
-              <w:right w:w="110" w:type="dxa"/>
-            </w:tcMar>
-          </w:tcPr>
-          <w:p>
-            <w:pPr>
-              <w:spacing w:before="0" w:after="0" w:line="252" w:lineRule="auto"/>
-            </w:pPr>
-            <w:r>
-              <w:rPr>
-                <w:rFonts w:ascii="Arial" w:hAnsi="Arial" w:cs="Arial"/>
-                <w:color w:val="4B5563"/>
-                <w:sz w:val="17"/>
-                <w:szCs w:val="17"/>
-              </w:rPr>
-              <w:t xml:space="preserve">Design</w:t>
+            <w:tcMar>
+              <w:top w:w="45" w:type="dxa"/>
+              <w:left w:w="110" w:type="dxa"/>
+              <w:bottom w:w="45" w:type="dxa"/>
+              <w:right w:w="110" w:type="dxa"/>
+            </w:tcMar>
+            <w:vAlign w:val="center"/>
+          </w:tcPr>
+          <w:p>
+            <w:pPr>
+              <w:spacing w:line="252" w:lineRule="auto"/>
+            </w:pPr>
+            <w:r>
+              <w:rPr>
+                <w:rFonts w:ascii="Arial" w:hAnsi="Arial" w:cs="Arial"/>
+                <w:color w:val="4B5563"/>
+                <w:sz w:val="17"/>
+                <w:szCs w:val="17"/>
+              </w:rPr>
+              <w:t>Design</w:t>
             </w:r>
           </w:p>
         </w:tc>
@@ -2347,26 +2695,26 @@
           <w:tcPr>
             <w:tcW w:w="3360" w:type="dxa"/>
             <w:shd w:val="clear" w:color="auto" w:fill="EEF2FF"/>
-            <w:vAlign w:val="center"/>
-            <w:tcMar>
-              <w:top w:w="45" w:type="dxa"/>
-              <w:bottom w:w="45" w:type="dxa"/>
-              <w:left w:w="110" w:type="dxa"/>
-              <w:right w:w="110" w:type="dxa"/>
-            </w:tcMar>
-          </w:tcPr>
-          <w:p>
-            <w:pPr>
-              <w:spacing w:before="0" w:after="0" w:line="252" w:lineRule="auto"/>
-            </w:pPr>
-            <w:r>
-              <w:rPr>
-                <w:rFonts w:ascii="Arial" w:hAnsi="Arial" w:cs="Arial"/>
-                <w:color w:val="4B5563"/>
-                <w:sz w:val="17"/>
-                <w:szCs w:val="17"/>
-              </w:rPr>
-              <w:t xml:space="preserve">Generic template shared by many</w:t>
+            <w:tcMar>
+              <w:top w:w="45" w:type="dxa"/>
+              <w:left w:w="110" w:type="dxa"/>
+              <w:bottom w:w="45" w:type="dxa"/>
+              <w:right w:w="110" w:type="dxa"/>
+            </w:tcMar>
+            <w:vAlign w:val="center"/>
+          </w:tcPr>
+          <w:p>
+            <w:pPr>
+              <w:spacing w:line="252" w:lineRule="auto"/>
+            </w:pPr>
+            <w:r>
+              <w:rPr>
+                <w:rFonts w:ascii="Arial" w:hAnsi="Arial" w:cs="Arial"/>
+                <w:color w:val="4B5563"/>
+                <w:sz w:val="17"/>
+                <w:szCs w:val="17"/>
+              </w:rPr>
+              <w:t>Generic template shared by many</w:t>
             </w:r>
           </w:p>
         </w:tc>
@@ -2374,26 +2722,26 @@
           <w:tcPr>
             <w:tcW w:w="3360" w:type="dxa"/>
             <w:shd w:val="clear" w:color="auto" w:fill="EEF2FF"/>
-            <w:vAlign w:val="center"/>
-            <w:tcMar>
-              <w:top w:w="45" w:type="dxa"/>
-              <w:bottom w:w="45" w:type="dxa"/>
-              <w:left w:w="110" w:type="dxa"/>
-              <w:right w:w="110" w:type="dxa"/>
-            </w:tcMar>
-          </w:tcPr>
-          <w:p>
-            <w:pPr>
-              <w:spacing w:before="0" w:after="0" w:line="252" w:lineRule="auto"/>
-            </w:pPr>
-            <w:r>
-              <w:rPr>
-                <w:rFonts w:ascii="Arial" w:hAnsi="Arial" w:cs="Arial"/>
-                <w:color w:val="4B5563"/>
-                <w:sz w:val="17"/>
-                <w:szCs w:val="17"/>
-              </w:rPr>
-              <w:t xml:space="preserve">Custom design in KCG’s own brand</w:t>
+            <w:tcMar>
+              <w:top w:w="45" w:type="dxa"/>
+              <w:left w:w="110" w:type="dxa"/>
+              <w:bottom w:w="45" w:type="dxa"/>
+              <w:right w:w="110" w:type="dxa"/>
+            </w:tcMar>
+            <w:vAlign w:val="center"/>
+          </w:tcPr>
+          <w:p>
+            <w:pPr>
+              <w:spacing w:line="252" w:lineRule="auto"/>
+            </w:pPr>
+            <w:r>
+              <w:rPr>
+                <w:rFonts w:ascii="Arial" w:hAnsi="Arial" w:cs="Arial"/>
+                <w:color w:val="4B5563"/>
+                <w:sz w:val="17"/>
+                <w:szCs w:val="17"/>
+              </w:rPr>
+              <w:t>Custom design in KCG’s own brand</w:t>
             </w:r>
           </w:p>
         </w:tc>
@@ -2401,82 +2749,83 @@
       <w:tr>
         <w:trPr>
           <w:cantSplit/>
+          <w:jc w:val="center"/>
         </w:trPr>
         <w:tc>
           <w:tcPr>
             <w:tcW w:w="3360" w:type="dxa"/>
-            <w:vAlign w:val="center"/>
-            <w:tcMar>
-              <w:top w:w="45" w:type="dxa"/>
-              <w:bottom w:w="45" w:type="dxa"/>
-              <w:left w:w="110" w:type="dxa"/>
-              <w:right w:w="110" w:type="dxa"/>
-            </w:tcMar>
-          </w:tcPr>
-          <w:p>
-            <w:pPr>
-              <w:spacing w:before="0" w:after="0" w:line="252" w:lineRule="auto"/>
-            </w:pPr>
-            <w:r>
-              <w:rPr>
-                <w:rFonts w:ascii="Arial" w:hAnsi="Arial" w:cs="Arial"/>
-                <w:color w:val="4B5563"/>
-                <w:sz w:val="17"/>
-                <w:szCs w:val="17"/>
-              </w:rPr>
-              <w:t xml:space="preserve">Media</w:t>
+            <w:tcMar>
+              <w:top w:w="45" w:type="dxa"/>
+              <w:left w:w="110" w:type="dxa"/>
+              <w:bottom w:w="45" w:type="dxa"/>
+              <w:right w:w="110" w:type="dxa"/>
+            </w:tcMar>
+            <w:vAlign w:val="center"/>
+          </w:tcPr>
+          <w:p>
+            <w:pPr>
+              <w:spacing w:line="252" w:lineRule="auto"/>
+            </w:pPr>
+            <w:r>
+              <w:rPr>
+                <w:rFonts w:ascii="Arial" w:hAnsi="Arial" w:cs="Arial"/>
+                <w:color w:val="4B5563"/>
+                <w:sz w:val="17"/>
+                <w:szCs w:val="17"/>
+              </w:rPr>
+              <w:t>Media</w:t>
             </w:r>
           </w:p>
         </w:tc>
         <w:tc>
           <w:tcPr>
             <w:tcW w:w="3360" w:type="dxa"/>
-            <w:vAlign w:val="center"/>
-            <w:tcMar>
-              <w:top w:w="45" w:type="dxa"/>
-              <w:bottom w:w="45" w:type="dxa"/>
-              <w:left w:w="110" w:type="dxa"/>
-              <w:right w:w="110" w:type="dxa"/>
-            </w:tcMar>
-          </w:tcPr>
-          <w:p>
-            <w:pPr>
-              <w:spacing w:before="0" w:after="0" w:line="252" w:lineRule="auto"/>
-            </w:pPr>
-            <w:r>
-              <w:rPr>
-                <w:rFonts w:ascii="Arial" w:hAnsi="Arial" w:cs="Arial"/>
-                <w:color w:val="4B5563"/>
-                <w:sz w:val="17"/>
-                <w:szCs w:val="17"/>
-              </w:rPr>
-              <w:t xml:space="preserve">Stock photos</w:t>
+            <w:tcMar>
+              <w:top w:w="45" w:type="dxa"/>
+              <w:left w:w="110" w:type="dxa"/>
+              <w:bottom w:w="45" w:type="dxa"/>
+              <w:right w:w="110" w:type="dxa"/>
+            </w:tcMar>
+            <w:vAlign w:val="center"/>
+          </w:tcPr>
+          <w:p>
+            <w:pPr>
+              <w:spacing w:line="252" w:lineRule="auto"/>
+            </w:pPr>
+            <w:r>
+              <w:rPr>
+                <w:rFonts w:ascii="Arial" w:hAnsi="Arial" w:cs="Arial"/>
+                <w:color w:val="4B5563"/>
+                <w:sz w:val="17"/>
+                <w:szCs w:val="17"/>
+              </w:rPr>
+              <w:t>Stock photos</w:t>
             </w:r>
           </w:p>
         </w:tc>
         <w:tc>
           <w:tcPr>
             <w:tcW w:w="3360" w:type="dxa"/>
-            <w:vAlign w:val="center"/>
-            <w:tcMar>
-              <w:top w:w="45" w:type="dxa"/>
-              <w:bottom w:w="45" w:type="dxa"/>
-              <w:left w:w="110" w:type="dxa"/>
-              <w:right w:w="110" w:type="dxa"/>
-            </w:tcMar>
-          </w:tcPr>
-          <w:p>
-            <w:pPr>
-              <w:spacing w:before="0" w:after="0" w:line="252" w:lineRule="auto"/>
-            </w:pPr>
-            <w:r>
-              <w:rPr>
-                <w:rFonts w:ascii="Arial" w:hAnsi="Arial" w:cs="Arial"/>
-                <w:color w:val="4B5563"/>
-                <w:sz w:val="17"/>
-                <w:szCs w:val="17"/>
-              </w:rPr>
-              <w:t xml:space="preserve">KCG’s own drone videos and site photos</w:t>
+            <w:tcMar>
+              <w:top w:w="45" w:type="dxa"/>
+              <w:left w:w="110" w:type="dxa"/>
+              <w:bottom w:w="45" w:type="dxa"/>
+              <w:right w:w="110" w:type="dxa"/>
+            </w:tcMar>
+            <w:vAlign w:val="center"/>
+          </w:tcPr>
+          <w:p>
+            <w:pPr>
+              <w:spacing w:line="252" w:lineRule="auto"/>
+            </w:pPr>
+            <w:r>
+              <w:rPr>
+                <w:rFonts w:ascii="Arial" w:hAnsi="Arial" w:cs="Arial"/>
+                <w:color w:val="4B5563"/>
+                <w:sz w:val="17"/>
+                <w:szCs w:val="17"/>
+              </w:rPr>
+              <w:t>KCG’s own drone videos and site photos</w:t>
             </w:r>
           </w:p>
         </w:tc>
@@ -2484,31 +2833,32 @@
       <w:tr>
         <w:trPr>
           <w:cantSplit/>
+          <w:jc w:val="center"/>
         </w:trPr>
         <w:tc>
           <w:tcPr>
             <w:tcW w:w="3360" w:type="dxa"/>
             <w:shd w:val="clear" w:color="auto" w:fill="EEF2FF"/>
-            <w:vAlign w:val="center"/>
-            <w:tcMar>
-              <w:top w:w="45" w:type="dxa"/>
-              <w:bottom w:w="45" w:type="dxa"/>
-              <w:left w:w="110" w:type="dxa"/>
-              <w:right w:w="110" w:type="dxa"/>
-            </w:tcMar>
-          </w:tcPr>
-          <w:p>
-            <w:pPr>
-              <w:spacing w:before="0" w:after="0" w:line="252" w:lineRule="auto"/>
-            </w:pPr>
-            <w:r>
-              <w:rPr>
-                <w:rFonts w:ascii="Arial" w:hAnsi="Arial" w:cs="Arial"/>
-                <w:color w:val="4B5563"/>
-                <w:sz w:val="17"/>
-                <w:szCs w:val="17"/>
-              </w:rPr>
-              <w:t xml:space="preserve">Speed</w:t>
+            <w:tcMar>
+              <w:top w:w="45" w:type="dxa"/>
+              <w:left w:w="110" w:type="dxa"/>
+              <w:bottom w:w="45" w:type="dxa"/>
+              <w:right w:w="110" w:type="dxa"/>
+            </w:tcMar>
+            <w:vAlign w:val="center"/>
+          </w:tcPr>
+          <w:p>
+            <w:pPr>
+              <w:spacing w:line="252" w:lineRule="auto"/>
+            </w:pPr>
+            <w:r>
+              <w:rPr>
+                <w:rFonts w:ascii="Arial" w:hAnsi="Arial" w:cs="Arial"/>
+                <w:color w:val="4B5563"/>
+                <w:sz w:val="17"/>
+                <w:szCs w:val="17"/>
+              </w:rPr>
+              <w:t>Speed</w:t>
             </w:r>
           </w:p>
         </w:tc>
@@ -2516,26 +2866,26 @@
           <w:tcPr>
             <w:tcW w:w="3360" w:type="dxa"/>
             <w:shd w:val="clear" w:color="auto" w:fill="EEF2FF"/>
-            <w:vAlign w:val="center"/>
-            <w:tcMar>
-              <w:top w:w="45" w:type="dxa"/>
-              <w:bottom w:w="45" w:type="dxa"/>
-              <w:left w:w="110" w:type="dxa"/>
-              <w:right w:w="110" w:type="dxa"/>
-            </w:tcMar>
-          </w:tcPr>
-          <w:p>
-            <w:pPr>
-              <w:spacing w:before="0" w:after="0" w:line="252" w:lineRule="auto"/>
-            </w:pPr>
-            <w:r>
-              <w:rPr>
-                <w:rFonts w:ascii="Arial" w:hAnsi="Arial" w:cs="Arial"/>
-                <w:color w:val="4B5563"/>
-                <w:sz w:val="17"/>
-                <w:szCs w:val="17"/>
-              </w:rPr>
-              <w:t xml:space="preserve">Often slow on mobile</w:t>
+            <w:tcMar>
+              <w:top w:w="45" w:type="dxa"/>
+              <w:left w:w="110" w:type="dxa"/>
+              <w:bottom w:w="45" w:type="dxa"/>
+              <w:right w:w="110" w:type="dxa"/>
+            </w:tcMar>
+            <w:vAlign w:val="center"/>
+          </w:tcPr>
+          <w:p>
+            <w:pPr>
+              <w:spacing w:line="252" w:lineRule="auto"/>
+            </w:pPr>
+            <w:r>
+              <w:rPr>
+                <w:rFonts w:ascii="Arial" w:hAnsi="Arial" w:cs="Arial"/>
+                <w:color w:val="4B5563"/>
+                <w:sz w:val="17"/>
+                <w:szCs w:val="17"/>
+              </w:rPr>
+              <w:t>Often slow on mobile</w:t>
             </w:r>
           </w:p>
         </w:tc>
@@ -2543,26 +2893,26 @@
           <w:tcPr>
             <w:tcW w:w="3360" w:type="dxa"/>
             <w:shd w:val="clear" w:color="auto" w:fill="EEF2FF"/>
-            <w:vAlign w:val="center"/>
-            <w:tcMar>
-              <w:top w:w="45" w:type="dxa"/>
-              <w:bottom w:w="45" w:type="dxa"/>
-              <w:left w:w="110" w:type="dxa"/>
-              <w:right w:w="110" w:type="dxa"/>
-            </w:tcMar>
-          </w:tcPr>
-          <w:p>
-            <w:pPr>
-              <w:spacing w:before="0" w:after="0" w:line="252" w:lineRule="auto"/>
-            </w:pPr>
-            <w:r>
-              <w:rPr>
-                <w:rFonts w:ascii="Arial" w:hAnsi="Arial" w:cs="Arial"/>
-                <w:color w:val="4B5563"/>
-                <w:sz w:val="17"/>
-                <w:szCs w:val="17"/>
-              </w:rPr>
-              <w:t xml:space="preserve">Lighthouse 100 on desktop, lightweight on mobile</w:t>
+            <w:tcMar>
+              <w:top w:w="45" w:type="dxa"/>
+              <w:left w:w="110" w:type="dxa"/>
+              <w:bottom w:w="45" w:type="dxa"/>
+              <w:right w:w="110" w:type="dxa"/>
+            </w:tcMar>
+            <w:vAlign w:val="center"/>
+          </w:tcPr>
+          <w:p>
+            <w:pPr>
+              <w:spacing w:line="252" w:lineRule="auto"/>
+            </w:pPr>
+            <w:r>
+              <w:rPr>
+                <w:rFonts w:ascii="Arial" w:hAnsi="Arial" w:cs="Arial"/>
+                <w:color w:val="4B5563"/>
+                <w:sz w:val="17"/>
+                <w:szCs w:val="17"/>
+              </w:rPr>
+              <w:t>Lighthouse 100 on desktop, lightweight on mobile</w:t>
             </w:r>
           </w:p>
         </w:tc>
@@ -2570,82 +2920,84 @@
       <w:tr>
         <w:trPr>
           <w:cantSplit/>
+          <w:jc w:val="center"/>
         </w:trPr>
         <w:tc>
           <w:tcPr>
             <w:tcW w:w="3360" w:type="dxa"/>
-            <w:vAlign w:val="center"/>
-            <w:tcMar>
-              <w:top w:w="45" w:type="dxa"/>
-              <w:bottom w:w="45" w:type="dxa"/>
-              <w:left w:w="110" w:type="dxa"/>
-              <w:right w:w="110" w:type="dxa"/>
-            </w:tcMar>
-          </w:tcPr>
-          <w:p>
-            <w:pPr>
-              <w:spacing w:before="0" w:after="0" w:line="252" w:lineRule="auto"/>
-            </w:pPr>
-            <w:r>
-              <w:rPr>
-                <w:rFonts w:ascii="Arial" w:hAnsi="Arial" w:cs="Arial"/>
-                <w:color w:val="4B5563"/>
-                <w:sz w:val="17"/>
-                <w:szCs w:val="17"/>
-              </w:rPr>
-              <w:t xml:space="preserve">Security</w:t>
+            <w:tcMar>
+              <w:top w:w="45" w:type="dxa"/>
+              <w:left w:w="110" w:type="dxa"/>
+              <w:bottom w:w="45" w:type="dxa"/>
+              <w:right w:w="110" w:type="dxa"/>
+            </w:tcMar>
+            <w:vAlign w:val="center"/>
+          </w:tcPr>
+          <w:p>
+            <w:pPr>
+              <w:spacing w:line="252" w:lineRule="auto"/>
+            </w:pPr>
+            <w:r>
+              <w:rPr>
+                <w:rFonts w:ascii="Arial" w:hAnsi="Arial" w:cs="Arial"/>
+                <w:color w:val="4B5563"/>
+                <w:sz w:val="17"/>
+                <w:szCs w:val="17"/>
+              </w:rPr>
+              <w:lastRenderedPageBreak/>
+              <w:t>Security</w:t>
             </w:r>
           </w:p>
         </w:tc>
         <w:tc>
           <w:tcPr>
             <w:tcW w:w="3360" w:type="dxa"/>
-            <w:vAlign w:val="center"/>
-            <w:tcMar>
-              <w:top w:w="45" w:type="dxa"/>
-              <w:bottom w:w="45" w:type="dxa"/>
-              <w:left w:w="110" w:type="dxa"/>
-              <w:right w:w="110" w:type="dxa"/>
-            </w:tcMar>
-          </w:tcPr>
-          <w:p>
-            <w:pPr>
-              <w:spacing w:before="0" w:after="0" w:line="252" w:lineRule="auto"/>
-            </w:pPr>
-            <w:r>
-              <w:rPr>
-                <w:rFonts w:ascii="Arial" w:hAnsi="Arial" w:cs="Arial"/>
-                <w:color w:val="4B5563"/>
-                <w:sz w:val="17"/>
-                <w:szCs w:val="17"/>
-              </w:rPr>
-              <w:t xml:space="preserve">Rarely reviewed</w:t>
+            <w:tcMar>
+              <w:top w:w="45" w:type="dxa"/>
+              <w:left w:w="110" w:type="dxa"/>
+              <w:bottom w:w="45" w:type="dxa"/>
+              <w:right w:w="110" w:type="dxa"/>
+            </w:tcMar>
+            <w:vAlign w:val="center"/>
+          </w:tcPr>
+          <w:p>
+            <w:pPr>
+              <w:spacing w:line="252" w:lineRule="auto"/>
+            </w:pPr>
+            <w:r>
+              <w:rPr>
+                <w:rFonts w:ascii="Arial" w:hAnsi="Arial" w:cs="Arial"/>
+                <w:color w:val="4B5563"/>
+                <w:sz w:val="17"/>
+                <w:szCs w:val="17"/>
+              </w:rPr>
+              <w:t>Rarely reviewed</w:t>
             </w:r>
           </w:p>
         </w:tc>
         <w:tc>
           <w:tcPr>
             <w:tcW w:w="3360" w:type="dxa"/>
-            <w:vAlign w:val="center"/>
-            <w:tcMar>
-              <w:top w:w="45" w:type="dxa"/>
-              <w:bottom w:w="45" w:type="dxa"/>
-              <w:left w:w="110" w:type="dxa"/>
-              <w:right w:w="110" w:type="dxa"/>
-            </w:tcMar>
-          </w:tcPr>
-          <w:p>
-            <w:pPr>
-              <w:spacing w:before="0" w:after="0" w:line="252" w:lineRule="auto"/>
-            </w:pPr>
-            <w:r>
-              <w:rPr>
-                <w:rFonts w:ascii="Arial" w:hAnsi="Arial" w:cs="Arial"/>
-                <w:color w:val="4B5563"/>
-                <w:sz w:val="17"/>
-                <w:szCs w:val="17"/>
-              </w:rPr>
-              <w:t xml:space="preserve">Audited: security headers, protected database, spam filter</w:t>
+            <w:tcMar>
+              <w:top w:w="45" w:type="dxa"/>
+              <w:left w:w="110" w:type="dxa"/>
+              <w:bottom w:w="45" w:type="dxa"/>
+              <w:right w:w="110" w:type="dxa"/>
+            </w:tcMar>
+            <w:vAlign w:val="center"/>
+          </w:tcPr>
+          <w:p>
+            <w:pPr>
+              <w:spacing w:line="252" w:lineRule="auto"/>
+            </w:pPr>
+            <w:r>
+              <w:rPr>
+                <w:rFonts w:ascii="Arial" w:hAnsi="Arial" w:cs="Arial"/>
+                <w:color w:val="4B5563"/>
+                <w:sz w:val="17"/>
+                <w:szCs w:val="17"/>
+              </w:rPr>
+              <w:t>Audited: security headers, protected database, spam filter</w:t>
             </w:r>
           </w:p>
         </w:tc>
@@ -2653,31 +3005,32 @@
       <w:tr>
         <w:trPr>
           <w:cantSplit/>
+          <w:jc w:val="center"/>
         </w:trPr>
         <w:tc>
           <w:tcPr>
             <w:tcW w:w="3360" w:type="dxa"/>
             <w:shd w:val="clear" w:color="auto" w:fill="EEF2FF"/>
-            <w:vAlign w:val="center"/>
-            <w:tcMar>
-              <w:top w:w="45" w:type="dxa"/>
-              <w:bottom w:w="45" w:type="dxa"/>
-              <w:left w:w="110" w:type="dxa"/>
-              <w:right w:w="110" w:type="dxa"/>
-            </w:tcMar>
-          </w:tcPr>
-          <w:p>
-            <w:pPr>
-              <w:spacing w:before="0" w:after="0" w:line="252" w:lineRule="auto"/>
-            </w:pPr>
-            <w:r>
-              <w:rPr>
-                <w:rFonts w:ascii="Arial" w:hAnsi="Arial" w:cs="Arial"/>
-                <w:color w:val="4B5563"/>
-                <w:sz w:val="17"/>
-                <w:szCs w:val="17"/>
-              </w:rPr>
-              <w:t xml:space="preserve">Customer enquiries</w:t>
+            <w:tcMar>
+              <w:top w:w="45" w:type="dxa"/>
+              <w:left w:w="110" w:type="dxa"/>
+              <w:bottom w:w="45" w:type="dxa"/>
+              <w:right w:w="110" w:type="dxa"/>
+            </w:tcMar>
+            <w:vAlign w:val="center"/>
+          </w:tcPr>
+          <w:p>
+            <w:pPr>
+              <w:spacing w:line="252" w:lineRule="auto"/>
+            </w:pPr>
+            <w:r>
+              <w:rPr>
+                <w:rFonts w:ascii="Arial" w:hAnsi="Arial" w:cs="Arial"/>
+                <w:color w:val="4B5563"/>
+                <w:sz w:val="17"/>
+                <w:szCs w:val="17"/>
+              </w:rPr>
+              <w:t>Customer enquiries</w:t>
             </w:r>
           </w:p>
         </w:tc>
@@ -2685,26 +3038,26 @@
           <w:tcPr>
             <w:tcW w:w="3360" w:type="dxa"/>
             <w:shd w:val="clear" w:color="auto" w:fill="EEF2FF"/>
-            <w:vAlign w:val="center"/>
-            <w:tcMar>
-              <w:top w:w="45" w:type="dxa"/>
-              <w:bottom w:w="45" w:type="dxa"/>
-              <w:left w:w="110" w:type="dxa"/>
-              <w:right w:w="110" w:type="dxa"/>
-            </w:tcMar>
-          </w:tcPr>
-          <w:p>
-            <w:pPr>
-              <w:spacing w:before="0" w:after="0" w:line="252" w:lineRule="auto"/>
-            </w:pPr>
-            <w:r>
-              <w:rPr>
-                <w:rFonts w:ascii="Arial" w:hAnsi="Arial" w:cs="Arial"/>
-                <w:color w:val="4B5563"/>
-                <w:sz w:val="17"/>
-                <w:szCs w:val="17"/>
-              </w:rPr>
-              <w:t xml:space="preserve">Phone number only</w:t>
+            <w:tcMar>
+              <w:top w:w="45" w:type="dxa"/>
+              <w:left w:w="110" w:type="dxa"/>
+              <w:bottom w:w="45" w:type="dxa"/>
+              <w:right w:w="110" w:type="dxa"/>
+            </w:tcMar>
+            <w:vAlign w:val="center"/>
+          </w:tcPr>
+          <w:p>
+            <w:pPr>
+              <w:spacing w:line="252" w:lineRule="auto"/>
+            </w:pPr>
+            <w:r>
+              <w:rPr>
+                <w:rFonts w:ascii="Arial" w:hAnsi="Arial" w:cs="Arial"/>
+                <w:color w:val="4B5563"/>
+                <w:sz w:val="17"/>
+                <w:szCs w:val="17"/>
+              </w:rPr>
+              <w:t>Phone number only</w:t>
             </w:r>
           </w:p>
         </w:tc>
@@ -2712,26 +3065,44 @@
           <w:tcPr>
             <w:tcW w:w="3360" w:type="dxa"/>
             <w:shd w:val="clear" w:color="auto" w:fill="EEF2FF"/>
-            <w:vAlign w:val="center"/>
-            <w:tcMar>
-              <w:top w:w="45" w:type="dxa"/>
-              <w:bottom w:w="45" w:type="dxa"/>
-              <w:left w:w="110" w:type="dxa"/>
-              <w:right w:w="110" w:type="dxa"/>
-            </w:tcMar>
-          </w:tcPr>
-          <w:p>
-            <w:pPr>
-              <w:spacing w:before="0" w:after="0" w:line="252" w:lineRule="auto"/>
-            </w:pPr>
-            <w:r>
-              <w:rPr>
-                <w:rFonts w:ascii="Arial" w:hAnsi="Arial" w:cs="Arial"/>
-                <w:color w:val="4B5563"/>
-                <w:sz w:val="17"/>
-                <w:szCs w:val="17"/>
-              </w:rPr>
-              <w:t xml:space="preserve">Contact form inbox + WhatsApp + call buttons</w:t>
+            <w:tcMar>
+              <w:top w:w="45" w:type="dxa"/>
+              <w:left w:w="110" w:type="dxa"/>
+              <w:bottom w:w="45" w:type="dxa"/>
+              <w:right w:w="110" w:type="dxa"/>
+            </w:tcMar>
+            <w:vAlign w:val="center"/>
+          </w:tcPr>
+          <w:p>
+            <w:pPr>
+              <w:spacing w:line="252" w:lineRule="auto"/>
+            </w:pPr>
+            <w:r>
+              <w:rPr>
+                <w:rFonts w:ascii="Arial" w:hAnsi="Arial" w:cs="Arial"/>
+                <w:color w:val="4B5563"/>
+                <w:sz w:val="17"/>
+                <w:szCs w:val="17"/>
+              </w:rPr>
+              <w:t>Contact fo</w:t>
+            </w:r>
+            <w:r>
+              <w:rPr>
+                <w:rFonts w:ascii="Arial" w:hAnsi="Arial" w:cs="Arial"/>
+                <w:color w:val="4B5563"/>
+                <w:sz w:val="17"/>
+                <w:szCs w:val="17"/>
+              </w:rPr>
+              <w:t>r</w:t>
+            </w:r>
+            <w:r>
+              <w:rPr>
+                <w:rFonts w:ascii="Arial" w:hAnsi="Arial" w:cs="Arial"/>
+                <w:color w:val="4B5563"/>
+                <w:sz w:val="17"/>
+                <w:szCs w:val="17"/>
+              </w:rPr>
+              <w:t>m inbox + WhatsApp + call buttons</w:t>
             </w:r>
           </w:p>
         </w:tc>
@@ -2739,7 +3110,7 @@
     </w:tbl>
     <w:p>
       <w:pPr>
-        <w:spacing w:before="0" w:after="0" w:line="200" w:lineRule="auto"/>
+        <w:spacing w:line="200" w:lineRule="auto"/>
       </w:pPr>
     </w:p>
     <w:p>
@@ -2758,12 +3129,12 @@
           <w:sz w:val="22"/>
           <w:szCs w:val="22"/>
         </w:rPr>
-        <w:t xml:space="preserve">5. TERMS OF AGREEMENT</w:t>
+        <w:t>5. TERMS OF AGREEMENT</w:t>
       </w:r>
     </w:p>
     <w:p>
       <w:pPr>
-        <w:spacing w:before="0" w:after="70" w:line="259" w:lineRule="auto"/>
+        <w:spacing w:after="70" w:line="259" w:lineRule="auto"/>
       </w:pPr>
       <w:r>
         <w:rPr>
@@ -2792,7 +3163,7 @@
           <w:sz w:val="19"/>
           <w:szCs w:val="19"/>
         </w:rPr>
-        <w:t xml:space="preserve">24 hours</w:t>
+        <w:t>24 hours</w:t>
       </w:r>
       <w:r>
         <w:rPr>
@@ -2806,7 +3177,7 @@
     </w:p>
     <w:p>
       <w:pPr>
-        <w:spacing w:before="0" w:after="70" w:line="259" w:lineRule="auto"/>
+        <w:spacing w:after="70" w:line="259" w:lineRule="auto"/>
       </w:pPr>
       <w:r>
         <w:rPr>
@@ -2825,12 +3196,12 @@
           <w:sz w:val="19"/>
           <w:szCs w:val="19"/>
         </w:rPr>
-        <w:t xml:space="preserve">The website is accepted when KCG confirms it, or automatically when the 24-hour review period ends without written modification requests. Requested modifications will be completed by Datix AI, after which the website is accepted.</w:t>
+        <w:t>The website is accepted when KCG confirms it, or automatically when the 24-hour review period ends without written modification requests. Requested modifications will be completed by Datix AI, after which the website is accepted.</w:t>
       </w:r>
     </w:p>
     <w:p>
       <w:pPr>
-        <w:spacing w:before="0" w:after="70" w:line="259" w:lineRule="auto"/>
+        <w:spacing w:after="70" w:line="259" w:lineRule="auto"/>
       </w:pPr>
       <w:r>
         <w:rPr>
@@ -2859,7 +3230,7 @@
           <w:sz w:val="19"/>
           <w:szCs w:val="19"/>
         </w:rPr>
-        <w:t xml:space="preserve">full total of the chosen package</w:t>
+        <w:t>full total of the chosen package</w:t>
       </w:r>
       <w:r>
         <w:rPr>
@@ -2878,7 +3249,7 @@
           <w:sz w:val="19"/>
           <w:szCs w:val="19"/>
         </w:rPr>
-        <w:t xml:space="preserve">3 days of acceptance</w:t>
+        <w:t>3 days of acceptance</w:t>
       </w:r>
       <w:r>
         <w:rPr>
@@ -2887,12 +3258,12 @@
           <w:sz w:val="19"/>
           <w:szCs w:val="19"/>
         </w:rPr>
-        <w:t xml:space="preserve">, by bank transfer or another method agreed in writing.</w:t>
+        <w:t>, by bank transfer or another method agreed in writing.</w:t>
       </w:r>
     </w:p>
     <w:p>
       <w:pPr>
-        <w:spacing w:before="0" w:after="70" w:line="259" w:lineRule="auto"/>
+        <w:spacing w:after="70" w:line="259" w:lineRule="auto"/>
       </w:pPr>
       <w:r>
         <w:rPr>
@@ -2911,12 +3282,12 @@
           <w:sz w:val="19"/>
           <w:szCs w:val="19"/>
         </w:rPr>
-        <w:t xml:space="preserve">kashmirconstructiongroup.com and the business email are registered for 3 years (until October 2029). On full payment, Datix AI will transfer the domain and email to KCG’s own account. Renewal fees after this period are KCG’s responsibility.</w:t>
+        <w:t>kashmirconstructiongroup.com and the business email are registered for 3 years (until October 2029). On full payment, Datix AI will transfer the domain and email to KCG’s own account. Renewal fees after this period are KCG’s responsibility.</w:t>
       </w:r>
     </w:p>
     <w:p>
       <w:pPr>
-        <w:spacing w:before="0" w:after="70" w:line="259" w:lineRule="auto"/>
+        <w:spacing w:after="70" w:line="259" w:lineRule="auto"/>
       </w:pPr>
       <w:r>
         <w:rPr>
@@ -2935,12 +3306,12 @@
           <w:sz w:val="19"/>
           <w:szCs w:val="19"/>
         </w:rPr>
-        <w:t xml:space="preserve">On full payment, KCG owns the website, its content and the domain. Datix AI keeps the right to show the project in its portfolio, and the “Designed &amp; Developed by Datix AI” credit remains in the website footer.</w:t>
+        <w:t>On full payment, KCG owns the website, its content and the domain. Datix AI keeps the right to show the project in its portfolio, and the “Designed &amp; Developed by Datix AI” credit remains in the website footer.</w:t>
       </w:r>
     </w:p>
     <w:p>
       <w:pPr>
-        <w:spacing w:before="0" w:after="70" w:line="259" w:lineRule="auto"/>
+        <w:spacing w:after="70" w:line="259" w:lineRule="auto"/>
       </w:pPr>
       <w:r>
         <w:rPr>
@@ -2959,12 +3330,12 @@
           <w:sz w:val="19"/>
           <w:szCs w:val="19"/>
         </w:rPr>
-        <w:t xml:space="preserve">The website uses third-party services (website hosting, Google Firebase database and login, domain registrar). Any paid plans these services require for business use are KCG’s cost. Datix AI is not liable for outages of third-party services.</w:t>
+        <w:t>The website uses third-party services (website hosting, Google Firebase database and login, domain registrar). Any paid plans these services require for business use are KCG’s cost. Datix AI is not liable for outages of third-party services.</w:t>
       </w:r>
     </w:p>
     <w:p>
       <w:pPr>
-        <w:spacing w:before="0" w:after="70" w:line="259" w:lineRule="auto"/>
+        <w:spacing w:after="70" w:line="259" w:lineRule="auto"/>
       </w:pPr>
       <w:r>
         <w:rPr>
@@ -2983,12 +3354,12 @@
           <w:sz w:val="19"/>
           <w:szCs w:val="19"/>
         </w:rPr>
-        <w:t xml:space="preserve">Covers 12 months from acceptance: content and video updates, small design changes, security updates, backups, fixes and admin support. Major new sections or features are quoted separately.</w:t>
+        <w:t>Covers 12 months from acceptance: content and video updates, small design changes, security updates, backups, fixes and admin support. Major new sections or features are quoted separately.</w:t>
       </w:r>
     </w:p>
     <w:p>
       <w:pPr>
-        <w:spacing w:before="0" w:after="70" w:line="259" w:lineRule="auto"/>
+        <w:spacing w:after="70" w:line="259" w:lineRule="auto"/>
       </w:pPr>
       <w:r>
         <w:rPr>
@@ -3007,12 +3378,12 @@
           <w:sz w:val="19"/>
           <w:szCs w:val="19"/>
         </w:rPr>
-        <w:t xml:space="preserve">KCG is responsible for the accuracy of business information and for having the rights to all photos, videos and text it provides or uploads.</w:t>
+        <w:t>KCG is responsible for the accuracy of business information and for having the rights to all photos, videos and text it provides or uploads.</w:t>
       </w:r>
     </w:p>
     <w:p>
       <w:pPr>
-        <w:spacing w:before="0" w:after="70" w:line="259" w:lineRule="auto"/>
+        <w:spacing w:after="70" w:line="259" w:lineRule="auto"/>
       </w:pPr>
       <w:r>
         <w:rPr>
@@ -3031,22 +3402,7 @@
           <w:sz w:val="19"/>
           <w:szCs w:val="19"/>
         </w:rPr>
-        <w:t xml:space="preserve">If payment is not received within 14 days of acceptance, Datix AI may suspend the website and keep the domain and email in its account until payment is made.</w:t>
-      </w:r>
-    </w:p>
-    <w:p>
-      <w:pPr>
-        <w:spacing w:before="0" w:after="70" w:line="259" w:lineRule="auto"/>
-      </w:pPr>
-      <w:r>
-        <w:rPr>
-          <w:rFonts w:ascii="Arial" w:hAnsi="Arial" w:cs="Arial"/>
-          <w:b/>
-          <w:color w:val="0A1F44"/>
-          <w:sz w:val="19"/>
-          <w:szCs w:val="19"/>
-        </w:rPr>
-        <w:t xml:space="preserve">5.10  Confidentiality &amp; law. </w:t>
+        <w:t xml:space="preserve">If payment is not received within </w:t>
       </w:r>
       <w:r>
         <w:rPr>
@@ -3055,7 +3411,16 @@
           <w:sz w:val="19"/>
           <w:szCs w:val="19"/>
         </w:rPr>
-        <w:t xml:space="preserve">Both parties keep each other’s business information confidential. This agreement is governed by the laws of Pakistan.</w:t>
+        <w:t>5</w:t>
+      </w:r>
+      <w:r>
+        <w:rPr>
+          <w:rFonts w:ascii="Arial" w:hAnsi="Arial" w:cs="Arial"/>
+          <w:color w:val="4B5563"/>
+          <w:sz w:val="19"/>
+          <w:szCs w:val="19"/>
+        </w:rPr>
+        <w:t xml:space="preserve"> days of acceptance, Datix AI may suspend the website and keep the domain and email in its account until payment is made.</w:t>
       </w:r>
     </w:p>
     <w:p>
@@ -3074,12 +3439,12 @@
           <w:sz w:val="22"/>
           <w:szCs w:val="22"/>
         </w:rPr>
-        <w:t xml:space="preserve">6. PACKAGE SELECTED BY KCG</w:t>
+        <w:t>6. PACKAGE SELECTED BY KCG</w:t>
       </w:r>
     </w:p>
     <w:p>
       <w:pPr>
-        <w:spacing w:before="0" w:after="60" w:line="259" w:lineRule="auto"/>
+        <w:spacing w:after="60" w:line="259" w:lineRule="auto"/>
       </w:pPr>
       <w:r>
         <w:rPr>
@@ -3155,12 +3520,12 @@
           <w:sz w:val="22"/>
           <w:szCs w:val="22"/>
         </w:rPr>
-        <w:t xml:space="preserve">7. ACCEPTANCE &amp; SIGNATURES</w:t>
+        <w:t>7. ACCEPTANCE &amp; SIGNATURES</w:t>
       </w:r>
     </w:p>
     <w:p>
       <w:pPr>
-        <w:spacing w:before="0" w:after="100" w:line="259" w:lineRule="auto"/>
+        <w:spacing w:after="100" w:line="259" w:lineRule="auto"/>
       </w:pPr>
       <w:r>
         <w:rPr>
@@ -3169,7 +3534,7 @@
           <w:sz w:val="19"/>
           <w:szCs w:val="19"/>
         </w:rPr>
-        <w:t xml:space="preserve">By signing below, both parties agree to the scope, price and terms of this agreement.</w:t>
+        <w:t>By signing below, both parties agree to the scope, price and terms of this agreement.</w:t>
       </w:r>
     </w:p>
     <w:tbl>
@@ -3185,6 +3550,7 @@
           <w:insideV w:val="single" w:sz="4" w:space="0" w:color="FFFFFF"/>
         </w:tblBorders>
         <w:tblLayout w:type="fixed"/>
+        <w:tblLook w:val="04A0" w:firstRow="1" w:lastRow="0" w:firstColumn="1" w:lastColumn="0" w:noHBand="0" w:noVBand="1"/>
       </w:tblPr>
       <w:tblGrid>
         <w:gridCol w:w="5040"/>
@@ -3193,21 +3559,22 @@
       <w:tr>
         <w:trPr>
           <w:cantSplit/>
+          <w:jc w:val="center"/>
         </w:trPr>
         <w:tc>
           <w:tcPr>
             <w:tcW w:w="5040" w:type="dxa"/>
-            <w:vAlign w:val="center"/>
-            <w:tcMar>
-              <w:top w:w="45" w:type="dxa"/>
-              <w:bottom w:w="45" w:type="dxa"/>
-              <w:left w:w="110" w:type="dxa"/>
-              <w:right w:w="110" w:type="dxa"/>
-            </w:tcMar>
-          </w:tcPr>
-          <w:p>
-            <w:pPr>
-              <w:spacing w:before="0" w:after="0" w:line="252" w:lineRule="auto"/>
+            <w:tcMar>
+              <w:top w:w="45" w:type="dxa"/>
+              <w:left w:w="110" w:type="dxa"/>
+              <w:bottom w:w="45" w:type="dxa"/>
+              <w:right w:w="110" w:type="dxa"/>
+            </w:tcMar>
+            <w:vAlign w:val="center"/>
+          </w:tcPr>
+          <w:p>
+            <w:pPr>
+              <w:spacing w:line="252" w:lineRule="auto"/>
             </w:pPr>
             <w:r>
               <w:rPr>
@@ -3217,17 +3584,17 @@
                 <w:sz w:val="19"/>
                 <w:szCs w:val="19"/>
               </w:rPr>
-              <w:t xml:space="preserve">For Datix AI</w:t>
-            </w:r>
-          </w:p>
-          <w:p>
-            <w:pPr>
-              <w:spacing w:before="0" w:after="420" w:line="259" w:lineRule="auto"/>
-            </w:pPr>
-          </w:p>
-          <w:p>
-            <w:pPr>
-              <w:spacing w:before="0" w:after="0" w:line="252" w:lineRule="auto"/>
+              <w:t>For Datix AI</w:t>
+            </w:r>
+          </w:p>
+          <w:p>
+            <w:pPr>
+              <w:spacing w:after="160" w:line="259" w:lineRule="auto"/>
+            </w:pPr>
+          </w:p>
+          <w:p>
+            <w:pPr>
+              <w:spacing w:line="252" w:lineRule="auto"/>
             </w:pPr>
             <w:r>
               <w:rPr>
@@ -3236,18 +3603,8 @@
                 <w:sz w:val="18"/>
                 <w:szCs w:val="18"/>
               </w:rPr>
-              <w:t xml:space="preserve">Signature: ____________________________</w:t>
-            </w:r>
-          </w:p>
-          <w:p>
-            <w:pPr>
-              <w:spacing w:before="0" w:after="160" w:line="259" w:lineRule="auto"/>
-            </w:pPr>
-          </w:p>
-          <w:p>
-            <w:pPr>
-              <w:spacing w:before="0" w:after="0" w:line="252" w:lineRule="auto"/>
-            </w:pPr>
+              <w:t>Name:</w:t>
+            </w:r>
             <w:r>
               <w:rPr>
                 <w:rFonts w:ascii="Arial" w:hAnsi="Arial" w:cs="Arial"/>
@@ -3255,17 +3612,17 @@
                 <w:sz w:val="18"/>
                 <w:szCs w:val="18"/>
               </w:rPr>
-              <w:t xml:space="preserve">Name: ______________________________</w:t>
-            </w:r>
-          </w:p>
-          <w:p>
-            <w:pPr>
-              <w:spacing w:before="0" w:after="160" w:line="259" w:lineRule="auto"/>
-            </w:pPr>
-          </w:p>
-          <w:p>
-            <w:pPr>
-              <w:spacing w:before="0" w:after="0" w:line="252" w:lineRule="auto"/>
+              <w:t xml:space="preserve"> Ahmed Ali</w:t>
+            </w:r>
+          </w:p>
+          <w:p>
+            <w:pPr>
+              <w:spacing w:after="160" w:line="259" w:lineRule="auto"/>
+            </w:pPr>
+          </w:p>
+          <w:p>
+            <w:pPr>
+              <w:spacing w:line="252" w:lineRule="auto"/>
             </w:pPr>
             <w:r>
               <w:rPr>
@@ -3274,24 +3631,33 @@
                 <w:sz w:val="18"/>
                 <w:szCs w:val="18"/>
               </w:rPr>
-              <w:t xml:space="preserve">Date: _______________________________</w:t>
+              <w:t xml:space="preserve">Date: </w:t>
+            </w:r>
+            <w:r>
+              <w:rPr>
+                <w:rFonts w:ascii="Arial" w:hAnsi="Arial" w:cs="Arial"/>
+                <w:color w:val="4B5563"/>
+                <w:sz w:val="18"/>
+                <w:szCs w:val="18"/>
+              </w:rPr>
+              <w:t>09 Oct 2026</w:t>
             </w:r>
           </w:p>
         </w:tc>
         <w:tc>
           <w:tcPr>
             <w:tcW w:w="5040" w:type="dxa"/>
-            <w:vAlign w:val="center"/>
-            <w:tcMar>
-              <w:top w:w="45" w:type="dxa"/>
-              <w:bottom w:w="45" w:type="dxa"/>
-              <w:left w:w="110" w:type="dxa"/>
-              <w:right w:w="110" w:type="dxa"/>
-            </w:tcMar>
-          </w:tcPr>
-          <w:p>
-            <w:pPr>
-              <w:spacing w:before="0" w:after="0" w:line="252" w:lineRule="auto"/>
+            <w:tcMar>
+              <w:top w:w="45" w:type="dxa"/>
+              <w:left w:w="110" w:type="dxa"/>
+              <w:bottom w:w="45" w:type="dxa"/>
+              <w:right w:w="110" w:type="dxa"/>
+            </w:tcMar>
+            <w:vAlign w:val="center"/>
+          </w:tcPr>
+          <w:p>
+            <w:pPr>
+              <w:spacing w:line="252" w:lineRule="auto"/>
             </w:pPr>
             <w:r>
               <w:rPr>
@@ -3301,17 +3667,17 @@
                 <w:sz w:val="19"/>
                 <w:szCs w:val="19"/>
               </w:rPr>
-              <w:t xml:space="preserve">For Kashmir Construction Group</w:t>
-            </w:r>
-          </w:p>
-          <w:p>
-            <w:pPr>
-              <w:spacing w:before="0" w:after="420" w:line="259" w:lineRule="auto"/>
-            </w:pPr>
-          </w:p>
-          <w:p>
-            <w:pPr>
-              <w:spacing w:before="0" w:after="0" w:line="252" w:lineRule="auto"/>
+              <w:t>For Kashmir Construction Group</w:t>
+            </w:r>
+          </w:p>
+          <w:p>
+            <w:pPr>
+              <w:spacing w:after="160" w:line="259" w:lineRule="auto"/>
+            </w:pPr>
+          </w:p>
+          <w:p>
+            <w:pPr>
+              <w:spacing w:line="252" w:lineRule="auto"/>
             </w:pPr>
             <w:r>
               <w:rPr>
@@ -3320,17 +3686,17 @@
                 <w:sz w:val="18"/>
                 <w:szCs w:val="18"/>
               </w:rPr>
-              <w:t xml:space="preserve">Signature: ____________________________</w:t>
-            </w:r>
-          </w:p>
-          <w:p>
-            <w:pPr>
-              <w:spacing w:before="0" w:after="160" w:line="259" w:lineRule="auto"/>
-            </w:pPr>
-          </w:p>
-          <w:p>
-            <w:pPr>
-              <w:spacing w:before="0" w:after="0" w:line="252" w:lineRule="auto"/>
+              <w:t>Name: Akeeb Yakoob, Proprietor</w:t>
+            </w:r>
+          </w:p>
+          <w:p>
+            <w:pPr>
+              <w:spacing w:after="160" w:line="259" w:lineRule="auto"/>
+            </w:pPr>
+          </w:p>
+          <w:p>
+            <w:pPr>
+              <w:spacing w:line="252" w:lineRule="auto"/>
             </w:pPr>
             <w:r>
               <w:rPr>
@@ -3339,18 +3705,8 @@
                 <w:sz w:val="18"/>
                 <w:szCs w:val="18"/>
               </w:rPr>
-              <w:t xml:space="preserve">Name: Akeeb Yakoob, Proprietor</w:t>
-            </w:r>
-          </w:p>
-          <w:p>
-            <w:pPr>
-              <w:spacing w:before="0" w:after="160" w:line="259" w:lineRule="auto"/>
-            </w:pPr>
-          </w:p>
-          <w:p>
-            <w:pPr>
-              <w:spacing w:before="0" w:after="0" w:line="252" w:lineRule="auto"/>
-            </w:pPr>
+              <w:t>Date:</w:t>
+            </w:r>
             <w:r>
               <w:rPr>
                 <w:rFonts w:ascii="Arial" w:hAnsi="Arial" w:cs="Arial"/>
@@ -3358,7 +3714,7 @@
                 <w:sz w:val="18"/>
                 <w:szCs w:val="18"/>
               </w:rPr>
-              <w:t xml:space="preserve">Date: _______________________________</w:t>
+              <w:t xml:space="preserve"> </w:t>
             </w:r>
           </w:p>
         </w:tc>
@@ -3366,7 +3722,7 @@
     </w:tbl>
     <w:p>
       <w:pPr>
-        <w:spacing w:before="0" w:after="0" w:line="200" w:lineRule="auto"/>
+        <w:spacing w:line="200" w:lineRule="auto"/>
       </w:pPr>
     </w:p>
     <w:sectPr>
@@ -3382,7 +3738,7 @@
 </file>
 
 <file path=word/endnotes.xml><?xml version="1.0" encoding="utf-8"?>
-<w:endnotes xmlns:wpc="http://schemas.microsoft.com/office/word/2010/wordprocessingCanvas" xmlns:cx="http://schemas.microsoft.com/office/drawing/2014/chartex" xmlns:cx1="http://schemas.microsoft.com/office/drawing/2015/9/8/chartex" xmlns:cx2="http://schemas.microsoft.com/office/drawing/2015/10/21/chartex" xmlns:cx3="http://schemas.microsoft.com/office/drawing/2016/5/9/chartex" xmlns:cx4="http://schemas.microsoft.com/office/drawing/2016/5/10/chartex" xmlns:cx5="http://schemas.microsoft.com/office/drawing/2016/5/11/chartex" xmlns:cx6="http://schemas.microsoft.com/office/drawing/2016/5/12/chartex" xmlns:cx7="http://schemas.microsoft.com/office/drawing/2016/5/13/chartex" xmlns:cx8="http://schemas.microsoft.com/office/drawing/2016/5/14/chartex" xmlns:mc="http://schemas.openxmlformats.org/markup-compatibility/2006" xmlns:aink="http://schemas.microsoft.com/office/drawing/2016/ink" xmlns:am3d="http://schemas.microsoft.com/office/drawing/2017/model3d" xmlns:o="urn:schemas-microsoft-com:office:office" xmlns:oel="http://schemas.microsoft.com/office/2019/extlst" xmlns:r="http://schemas.openxmlformats.org/officeDocument/2006/relationships" xmlns:m="http://schemas.openxmlformats.org/officeDocument/2006/math" xmlns:v="urn:schemas-microsoft-com:vml" xmlns:wp14="http://schemas.microsoft.com/office/word/2010/wordprocessingDrawing" xmlns:wp="http://schemas.openxmlformats.org/drawingml/2006/wordprocessingDrawing" xmlns:w10="urn:schemas-microsoft-com:office:word" xmlns:w="http://schemas.openxmlformats.org/wordprocessingml/2006/main" xmlns:w14="http://schemas.microsoft.com/office/word/2010/wordml" xmlns:w15="http://schemas.microsoft.com/office/word/2012/wordml" xmlns:w16cei="http://schemas.microsoft.com/office/word/2026/wordml/cei" xmlns:w16cex="http://schemas.microsoft.com/office/word/2018/wordml/cex" xmlns:w16cid="http://schemas.microsoft.com/office/word/2016/wordml/cid" xmlns:w16="http://schemas.microsoft.com/office/word/2018/wordml" xmlns:w16du="http://schemas.microsoft.com/office/word/2023/wordml/word16du" xmlns:w16sdtdh="http://schemas.microsoft.com/office/word/2020/wordml/sdtdatahash" xmlns:w16sdtfl="http://schemas.microsoft.com/office/word/2024/wordml/sdtformatlock" xmlns:w16se="http://schemas.microsoft.com/office/word/2015/wordml/symex" xmlns:wpg="http://schemas.microsoft.com/office/word/2010/wordprocessingGroup" xmlns:wpi="http://schemas.microsoft.com/office/word/2010/wordprocessingInk" xmlns:wne="http://schemas.microsoft.com/office/word/2006/wordml" xmlns:wps="http://schemas.microsoft.com/office/word/2010/wordprocessingShape" mc:Ignorable="w14 w15 w16se w16cid w16 w16cex w16sdtdh w16sdtfl w16du wp14">
+<w:endnotes xmlns:wpc="http://schemas.microsoft.com/office/word/2010/wordprocessingCanvas" xmlns:cx="http://schemas.microsoft.com/office/drawing/2014/chartex" xmlns:cx1="http://schemas.microsoft.com/office/drawing/2015/9/8/chartex" xmlns:cx2="http://schemas.microsoft.com/office/drawing/2015/10/21/chartex" xmlns:cx3="http://schemas.microsoft.com/office/drawing/2016/5/9/chartex" xmlns:cx4="http://schemas.microsoft.com/office/drawing/2016/5/10/chartex" xmlns:cx5="http://schemas.microsoft.com/office/drawing/2016/5/11/chartex" xmlns:cx6="http://schemas.microsoft.com/office/drawing/2016/5/12/chartex" xmlns:cx7="http://schemas.microsoft.com/office/drawing/2016/5/13/chartex" xmlns:cx8="http://schemas.microsoft.com/office/drawing/2016/5/14/chartex" xmlns:mc="http://schemas.openxmlformats.org/markup-compatibility/2006" xmlns:aink="http://schemas.microsoft.com/office/drawing/2016/ink" xmlns:am3d="http://schemas.microsoft.com/office/drawing/2017/model3d" xmlns:o="urn:schemas-microsoft-com:office:office" xmlns:oel="http://schemas.microsoft.com/office/2019/extlst" xmlns:r="http://schemas.openxmlformats.org/officeDocument/2006/relationships" xmlns:m="http://schemas.openxmlformats.org/officeDocument/2006/math" xmlns:v="urn:schemas-microsoft-com:vml" xmlns:wp14="http://schemas.microsoft.com/office/word/2010/wordprocessingDrawing" xmlns:wp="http://schemas.openxmlformats.org/drawingml/2006/wordprocessingDrawing" xmlns:w10="urn:schemas-microsoft-com:office:word" xmlns:w="http://schemas.openxmlformats.org/wordprocessingml/2006/main" xmlns:w14="http://schemas.microsoft.com/office/word/2010/wordml" xmlns:w15="http://schemas.microsoft.com/office/word/2012/wordml" xmlns:w16cex="http://schemas.microsoft.com/office/word/2018/wordml/cex" xmlns:w16cid="http://schemas.microsoft.com/office/word/2016/wordml/cid" xmlns:w16="http://schemas.microsoft.com/office/word/2018/wordml" xmlns:w16du="http://schemas.microsoft.com/office/word/2023/wordml/word16du" xmlns:w16sdtdh="http://schemas.microsoft.com/office/word/2020/wordml/sdtdatahash" xmlns:w16sdtfl="http://schemas.microsoft.com/office/word/2024/wordml/sdtformatlock" xmlns:w16se="http://schemas.microsoft.com/office/word/2015/wordml/symex" xmlns:wpg="http://schemas.microsoft.com/office/word/2010/wordprocessingGroup" xmlns:wpi="http://schemas.microsoft.com/office/word/2010/wordprocessingInk" xmlns:wne="http://schemas.microsoft.com/office/word/2006/wordml" xmlns:wps="http://schemas.microsoft.com/office/word/2010/wordprocessingShape" mc:Ignorable="w14 w15 w16se w16cid w16 w16cex w16sdtdh w16sdtfl w16du wp14">
   <w:endnote w:type="separator" w:id="-1">
     <w:p>
       <w:r>
@@ -3401,7 +3757,7 @@
 </file>
 
 <file path=word/footer1.xml><?xml version="1.0" encoding="utf-8"?>
-<w:ftr xmlns:wpc="http://schemas.microsoft.com/office/word/2010/wordprocessingCanvas" xmlns:cx="http://schemas.microsoft.com/office/drawing/2014/chartex" xmlns:cx1="http://schemas.microsoft.com/office/drawing/2015/9/8/chartex" xmlns:cx2="http://schemas.microsoft.com/office/drawing/2015/10/21/chartex" xmlns:cx3="http://schemas.microsoft.com/office/drawing/2016/5/9/chartex" xmlns:cx4="http://schemas.microsoft.com/office/drawing/2016/5/10/chartex" xmlns:cx5="http://schemas.microsoft.com/office/drawing/2016/5/11/chartex" xmlns:cx6="http://schemas.microsoft.com/office/drawing/2016/5/12/chartex" xmlns:cx7="http://schemas.microsoft.com/office/drawing/2016/5/13/chartex" xmlns:cx8="http://schemas.microsoft.com/office/drawing/2016/5/14/chartex" xmlns:mc="http://schemas.openxmlformats.org/markup-compatibility/2006" xmlns:aink="http://schemas.microsoft.com/office/drawing/2016/ink" xmlns:am3d="http://schemas.microsoft.com/office/drawing/2017/model3d" xmlns:o="urn:schemas-microsoft-com:office:office" xmlns:oel="http://schemas.microsoft.com/office/2019/extlst" xmlns:r="http://schemas.openxmlformats.org/officeDocument/2006/relationships" xmlns:m="http://schemas.openxmlformats.org/officeDocument/2006/math" xmlns:v="urn:schemas-microsoft-com:vml" xmlns:wp14="http://schemas.microsoft.com/office/word/2010/wordprocessingDrawing" xmlns:wp="http://schemas.openxmlformats.org/drawingml/2006/wordprocessingDrawing" xmlns:w10="urn:schemas-microsoft-com:office:word" xmlns:w="http://schemas.openxmlformats.org/wordprocessingml/2006/main" xmlns:w14="http://schemas.microsoft.com/office/word/2010/wordml" xmlns:w15="http://schemas.microsoft.com/office/word/2012/wordml" xmlns:w16cei="http://schemas.microsoft.com/office/word/2026/wordml/cei" xmlns:w16cex="http://schemas.microsoft.com/office/word/2018/wordml/cex" xmlns:w16cid="http://schemas.microsoft.com/office/word/2016/wordml/cid" xmlns:w16="http://schemas.microsoft.com/office/word/2018/wordml" xmlns:w16du="http://schemas.microsoft.com/office/word/2023/wordml/word16du" xmlns:w16sdtdh="http://schemas.microsoft.com/office/word/2020/wordml/sdtdatahash" xmlns:w16sdtfl="http://schemas.microsoft.com/office/word/2024/wordml/sdtformatlock" xmlns:w16se="http://schemas.microsoft.com/office/word/2015/wordml/symex" xmlns:wpg="http://schemas.microsoft.com/office/word/2010/wordprocessingGroup" xmlns:wpi="http://schemas.microsoft.com/office/word/2010/wordprocessingInk" xmlns:wne="http://schemas.microsoft.com/office/word/2006/wordml" xmlns:wps="http://schemas.microsoft.com/office/word/2010/wordprocessingShape" mc:Ignorable="w14 w15 w16se w16cid w16 w16cex w16sdtdh w16sdtfl w16du wp14">
+<w:ftr xmlns:wpc="http://schemas.microsoft.com/office/word/2010/wordprocessingCanvas" xmlns:cx="http://schemas.microsoft.com/office/drawing/2014/chartex" xmlns:cx1="http://schemas.microsoft.com/office/drawing/2015/9/8/chartex" xmlns:cx2="http://schemas.microsoft.com/office/drawing/2015/10/21/chartex" xmlns:cx3="http://schemas.microsoft.com/office/drawing/2016/5/9/chartex" xmlns:cx4="http://schemas.microsoft.com/office/drawing/2016/5/10/chartex" xmlns:cx5="http://schemas.microsoft.com/office/drawing/2016/5/11/chartex" xmlns:cx6="http://schemas.microsoft.com/office/drawing/2016/5/12/chartex" xmlns:cx7="http://schemas.microsoft.com/office/drawing/2016/5/13/chartex" xmlns:cx8="http://schemas.microsoft.com/office/drawing/2016/5/14/chartex" xmlns:mc="http://schemas.openxmlformats.org/markup-compatibility/2006" xmlns:aink="http://schemas.microsoft.com/office/drawing/2016/ink" xmlns:am3d="http://schemas.microsoft.com/office/drawing/2017/model3d" xmlns:o="urn:schemas-microsoft-com:office:office" xmlns:oel="http://schemas.microsoft.com/office/2019/extlst" xmlns:r="http://schemas.openxmlformats.org/officeDocument/2006/relationships" xmlns:m="http://schemas.openxmlformats.org/officeDocument/2006/math" xmlns:v="urn:schemas-microsoft-com:vml" xmlns:wp14="http://schemas.microsoft.com/office/word/2010/wordprocessingDrawing" xmlns:wp="http://schemas.openxmlformats.org/drawingml/2006/wordprocessingDrawing" xmlns:w10="urn:schemas-microsoft-com:office:word" xmlns:w="http://schemas.openxmlformats.org/wordprocessingml/2006/main" xmlns:w14="http://schemas.microsoft.com/office/word/2010/wordml" xmlns:w15="http://schemas.microsoft.com/office/word/2012/wordml" xmlns:w16cex="http://schemas.microsoft.com/office/word/2018/wordml/cex" xmlns:w16cid="http://schemas.microsoft.com/office/word/2016/wordml/cid" xmlns:w16="http://schemas.microsoft.com/office/word/2018/wordml" xmlns:w16du="http://schemas.microsoft.com/office/word/2023/wordml/word16du" xmlns:w16sdtdh="http://schemas.microsoft.com/office/word/2020/wordml/sdtdatahash" xmlns:w16sdtfl="http://schemas.microsoft.com/office/word/2024/wordml/sdtformatlock" xmlns:w16se="http://schemas.microsoft.com/office/word/2015/wordml/symex" xmlns:wpg="http://schemas.microsoft.com/office/word/2010/wordprocessingGroup" xmlns:wpi="http://schemas.microsoft.com/office/word/2010/wordprocessingInk" xmlns:wne="http://schemas.microsoft.com/office/word/2006/wordml" xmlns:wps="http://schemas.microsoft.com/office/word/2010/wordprocessingShape" mc:Ignorable="w14 w15 w16se w16cid w16 w16cex w16sdtdh w16sdtfl w16du wp14">
   <w:p>
     <w:pPr>
       <w:pBdr>
@@ -3424,7 +3780,25 @@
         <w:sz w:val="15"/>
         <w:szCs w:val="15"/>
       </w:rPr>
-      <w:t>6th Road, Rawalpindi, Pakistan</w:t>
+      <w:t>STP UOK</w:t>
+    </w:r>
+    <w:r>
+      <w:rPr>
+        <w:rFonts w:ascii="Arial" w:eastAsia="Arial" w:hAnsi="Arial" w:cs="Arial"/>
+        <w:color w:val="6B7280"/>
+        <w:sz w:val="15"/>
+        <w:szCs w:val="15"/>
+      </w:rPr>
+      <w:t xml:space="preserve">, </w:t>
+    </w:r>
+    <w:r>
+      <w:rPr>
+        <w:rFonts w:ascii="Arial" w:eastAsia="Arial" w:hAnsi="Arial" w:cs="Arial"/>
+        <w:color w:val="6B7280"/>
+        <w:sz w:val="15"/>
+        <w:szCs w:val="15"/>
+      </w:rPr>
+      <w:t>AJK</w:t>
     </w:r>
     <w:r>
       <w:rPr>
@@ -3461,7 +3835,7 @@
 </file>
 
 <file path=word/footnotes.xml><?xml version="1.0" encoding="utf-8"?>
-<w:footnotes xmlns:wpc="http://schemas.microsoft.com/office/word/2010/wordprocessingCanvas" xmlns:cx="http://schemas.microsoft.com/office/drawing/2014/chartex" xmlns:cx1="http://schemas.microsoft.com/office/drawing/2015/9/8/chartex" xmlns:cx2="http://schemas.microsoft.com/office/drawing/2015/10/21/chartex" xmlns:cx3="http://schemas.microsoft.com/office/drawing/2016/5/9/chartex" xmlns:cx4="http://schemas.microsoft.com/office/drawing/2016/5/10/chartex" xmlns:cx5="http://schemas.microsoft.com/office/drawing/2016/5/11/chartex" xmlns:cx6="http://schemas.microsoft.com/office/drawing/2016/5/12/chartex" xmlns:cx7="http://schemas.microsoft.com/office/drawing/2016/5/13/chartex" xmlns:cx8="http://schemas.microsoft.com/office/drawing/2016/5/14/chartex" xmlns:mc="http://schemas.openxmlformats.org/markup-compatibility/2006" xmlns:aink="http://schemas.microsoft.com/office/drawing/2016/ink" xmlns:am3d="http://schemas.microsoft.com/office/drawing/2017/model3d" xmlns:o="urn:schemas-microsoft-com:office:office" xmlns:oel="http://schemas.microsoft.com/office/2019/extlst" xmlns:r="http://schemas.openxmlformats.org/officeDocument/2006/relationships" xmlns:m="http://schemas.openxmlformats.org/officeDocument/2006/math" xmlns:v="urn:schemas-microsoft-com:vml" xmlns:wp14="http://schemas.microsoft.com/office/word/2010/wordprocessingDrawing" xmlns:wp="http://schemas.openxmlformats.org/drawingml/2006/wordprocessingDrawing" xmlns:w10="urn:schemas-microsoft-com:office:word" xmlns:w="http://schemas.openxmlformats.org/wordprocessingml/2006/main" xmlns:w14="http://schemas.microsoft.com/office/word/2010/wordml" xmlns:w15="http://schemas.microsoft.com/office/word/2012/wordml" xmlns:w16cei="http://schemas.microsoft.com/office/word/2026/wordml/cei" xmlns:w16cex="http://schemas.microsoft.com/office/word/2018/wordml/cex" xmlns:w16cid="http://schemas.microsoft.com/office/word/2016/wordml/cid" xmlns:w16="http://schemas.microsoft.com/office/word/2018/wordml" xmlns:w16du="http://schemas.microsoft.com/office/word/2023/wordml/word16du" xmlns:w16sdtdh="http://schemas.microsoft.com/office/word/2020/wordml/sdtdatahash" xmlns:w16sdtfl="http://schemas.microsoft.com/office/word/2024/wordml/sdtformatlock" xmlns:w16se="http://schemas.microsoft.com/office/word/2015/wordml/symex" xmlns:wpg="http://schemas.microsoft.com/office/word/2010/wordprocessingGroup" xmlns:wpi="http://schemas.microsoft.com/office/word/2010/wordprocessingInk" xmlns:wne="http://schemas.microsoft.com/office/word/2006/wordml" xmlns:wps="http://schemas.microsoft.com/office/word/2010/wordprocessingShape" mc:Ignorable="w14 w15 w16se w16cid w16 w16cex w16sdtdh w16sdtfl w16du wp14">
+<w:footnotes xmlns:wpc="http://schemas.microsoft.com/office/word/2010/wordprocessingCanvas" xmlns:cx="http://schemas.microsoft.com/office/drawing/2014/chartex" xmlns:cx1="http://schemas.microsoft.com/office/drawing/2015/9/8/chartex" xmlns:cx2="http://schemas.microsoft.com/office/drawing/2015/10/21/chartex" xmlns:cx3="http://schemas.microsoft.com/office/drawing/2016/5/9/chartex" xmlns:cx4="http://schemas.microsoft.com/office/drawing/2016/5/10/chartex" xmlns:cx5="http://schemas.microsoft.com/office/drawing/2016/5/11/chartex" xmlns:cx6="http://schemas.microsoft.com/office/drawing/2016/5/12/chartex" xmlns:cx7="http://schemas.microsoft.com/office/drawing/2016/5/13/chartex" xmlns:cx8="http://schemas.microsoft.com/office/drawing/2016/5/14/chartex" xmlns:mc="http://schemas.openxmlformats.org/markup-compatibility/2006" xmlns:aink="http://schemas.microsoft.com/office/drawing/2016/ink" xmlns:am3d="http://schemas.microsoft.com/office/drawing/2017/model3d" xmlns:o="urn:schemas-microsoft-com:office:office" xmlns:oel="http://schemas.microsoft.com/office/2019/extlst" xmlns:r="http://schemas.openxmlformats.org/officeDocument/2006/relationships" xmlns:m="http://schemas.openxmlformats.org/officeDocument/2006/math" xmlns:v="urn:schemas-microsoft-com:vml" xmlns:wp14="http://schemas.microsoft.com/office/word/2010/wordprocessingDrawing" xmlns:wp="http://schemas.openxmlformats.org/drawingml/2006/wordprocessingDrawing" xmlns:w10="urn:schemas-microsoft-com:office:word" xmlns:w="http://schemas.openxmlformats.org/wordprocessingml/2006/main" xmlns:w14="http://schemas.microsoft.com/office/word/2010/wordml" xmlns:w15="http://schemas.microsoft.com/office/word/2012/wordml" xmlns:w16cex="http://schemas.microsoft.com/office/word/2018/wordml/cex" xmlns:w16cid="http://schemas.microsoft.com/office/word/2016/wordml/cid" xmlns:w16="http://schemas.microsoft.com/office/word/2018/wordml" xmlns:w16du="http://schemas.microsoft.com/office/word/2023/wordml/word16du" xmlns:w16sdtdh="http://schemas.microsoft.com/office/word/2020/wordml/sdtdatahash" xmlns:w16sdtfl="http://schemas.microsoft.com/office/word/2024/wordml/sdtformatlock" xmlns:w16se="http://schemas.microsoft.com/office/word/2015/wordml/symex" xmlns:wpg="http://schemas.microsoft.com/office/word/2010/wordprocessingGroup" xmlns:wpi="http://schemas.microsoft.com/office/word/2010/wordprocessingInk" xmlns:wne="http://schemas.microsoft.com/office/word/2006/wordml" xmlns:wps="http://schemas.microsoft.com/office/word/2010/wordprocessingShape" mc:Ignorable="w14 w15 w16se w16cid w16 w16cex w16sdtdh w16sdtfl w16du wp14">
   <w:footnote w:type="separator" w:id="-1">
     <w:p>
       <w:r>
@@ -3480,7 +3854,7 @@
 </file>
 
 <file path=word/header1.xml><?xml version="1.0" encoding="utf-8"?>
-<w:hdr xmlns:wpc="http://schemas.microsoft.com/office/word/2010/wordprocessingCanvas" xmlns:cx="http://schemas.microsoft.com/office/drawing/2014/chartex" xmlns:cx1="http://schemas.microsoft.com/office/drawing/2015/9/8/chartex" xmlns:cx2="http://schemas.microsoft.com/office/drawing/2015/10/21/chartex" xmlns:cx3="http://schemas.microsoft.com/office/drawing/2016/5/9/chartex" xmlns:cx4="http://schemas.microsoft.com/office/drawing/2016/5/10/chartex" xmlns:cx5="http://schemas.microsoft.com/office/drawing/2016/5/11/chartex" xmlns:cx6="http://schemas.microsoft.com/office/drawing/2016/5/12/chartex" xmlns:cx7="http://schemas.microsoft.com/office/drawing/2016/5/13/chartex" xmlns:cx8="http://schemas.microsoft.com/office/drawing/2016/5/14/chartex" xmlns:mc="http://schemas.openxmlformats.org/markup-compatibility/2006" xmlns:aink="http://schemas.microsoft.com/office/drawing/2016/ink" xmlns:am3d="http://schemas.microsoft.com/office/drawing/2017/model3d" xmlns:o="urn:schemas-microsoft-com:office:office" xmlns:oel="http://schemas.microsoft.com/office/2019/extlst" xmlns:r="http://schemas.openxmlformats.org/officeDocument/2006/relationships" xmlns:m="http://schemas.openxmlformats.org/officeDocument/2006/math" xmlns:v="urn:schemas-microsoft-com:vml" xmlns:wp14="http://schemas.microsoft.com/office/word/2010/wordprocessingDrawing" xmlns:wp="http://schemas.openxmlformats.org/drawingml/2006/wordprocessingDrawing" xmlns:w10="urn:schemas-microsoft-com:office:word" xmlns:w="http://schemas.openxmlformats.org/wordprocessingml/2006/main" xmlns:w14="http://schemas.microsoft.com/office/word/2010/wordml" xmlns:w15="http://schemas.microsoft.com/office/word/2012/wordml" xmlns:w16cei="http://schemas.microsoft.com/office/word/2026/wordml/cei" xmlns:w16cex="http://schemas.microsoft.com/office/word/2018/wordml/cex" xmlns:w16cid="http://schemas.microsoft.com/office/word/2016/wordml/cid" xmlns:w16="http://schemas.microsoft.com/office/word/2018/wordml" xmlns:w16du="http://schemas.microsoft.com/office/word/2023/wordml/word16du" xmlns:w16sdtdh="http://schemas.microsoft.com/office/word/2020/wordml/sdtdatahash" xmlns:w16sdtfl="http://schemas.microsoft.com/office/word/2024/wordml/sdtformatlock" xmlns:w16se="http://schemas.microsoft.com/office/word/2015/wordml/symex" xmlns:wpg="http://schemas.microsoft.com/office/word/2010/wordprocessingGroup" xmlns:wpi="http://schemas.microsoft.com/office/word/2010/wordprocessingInk" xmlns:wne="http://schemas.microsoft.com/office/word/2006/wordml" xmlns:wps="http://schemas.microsoft.com/office/word/2010/wordprocessingShape" mc:Ignorable="w14 w15 w16se w16cid w16 w16cex w16sdtdh w16sdtfl w16du wp14">
+<w:hdr xmlns:wpc="http://schemas.microsoft.com/office/word/2010/wordprocessingCanvas" xmlns:cx="http://schemas.microsoft.com/office/drawing/2014/chartex" xmlns:cx1="http://schemas.microsoft.com/office/drawing/2015/9/8/chartex" xmlns:cx2="http://schemas.microsoft.com/office/drawing/2015/10/21/chartex" xmlns:cx3="http://schemas.microsoft.com/office/drawing/2016/5/9/chartex" xmlns:cx4="http://schemas.microsoft.com/office/drawing/2016/5/10/chartex" xmlns:cx5="http://schemas.microsoft.com/office/drawing/2016/5/11/chartex" xmlns:cx6="http://schemas.microsoft.com/office/drawing/2016/5/12/chartex" xmlns:cx7="http://schemas.microsoft.com/office/drawing/2016/5/13/chartex" xmlns:cx8="http://schemas.microsoft.com/office/drawing/2016/5/14/chartex" xmlns:mc="http://schemas.openxmlformats.org/markup-compatibility/2006" xmlns:aink="http://schemas.microsoft.com/office/drawing/2016/ink" xmlns:am3d="http://schemas.microsoft.com/office/drawing/2017/model3d" xmlns:o="urn:schemas-microsoft-com:office:office" xmlns:oel="http://schemas.microsoft.com/office/2019/extlst" xmlns:r="http://schemas.openxmlformats.org/officeDocument/2006/relationships" xmlns:m="http://schemas.openxmlformats.org/officeDocument/2006/math" xmlns:v="urn:schemas-microsoft-com:vml" xmlns:wp14="http://schemas.microsoft.com/office/word/2010/wordprocessingDrawing" xmlns:wp="http://schemas.openxmlformats.org/drawingml/2006/wordprocessingDrawing" xmlns:w10="urn:schemas-microsoft-com:office:word" xmlns:w="http://schemas.openxmlformats.org/wordprocessingml/2006/main" xmlns:w14="http://schemas.microsoft.com/office/word/2010/wordml" xmlns:w15="http://schemas.microsoft.com/office/word/2012/wordml" xmlns:w16cex="http://schemas.microsoft.com/office/word/2018/wordml/cex" xmlns:w16cid="http://schemas.microsoft.com/office/word/2016/wordml/cid" xmlns:w16="http://schemas.microsoft.com/office/word/2018/wordml" xmlns:w16du="http://schemas.microsoft.com/office/word/2023/wordml/word16du" xmlns:w16sdtdh="http://schemas.microsoft.com/office/word/2020/wordml/sdtdatahash" xmlns:w16sdtfl="http://schemas.microsoft.com/office/word/2024/wordml/sdtformatlock" xmlns:w16se="http://schemas.microsoft.com/office/word/2015/wordml/symex" xmlns:wpg="http://schemas.microsoft.com/office/word/2010/wordprocessingGroup" xmlns:wpi="http://schemas.microsoft.com/office/word/2010/wordprocessingInk" xmlns:wne="http://schemas.microsoft.com/office/word/2006/wordml" xmlns:wps="http://schemas.microsoft.com/office/word/2010/wordprocessingShape" mc:Ignorable="w14 w15 w16se w16cid w16 w16cex w16sdtdh w16sdtfl w16du wp14">
   <w:tbl>
     <w:tblPr>
       <w:tblW w:w="9360" w:type="dxa"/>
@@ -3582,7 +3956,7 @@
 </file>
 
 <file path=word/numbering.xml><?xml version="1.0" encoding="utf-8"?>
-<w:numbering xmlns:wpc="http://schemas.microsoft.com/office/word/2010/wordprocessingCanvas" xmlns:cx="http://schemas.microsoft.com/office/drawing/2014/chartex" xmlns:cx1="http://schemas.microsoft.com/office/drawing/2015/9/8/chartex" xmlns:cx2="http://schemas.microsoft.com/office/drawing/2015/10/21/chartex" xmlns:cx3="http://schemas.microsoft.com/office/drawing/2016/5/9/chartex" xmlns:cx4="http://schemas.microsoft.com/office/drawing/2016/5/10/chartex" xmlns:cx5="http://schemas.microsoft.com/office/drawing/2016/5/11/chartex" xmlns:cx6="http://schemas.microsoft.com/office/drawing/2016/5/12/chartex" xmlns:cx7="http://schemas.microsoft.com/office/drawing/2016/5/13/chartex" xmlns:cx8="http://schemas.microsoft.com/office/drawing/2016/5/14/chartex" xmlns:mc="http://schemas.openxmlformats.org/markup-compatibility/2006" xmlns:aink="http://schemas.microsoft.com/office/drawing/2016/ink" xmlns:am3d="http://schemas.microsoft.com/office/drawing/2017/model3d" xmlns:o="urn:schemas-microsoft-com:office:office" xmlns:oel="http://schemas.microsoft.com/office/2019/extlst" xmlns:r="http://schemas.openxmlformats.org/officeDocument/2006/relationships" xmlns:m="http://schemas.openxmlformats.org/officeDocument/2006/math" xmlns:v="urn:schemas-microsoft-com:vml" xmlns:wp14="http://schemas.microsoft.com/office/word/2010/wordprocessingDrawing" xmlns:wp="http://schemas.openxmlformats.org/drawingml/2006/wordprocessingDrawing" xmlns:w10="urn:schemas-microsoft-com:office:word" xmlns:w="http://schemas.openxmlformats.org/wordprocessingml/2006/main" xmlns:w14="http://schemas.microsoft.com/office/word/2010/wordml" xmlns:w15="http://schemas.microsoft.com/office/word/2012/wordml" xmlns:w16cei="http://schemas.microsoft.com/office/word/2026/wordml/cei" xmlns:w16cex="http://schemas.microsoft.com/office/word/2018/wordml/cex" xmlns:w16cid="http://schemas.microsoft.com/office/word/2016/wordml/cid" xmlns:w16="http://schemas.microsoft.com/office/word/2018/wordml" xmlns:w16du="http://schemas.microsoft.com/office/word/2023/wordml/word16du" xmlns:w16sdtdh="http://schemas.microsoft.com/office/word/2020/wordml/sdtdatahash" xmlns:w16sdtfl="http://schemas.microsoft.com/office/word/2024/wordml/sdtformatlock" xmlns:w16se="http://schemas.microsoft.com/office/word/2015/wordml/symex" xmlns:wpg="http://schemas.microsoft.com/office/word/2010/wordprocessingGroup" xmlns:wpi="http://schemas.microsoft.com/office/word/2010/wordprocessingInk" xmlns:wne="http://schemas.microsoft.com/office/word/2006/wordml" xmlns:wps="http://schemas.microsoft.com/office/word/2010/wordprocessingShape" mc:Ignorable="w14 w15 w16se w16cid w16 w16cex w16sdtdh w16sdtfl w16du wp14">
+<w:numbering xmlns:wpc="http://schemas.microsoft.com/office/word/2010/wordprocessingCanvas" xmlns:cx="http://schemas.microsoft.com/office/drawing/2014/chartex" xmlns:cx1="http://schemas.microsoft.com/office/drawing/2015/9/8/chartex" xmlns:cx2="http://schemas.microsoft.com/office/drawing/2015/10/21/chartex" xmlns:cx3="http://schemas.microsoft.com/office/drawing/2016/5/9/chartex" xmlns:cx4="http://schemas.microsoft.com/office/drawing/2016/5/10/chartex" xmlns:cx5="http://schemas.microsoft.com/office/drawing/2016/5/11/chartex" xmlns:cx6="http://schemas.microsoft.com/office/drawing/2016/5/12/chartex" xmlns:cx7="http://schemas.microsoft.com/office/drawing/2016/5/13/chartex" xmlns:cx8="http://schemas.microsoft.com/office/drawing/2016/5/14/chartex" xmlns:mc="http://schemas.openxmlformats.org/markup-compatibility/2006" xmlns:aink="http://schemas.microsoft.com/office/drawing/2016/ink" xmlns:am3d="http://schemas.microsoft.com/office/drawing/2017/model3d" xmlns:o="urn:schemas-microsoft-com:office:office" xmlns:oel="http://schemas.microsoft.com/office/2019/extlst" xmlns:r="http://schemas.openxmlformats.org/officeDocument/2006/relationships" xmlns:m="http://schemas.openxmlformats.org/officeDocument/2006/math" xmlns:v="urn:schemas-microsoft-com:vml" xmlns:wp14="http://schemas.microsoft.com/office/word/2010/wordprocessingDrawing" xmlns:wp="http://schemas.openxmlformats.org/drawingml/2006/wordprocessingDrawing" xmlns:w10="urn:schemas-microsoft-com:office:word" xmlns:w="http://schemas.openxmlformats.org/wordprocessingml/2006/main" xmlns:w14="http://schemas.microsoft.com/office/word/2010/wordml" xmlns:w15="http://schemas.microsoft.com/office/word/2012/wordml" xmlns:w16cex="http://schemas.microsoft.com/office/word/2018/wordml/cex" xmlns:w16cid="http://schemas.microsoft.com/office/word/2016/wordml/cid" xmlns:w16="http://schemas.microsoft.com/office/word/2018/wordml" xmlns:w16du="http://schemas.microsoft.com/office/word/2023/wordml/word16du" xmlns:w16sdtdh="http://schemas.microsoft.com/office/word/2020/wordml/sdtdatahash" xmlns:w16sdtfl="http://schemas.microsoft.com/office/word/2024/wordml/sdtformatlock" xmlns:w16se="http://schemas.microsoft.com/office/word/2015/wordml/symex" xmlns:wpg="http://schemas.microsoft.com/office/word/2010/wordprocessingGroup" xmlns:wpi="http://schemas.microsoft.com/office/word/2010/wordprocessingInk" xmlns:wne="http://schemas.microsoft.com/office/word/2006/wordml" xmlns:wps="http://schemas.microsoft.com/office/word/2010/wordprocessingShape" mc:Ignorable="w14 w15 w16se w16cid w16 w16cex w16sdtdh w16sdtfl w16du wp14">
   <w:abstractNum w:abstractNumId="0" w15:restartNumberingAfterBreak="0">
     <w:nsid w:val="3A7D7A3D"/>
     <w:multiLevelType w:val="hybridMultilevel"/>
@@ -4389,6 +4763,48 @@
       <w:szCs w:val="20"/>
     </w:rPr>
   </w:style>
+  <w:style w:type="paragraph" w:styleId="Header">
+    <w:name w:val="header"/>
+    <w:basedOn w:val="Normal"/>
+    <w:link w:val="HeaderChar"/>
+    <w:uiPriority w:val="99"/>
+    <w:unhideWhenUsed/>
+    <w:rsid w:val="00A77483"/>
+    <w:pPr>
+      <w:tabs>
+        <w:tab w:val="center" w:pos="4680"/>
+        <w:tab w:val="right" w:pos="9360"/>
+      </w:tabs>
+    </w:pPr>
+  </w:style>
+  <w:style w:type="character" w:customStyle="1" w:styleId="HeaderChar">
+    <w:name w:val="Header Char"/>
+    <w:basedOn w:val="DefaultParagraphFont"/>
+    <w:link w:val="Header"/>
+    <w:uiPriority w:val="99"/>
+    <w:rsid w:val="00A77483"/>
+  </w:style>
+  <w:style w:type="paragraph" w:styleId="Footer">
+    <w:name w:val="footer"/>
+    <w:basedOn w:val="Normal"/>
+    <w:link w:val="FooterChar"/>
+    <w:uiPriority w:val="99"/>
+    <w:unhideWhenUsed/>
+    <w:rsid w:val="00A77483"/>
+    <w:pPr>
+      <w:tabs>
+        <w:tab w:val="center" w:pos="4680"/>
+        <w:tab w:val="right" w:pos="9360"/>
+      </w:tabs>
+    </w:pPr>
+  </w:style>
+  <w:style w:type="character" w:customStyle="1" w:styleId="FooterChar">
+    <w:name w:val="Footer Char"/>
+    <w:basedOn w:val="DefaultParagraphFont"/>
+    <w:link w:val="Footer"/>
+    <w:uiPriority w:val="99"/>
+    <w:rsid w:val="00A77483"/>
+  </w:style>
 </w:styles>
 </file>
 

</xml_diff>